<commit_message>
docs(dashboards): add by-business-type (vertical) bundles for onboarding (§0.15)
10 verticals (e-commerce, SaaS, accountant, agency, clinic, etc.) — each = curated
dashboard bundle + signature KPIs + key connectors. Onboarding: pick vertical -> load bundle.

Co-Authored-By: Claude Opus 4.8 (1M context) <noreply@anthropic.com>
</commit_message>
<xml_diff>
--- a/PRODUCTS/02-roi-reporting-engine.docx
+++ b/PRODUCTS/02-roi-reporting-engine.docx
@@ -1498,6 +1498,1325 @@
           <w:rtl w:val="1"/>
           <w:rFonts w:cs="Arial"/>
         </w:rPr>
+        <w:t>0.15 דשבורדים לפי סוג-עסק (Verticals) 🏢 — שכבת ה-Onboarding</w:t>
+      </w:r>
+    </w:p>
+    <w:p>
+      <w:pPr>
+        <w:bidi w:val="1"/>
+        <w:jc w:val="right"/>
+      </w:pPr>
+      <w:r>
+        <w:rPr>
+          <w:rFonts w:ascii="Arial" w:hAnsi="Arial"/>
+          <w:b w:val="0"/>
+          <w:sz w:val="22"/>
+          <w:rtl w:val="1"/>
+          <w:rFonts w:cs="Arial"/>
+        </w:rPr>
+        <w:t xml:space="preserve">המחלקות ב-§0.1 הן אבני-הבניין. אבל לקוח לא חושב "מחלקות" — הוא חושב </w:t>
+      </w:r>
+      <w:r>
+        <w:rPr>
+          <w:rFonts w:ascii="Arial" w:hAnsi="Arial"/>
+          <w:b/>
+          <w:sz w:val="22"/>
+          <w:rtl w:val="1"/>
+          <w:rFonts w:cs="Arial"/>
+        </w:rPr>
+        <w:t>"אני חנות"</w:t>
+      </w:r>
+      <w:r>
+        <w:rPr>
+          <w:rFonts w:ascii="Arial" w:hAnsi="Arial"/>
+          <w:b w:val="0"/>
+          <w:sz w:val="22"/>
+          <w:rtl w:val="1"/>
+          <w:rFonts w:cs="Arial"/>
+        </w:rPr>
+        <w:t xml:space="preserve"> / "אני SaaS" / "אני רו״ח". לכן ה-onboarding שואל </w:t>
+      </w:r>
+      <w:r>
+        <w:rPr>
+          <w:rFonts w:ascii="Arial" w:hAnsi="Arial"/>
+          <w:b/>
+          <w:sz w:val="22"/>
+          <w:rtl w:val="1"/>
+          <w:rFonts w:cs="Arial"/>
+        </w:rPr>
+        <w:t>"איזה סוג עסק אתה?"</w:t>
+      </w:r>
+      <w:r>
+        <w:rPr>
+          <w:rFonts w:ascii="Arial" w:hAnsi="Arial"/>
+          <w:b w:val="0"/>
+          <w:sz w:val="22"/>
+          <w:rtl w:val="1"/>
+          <w:rFonts w:cs="Arial"/>
+        </w:rPr>
+        <w:t xml:space="preserve"> → נטענת </w:t>
+      </w:r>
+      <w:r>
+        <w:rPr>
+          <w:rFonts w:ascii="Arial" w:hAnsi="Arial"/>
+          <w:b/>
+          <w:sz w:val="22"/>
+          <w:rtl w:val="1"/>
+          <w:rFonts w:cs="Arial"/>
+        </w:rPr>
+        <w:t>חבילת-דשבורדים (bundle)</w:t>
+      </w:r>
+      <w:r>
+        <w:rPr>
+          <w:rFonts w:ascii="Arial" w:hAnsi="Arial"/>
+          <w:b w:val="0"/>
+          <w:sz w:val="22"/>
+          <w:rtl w:val="1"/>
+          <w:rFonts w:cs="Arial"/>
+        </w:rPr>
+        <w:t xml:space="preserve"> מותאמת עם ה-KPIs הנכונים כבר מסודרים. הלקוח בוחר מתוך החבילה, ויכול להוסיף/להסיר (drag-drop §0.2).</w:t>
+      </w:r>
+    </w:p>
+    <w:p>
+      <w:pPr>
+        <w:bidi w:val="1"/>
+        <w:ind w:left="360"/>
+        <w:jc w:val="right"/>
+      </w:pPr>
+      <w:r>
+        <w:rPr>
+          <w:rFonts w:ascii="Arial" w:hAnsi="Arial"/>
+          <w:b w:val="0"/>
+          <w:i/>
+          <w:sz w:val="22"/>
+          <w:rtl w:val="1"/>
+          <w:rFonts w:cs="Arial"/>
+        </w:rPr>
+        <w:t xml:space="preserve">כל bundle = </w:t>
+      </w:r>
+      <w:r>
+        <w:rPr>
+          <w:rFonts w:ascii="Arial" w:hAnsi="Arial"/>
+          <w:b/>
+          <w:i/>
+          <w:sz w:val="22"/>
+          <w:rtl w:val="1"/>
+          <w:rFonts w:cs="Arial"/>
+        </w:rPr>
+        <w:t>בחירה</w:t>
+      </w:r>
+      <w:r>
+        <w:rPr>
+          <w:rFonts w:ascii="Arial" w:hAnsi="Arial"/>
+          <w:b w:val="0"/>
+          <w:i/>
+          <w:sz w:val="22"/>
+          <w:rtl w:val="1"/>
+          <w:rFonts w:cs="Arial"/>
+        </w:rPr>
+        <w:t xml:space="preserve"> מתוך אותן 11 מחלקות + סט-widgets חתום per-vertical. אותה ליבה, אריזה per-קהל.</w:t>
+      </w:r>
+    </w:p>
+    <w:tbl>
+      <w:tblPr>
+        <w:tblStyle w:val="LightGrid-Accent1"/>
+        <w:tblW w:type="auto" w:w="0"/>
+        <w:tblLook w:firstColumn="1" w:firstRow="1" w:lastColumn="0" w:lastRow="0" w:noHBand="0" w:noVBand="1" w:val="04A0"/>
+        <w:bidiVisual/>
+      </w:tblPr>
+      <w:tblGrid>
+        <w:gridCol w:w="2160"/>
+        <w:gridCol w:w="2160"/>
+        <w:gridCol w:w="2160"/>
+        <w:gridCol w:w="2160"/>
+      </w:tblGrid>
+      <w:tr>
+        <w:tc>
+          <w:tcPr>
+            <w:tcW w:type="dxa" w:w="2160"/>
+          </w:tcPr>
+          <w:p>
+            <w:pPr>
+              <w:bidi w:val="1"/>
+              <w:jc w:val="right"/>
+            </w:pPr>
+            <w:r>
+              <w:rPr>
+                <w:rFonts w:ascii="Arial" w:hAnsi="Arial"/>
+                <w:b/>
+                <w:sz w:val="20"/>
+                <w:rtl w:val="1"/>
+                <w:rFonts w:cs="Arial"/>
+              </w:rPr>
+              <w:t>סוג עסק</w:t>
+            </w:r>
+          </w:p>
+        </w:tc>
+        <w:tc>
+          <w:tcPr>
+            <w:tcW w:type="dxa" w:w="2160"/>
+          </w:tcPr>
+          <w:p>
+            <w:pPr>
+              <w:bidi w:val="1"/>
+              <w:jc w:val="right"/>
+            </w:pPr>
+            <w:r>
+              <w:rPr>
+                <w:rFonts w:ascii="Arial" w:hAnsi="Arial"/>
+                <w:b/>
+                <w:sz w:val="20"/>
+                <w:rtl w:val="1"/>
+                <w:rFonts w:cs="Arial"/>
+              </w:rPr>
+              <w:t>חבילת-הדשבורדים (bundle)</w:t>
+            </w:r>
+          </w:p>
+        </w:tc>
+        <w:tc>
+          <w:tcPr>
+            <w:tcW w:type="dxa" w:w="2160"/>
+          </w:tcPr>
+          <w:p>
+            <w:pPr>
+              <w:bidi w:val="1"/>
+              <w:jc w:val="right"/>
+            </w:pPr>
+            <w:r>
+              <w:rPr>
+                <w:rFonts w:ascii="Arial" w:hAnsi="Arial"/>
+                <w:b/>
+                <w:sz w:val="20"/>
+                <w:rtl w:val="1"/>
+                <w:rFonts w:cs="Arial"/>
+              </w:rPr>
+              <w:t>ה-KPIs החתומים</w:t>
+            </w:r>
+          </w:p>
+        </w:tc>
+        <w:tc>
+          <w:tcPr>
+            <w:tcW w:type="dxa" w:w="2160"/>
+          </w:tcPr>
+          <w:p>
+            <w:pPr>
+              <w:bidi w:val="1"/>
+              <w:jc w:val="right"/>
+            </w:pPr>
+            <w:r>
+              <w:rPr>
+                <w:rFonts w:ascii="Arial" w:hAnsi="Arial"/>
+                <w:b/>
+                <w:sz w:val="20"/>
+                <w:rtl w:val="1"/>
+                <w:rFonts w:cs="Arial"/>
+              </w:rPr>
+              <w:t>מקורות-מפתח</w:t>
+            </w:r>
+          </w:p>
+        </w:tc>
+      </w:tr>
+      <w:tr>
+        <w:tc>
+          <w:tcPr>
+            <w:tcW w:type="dxa" w:w="2160"/>
+          </w:tcPr>
+          <w:p>
+            <w:pPr>
+              <w:bidi w:val="1"/>
+              <w:jc w:val="right"/>
+            </w:pPr>
+            <w:r>
+              <w:rPr>
+                <w:rFonts w:ascii="Arial" w:hAnsi="Arial"/>
+                <w:b/>
+                <w:sz w:val="20"/>
+                <w:rtl w:val="1"/>
+                <w:rFonts w:cs="Arial"/>
+              </w:rPr>
+              <w:t>חנות E-commerce</w:t>
+            </w:r>
+            <w:r>
+              <w:rPr>
+                <w:rFonts w:ascii="Arial" w:hAnsi="Arial"/>
+                <w:b w:val="0"/>
+                <w:sz w:val="20"/>
+                <w:rtl w:val="1"/>
+                <w:rFonts w:cs="Arial"/>
+              </w:rPr>
+              <w:t xml:space="preserve"> 🛒</w:t>
+            </w:r>
+          </w:p>
+        </w:tc>
+        <w:tc>
+          <w:tcPr>
+            <w:tcW w:type="dxa" w:w="2160"/>
+          </w:tcPr>
+          <w:p>
+            <w:pPr>
+              <w:bidi w:val="1"/>
+              <w:jc w:val="right"/>
+            </w:pPr>
+            <w:r>
+              <w:rPr>
+                <w:rFonts w:ascii="Arial" w:hAnsi="Arial"/>
+                <w:b w:val="0"/>
+                <w:sz w:val="20"/>
+                <w:rtl w:val="1"/>
+                <w:rFonts w:cs="Arial"/>
+              </w:rPr>
+              <w:t>Store · Marketing · Finance · Operations(מלאי)</w:t>
+            </w:r>
+          </w:p>
+        </w:tc>
+        <w:tc>
+          <w:tcPr>
+            <w:tcW w:type="dxa" w:w="2160"/>
+          </w:tcPr>
+          <w:p>
+            <w:pPr>
+              <w:bidi w:val="1"/>
+              <w:jc w:val="right"/>
+            </w:pPr>
+            <w:r>
+              <w:rPr>
+                <w:rFonts w:ascii="Arial" w:hAnsi="Arial"/>
+                <w:b w:val="0"/>
+                <w:sz w:val="20"/>
+                <w:rtl w:val="1"/>
+                <w:rFonts w:cs="Arial"/>
+              </w:rPr>
+              <w:t>AOV · נטישת-עגלה · top-products · ROAS · מלאי</w:t>
+            </w:r>
+          </w:p>
+        </w:tc>
+        <w:tc>
+          <w:tcPr>
+            <w:tcW w:type="dxa" w:w="2160"/>
+          </w:tcPr>
+          <w:p>
+            <w:pPr>
+              <w:bidi w:val="1"/>
+              <w:jc w:val="right"/>
+            </w:pPr>
+            <w:r>
+              <w:rPr>
+                <w:rFonts w:ascii="Arial" w:hAnsi="Arial"/>
+                <w:b w:val="0"/>
+                <w:sz w:val="20"/>
+                <w:rtl w:val="1"/>
+                <w:rFonts w:cs="Arial"/>
+              </w:rPr>
+              <w:t>Shopify/Woo · Meta/Google Ads · GA4</w:t>
+            </w:r>
+          </w:p>
+        </w:tc>
+      </w:tr>
+      <w:tr>
+        <w:tc>
+          <w:tcPr>
+            <w:tcW w:type="dxa" w:w="2160"/>
+          </w:tcPr>
+          <w:p>
+            <w:pPr>
+              <w:bidi w:val="1"/>
+              <w:jc w:val="right"/>
+            </w:pPr>
+            <w:r>
+              <w:rPr>
+                <w:rFonts w:ascii="Arial" w:hAnsi="Arial"/>
+                <w:b/>
+                <w:sz w:val="20"/>
+                <w:rtl w:val="1"/>
+                <w:rFonts w:cs="Arial"/>
+              </w:rPr>
+              <w:t>מערכת SaaS</w:t>
+            </w:r>
+            <w:r>
+              <w:rPr>
+                <w:rFonts w:ascii="Arial" w:hAnsi="Arial"/>
+                <w:b w:val="0"/>
+                <w:sz w:val="20"/>
+                <w:rtl w:val="1"/>
+                <w:rFonts w:cs="Arial"/>
+              </w:rPr>
+              <w:t xml:space="preserve"> ☁️</w:t>
+            </w:r>
+          </w:p>
+        </w:tc>
+        <w:tc>
+          <w:tcPr>
+            <w:tcW w:type="dxa" w:w="2160"/>
+          </w:tcPr>
+          <w:p>
+            <w:pPr>
+              <w:bidi w:val="1"/>
+              <w:jc w:val="right"/>
+            </w:pPr>
+            <w:r>
+              <w:rPr>
+                <w:rFonts w:ascii="Arial" w:hAnsi="Arial"/>
+                <w:b w:val="0"/>
+                <w:sz w:val="20"/>
+                <w:rtl w:val="1"/>
+                <w:rFonts w:cs="Arial"/>
+              </w:rPr>
+              <w:t>SaaS-Metrics · Product · Marketing · Sales</w:t>
+            </w:r>
+          </w:p>
+        </w:tc>
+        <w:tc>
+          <w:tcPr>
+            <w:tcW w:type="dxa" w:w="2160"/>
+          </w:tcPr>
+          <w:p>
+            <w:pPr>
+              <w:bidi w:val="1"/>
+              <w:jc w:val="right"/>
+            </w:pPr>
+            <w:r>
+              <w:rPr>
+                <w:rFonts w:ascii="Arial" w:hAnsi="Arial"/>
+                <w:b/>
+                <w:sz w:val="20"/>
+                <w:rtl w:val="1"/>
+                <w:rFonts w:cs="Arial"/>
+              </w:rPr>
+              <w:t>MRR/ARR · churn · NRR</w:t>
+            </w:r>
+            <w:r>
+              <w:rPr>
+                <w:rFonts w:ascii="Arial" w:hAnsi="Arial"/>
+                <w:b w:val="0"/>
+                <w:sz w:val="20"/>
+                <w:rtl w:val="1"/>
+                <w:rFonts w:cs="Arial"/>
+              </w:rPr>
+              <w:t xml:space="preserve"> · DAU/MAU · retention · CAC:LTV</w:t>
+            </w:r>
+          </w:p>
+        </w:tc>
+        <w:tc>
+          <w:tcPr>
+            <w:tcW w:type="dxa" w:w="2160"/>
+          </w:tcPr>
+          <w:p>
+            <w:pPr>
+              <w:bidi w:val="1"/>
+              <w:jc w:val="right"/>
+            </w:pPr>
+            <w:r>
+              <w:rPr>
+                <w:rFonts w:ascii="Arial" w:hAnsi="Arial"/>
+                <w:b w:val="0"/>
+                <w:sz w:val="20"/>
+                <w:rtl w:val="1"/>
+                <w:rFonts w:cs="Arial"/>
+              </w:rPr>
+              <w:t>Stripe · Mixpanel/PostHog/GA4 · CRM</w:t>
+            </w:r>
+          </w:p>
+        </w:tc>
+      </w:tr>
+      <w:tr>
+        <w:tc>
+          <w:tcPr>
+            <w:tcW w:type="dxa" w:w="2160"/>
+          </w:tcPr>
+          <w:p>
+            <w:pPr>
+              <w:bidi w:val="1"/>
+              <w:jc w:val="right"/>
+            </w:pPr>
+            <w:r>
+              <w:rPr>
+                <w:rFonts w:ascii="Arial" w:hAnsi="Arial"/>
+                <w:b/>
+                <w:sz w:val="20"/>
+                <w:rtl w:val="1"/>
+                <w:rFonts w:cs="Arial"/>
+              </w:rPr>
+              <w:t>משרד רו״ח / הנהח״ש</w:t>
+            </w:r>
+            <w:r>
+              <w:rPr>
+                <w:rFonts w:ascii="Arial" w:hAnsi="Arial"/>
+                <w:b w:val="0"/>
+                <w:sz w:val="20"/>
+                <w:rtl w:val="1"/>
+                <w:rFonts w:cs="Arial"/>
+              </w:rPr>
+              <w:t xml:space="preserve"> 🧾</w:t>
+            </w:r>
+          </w:p>
+        </w:tc>
+        <w:tc>
+          <w:tcPr>
+            <w:tcW w:type="dxa" w:w="2160"/>
+          </w:tcPr>
+          <w:p>
+            <w:pPr>
+              <w:bidi w:val="1"/>
+              <w:jc w:val="right"/>
+            </w:pPr>
+            <w:r>
+              <w:rPr>
+                <w:rFonts w:ascii="Arial" w:hAnsi="Arial"/>
+                <w:b w:val="0"/>
+                <w:sz w:val="20"/>
+                <w:rtl w:val="1"/>
+                <w:rFonts w:cs="Arial"/>
+              </w:rPr>
+              <w:t>Finance(רב-לקוחות) · Compliance · Practice</w:t>
+            </w:r>
+          </w:p>
+        </w:tc>
+        <w:tc>
+          <w:tcPr>
+            <w:tcW w:type="dxa" w:w="2160"/>
+          </w:tcPr>
+          <w:p>
+            <w:pPr>
+              <w:bidi w:val="1"/>
+              <w:jc w:val="right"/>
+            </w:pPr>
+            <w:r>
+              <w:rPr>
+                <w:rFonts w:ascii="Arial" w:hAnsi="Arial"/>
+                <w:b w:val="0"/>
+                <w:sz w:val="20"/>
+                <w:rtl w:val="1"/>
+                <w:rFonts w:cs="Arial"/>
+              </w:rPr>
+              <w:t xml:space="preserve">תזרים-per-לקוח · </w:t>
+            </w:r>
+            <w:r>
+              <w:rPr>
+                <w:rFonts w:ascii="Arial" w:hAnsi="Arial"/>
+                <w:b/>
+                <w:sz w:val="20"/>
+                <w:rtl w:val="1"/>
+                <w:rFonts w:cs="Arial"/>
+              </w:rPr>
+              <w:t>מע״מ/דיווחים</w:t>
+            </w:r>
+            <w:r>
+              <w:rPr>
+                <w:rFonts w:ascii="Arial" w:hAnsi="Arial"/>
+                <w:b w:val="0"/>
+                <w:sz w:val="20"/>
+                <w:rtl w:val="1"/>
+                <w:rFonts w:cs="Arial"/>
+              </w:rPr>
+              <w:t xml:space="preserve"> · billable-hours · לקוחות באיחור</w:t>
+            </w:r>
+          </w:p>
+        </w:tc>
+        <w:tc>
+          <w:tcPr>
+            <w:tcW w:type="dxa" w:w="2160"/>
+          </w:tcPr>
+          <w:p>
+            <w:pPr>
+              <w:bidi w:val="1"/>
+              <w:jc w:val="right"/>
+            </w:pPr>
+            <w:r>
+              <w:rPr>
+                <w:rFonts w:ascii="Arial" w:hAnsi="Arial"/>
+                <w:b w:val="0"/>
+                <w:sz w:val="20"/>
+                <w:rtl w:val="1"/>
+                <w:rFonts w:cs="Arial"/>
+              </w:rPr>
+              <w:t>חשבשבת/GreenInvoice/רווחית · שעונים</w:t>
+            </w:r>
+          </w:p>
+        </w:tc>
+      </w:tr>
+      <w:tr>
+        <w:tc>
+          <w:tcPr>
+            <w:tcW w:type="dxa" w:w="2160"/>
+          </w:tcPr>
+          <w:p>
+            <w:pPr>
+              <w:bidi w:val="1"/>
+              <w:jc w:val="right"/>
+            </w:pPr>
+            <w:r>
+              <w:rPr>
+                <w:rFonts w:ascii="Arial" w:hAnsi="Arial"/>
+                <w:b/>
+                <w:sz w:val="20"/>
+                <w:rtl w:val="1"/>
+                <w:rFonts w:cs="Arial"/>
+              </w:rPr>
+              <w:t>סוכנות (שיווק/דיגיטל)</w:t>
+            </w:r>
+            <w:r>
+              <w:rPr>
+                <w:rFonts w:ascii="Arial" w:hAnsi="Arial"/>
+                <w:b w:val="0"/>
+                <w:sz w:val="20"/>
+                <w:rtl w:val="1"/>
+                <w:rFonts w:cs="Arial"/>
+              </w:rPr>
+              <w:t xml:space="preserve"> 📣</w:t>
+            </w:r>
+          </w:p>
+        </w:tc>
+        <w:tc>
+          <w:tcPr>
+            <w:tcW w:type="dxa" w:w="2160"/>
+          </w:tcPr>
+          <w:p>
+            <w:pPr>
+              <w:bidi w:val="1"/>
+              <w:jc w:val="right"/>
+            </w:pPr>
+            <w:r>
+              <w:rPr>
+                <w:rFonts w:ascii="Arial" w:hAnsi="Arial"/>
+                <w:b w:val="0"/>
+                <w:sz w:val="20"/>
+                <w:rtl w:val="1"/>
+                <w:rFonts w:cs="Arial"/>
+              </w:rPr>
+              <w:t>Marketing(רב-לקוחות) · Sales · Delivery · Billing</w:t>
+            </w:r>
+          </w:p>
+        </w:tc>
+        <w:tc>
+          <w:tcPr>
+            <w:tcW w:type="dxa" w:w="2160"/>
+          </w:tcPr>
+          <w:p>
+            <w:pPr>
+              <w:bidi w:val="1"/>
+              <w:jc w:val="right"/>
+            </w:pPr>
+            <w:r>
+              <w:rPr>
+                <w:rFonts w:ascii="Arial" w:hAnsi="Arial"/>
+                <w:b w:val="0"/>
+                <w:sz w:val="20"/>
+                <w:rtl w:val="1"/>
+                <w:rFonts w:cs="Arial"/>
+              </w:rPr>
+              <w:t>ROAS-per-לקוח · pipeline · ניצול-צוות · רווחיות-פרויקט</w:t>
+            </w:r>
+          </w:p>
+        </w:tc>
+        <w:tc>
+          <w:tcPr>
+            <w:tcW w:type="dxa" w:w="2160"/>
+          </w:tcPr>
+          <w:p>
+            <w:pPr>
+              <w:bidi w:val="1"/>
+              <w:jc w:val="right"/>
+            </w:pPr>
+            <w:r>
+              <w:rPr>
+                <w:rFonts w:ascii="Arial" w:hAnsi="Arial"/>
+                <w:b w:val="0"/>
+                <w:sz w:val="20"/>
+                <w:rtl w:val="1"/>
+                <w:rFonts w:cs="Arial"/>
+              </w:rPr>
+              <w:t>GA4/Meta per-לקוח · CRM · PM</w:t>
+            </w:r>
+          </w:p>
+        </w:tc>
+      </w:tr>
+      <w:tr>
+        <w:tc>
+          <w:tcPr>
+            <w:tcW w:type="dxa" w:w="2160"/>
+          </w:tcPr>
+          <w:p>
+            <w:pPr>
+              <w:bidi w:val="1"/>
+              <w:jc w:val="right"/>
+            </w:pPr>
+            <w:r>
+              <w:rPr>
+                <w:rFonts w:ascii="Arial" w:hAnsi="Arial"/>
+                <w:b/>
+                <w:sz w:val="20"/>
+                <w:rtl w:val="1"/>
+                <w:rFonts w:cs="Arial"/>
+              </w:rPr>
+              <w:t>B2B שירותים / ייעוץ</w:t>
+            </w:r>
+            <w:r>
+              <w:rPr>
+                <w:rFonts w:ascii="Arial" w:hAnsi="Arial"/>
+                <w:b w:val="0"/>
+                <w:sz w:val="20"/>
+                <w:rtl w:val="1"/>
+                <w:rFonts w:cs="Arial"/>
+              </w:rPr>
+              <w:t xml:space="preserve"> 💼</w:t>
+            </w:r>
+          </w:p>
+        </w:tc>
+        <w:tc>
+          <w:tcPr>
+            <w:tcW w:type="dxa" w:w="2160"/>
+          </w:tcPr>
+          <w:p>
+            <w:pPr>
+              <w:bidi w:val="1"/>
+              <w:jc w:val="right"/>
+            </w:pPr>
+            <w:r>
+              <w:rPr>
+                <w:rFonts w:ascii="Arial" w:hAnsi="Arial"/>
+                <w:b w:val="0"/>
+                <w:sz w:val="20"/>
+                <w:rtl w:val="1"/>
+                <w:rFonts w:cs="Arial"/>
+              </w:rPr>
+              <w:t>Sales · Delivery · Finance · CS</w:t>
+            </w:r>
+          </w:p>
+        </w:tc>
+        <w:tc>
+          <w:tcPr>
+            <w:tcW w:type="dxa" w:w="2160"/>
+          </w:tcPr>
+          <w:p>
+            <w:pPr>
+              <w:bidi w:val="1"/>
+              <w:jc w:val="right"/>
+            </w:pPr>
+            <w:r>
+              <w:rPr>
+                <w:rFonts w:ascii="Arial" w:hAnsi="Arial"/>
+                <w:b w:val="0"/>
+                <w:sz w:val="20"/>
+                <w:rtl w:val="1"/>
+                <w:rFonts w:cs="Arial"/>
+              </w:rPr>
+              <w:t>pipeline-velocity · win-rate · ניצול · CSAT</w:t>
+            </w:r>
+          </w:p>
+        </w:tc>
+        <w:tc>
+          <w:tcPr>
+            <w:tcW w:type="dxa" w:w="2160"/>
+          </w:tcPr>
+          <w:p>
+            <w:pPr>
+              <w:bidi w:val="1"/>
+              <w:jc w:val="right"/>
+            </w:pPr>
+            <w:r>
+              <w:rPr>
+                <w:rFonts w:ascii="Arial" w:hAnsi="Arial"/>
+                <w:b w:val="0"/>
+                <w:sz w:val="20"/>
+                <w:rtl w:val="1"/>
+                <w:rFonts w:cs="Arial"/>
+              </w:rPr>
+              <w:t>CRM · PM · הנהח״ש · Chatwoot</w:t>
+            </w:r>
+          </w:p>
+        </w:tc>
+      </w:tr>
+      <w:tr>
+        <w:tc>
+          <w:tcPr>
+            <w:tcW w:type="dxa" w:w="2160"/>
+          </w:tcPr>
+          <w:p>
+            <w:pPr>
+              <w:bidi w:val="1"/>
+              <w:jc w:val="right"/>
+            </w:pPr>
+            <w:r>
+              <w:rPr>
+                <w:rFonts w:ascii="Arial" w:hAnsi="Arial"/>
+                <w:b/>
+                <w:sz w:val="20"/>
+                <w:rtl w:val="1"/>
+                <w:rFonts w:cs="Arial"/>
+              </w:rPr>
+              <w:t>מסעדה / קמעונאות פיזית</w:t>
+            </w:r>
+            <w:r>
+              <w:rPr>
+                <w:rFonts w:ascii="Arial" w:hAnsi="Arial"/>
+                <w:b w:val="0"/>
+                <w:sz w:val="20"/>
+                <w:rtl w:val="1"/>
+                <w:rFonts w:cs="Arial"/>
+              </w:rPr>
+              <w:t xml:space="preserve"> 🍽️</w:t>
+            </w:r>
+          </w:p>
+        </w:tc>
+        <w:tc>
+          <w:tcPr>
+            <w:tcW w:type="dxa" w:w="2160"/>
+          </w:tcPr>
+          <w:p>
+            <w:pPr>
+              <w:bidi w:val="1"/>
+              <w:jc w:val="right"/>
+            </w:pPr>
+            <w:r>
+              <w:rPr>
+                <w:rFonts w:ascii="Arial" w:hAnsi="Arial"/>
+                <w:b w:val="0"/>
+                <w:sz w:val="20"/>
+                <w:rtl w:val="1"/>
+                <w:rFonts w:cs="Arial"/>
+              </w:rPr>
+              <w:t>Sales(POS) · Operations · Reputation · Staff</w:t>
+            </w:r>
+          </w:p>
+        </w:tc>
+        <w:tc>
+          <w:tcPr>
+            <w:tcW w:type="dxa" w:w="2160"/>
+          </w:tcPr>
+          <w:p>
+            <w:pPr>
+              <w:bidi w:val="1"/>
+              <w:jc w:val="right"/>
+            </w:pPr>
+            <w:r>
+              <w:rPr>
+                <w:rFonts w:ascii="Arial" w:hAnsi="Arial"/>
+                <w:b w:val="0"/>
+                <w:sz w:val="20"/>
+                <w:rtl w:val="1"/>
+                <w:rFonts w:cs="Arial"/>
+              </w:rPr>
+              <w:t xml:space="preserve">מכירות-יומיות · מלאי · </w:t>
+            </w:r>
+            <w:r>
+              <w:rPr>
+                <w:rFonts w:ascii="Arial" w:hAnsi="Arial"/>
+                <w:b/>
+                <w:sz w:val="20"/>
+                <w:rtl w:val="1"/>
+                <w:rFonts w:cs="Arial"/>
+              </w:rPr>
+              <w:t>ביקורות/סנטימנט</w:t>
+            </w:r>
+            <w:r>
+              <w:rPr>
+                <w:rFonts w:ascii="Arial" w:hAnsi="Arial"/>
+                <w:b w:val="0"/>
+                <w:sz w:val="20"/>
+                <w:rtl w:val="1"/>
+                <w:rFonts w:cs="Arial"/>
+              </w:rPr>
+              <w:t xml:space="preserve"> · משמרות</w:t>
+            </w:r>
+          </w:p>
+        </w:tc>
+        <w:tc>
+          <w:tcPr>
+            <w:tcW w:type="dxa" w:w="2160"/>
+          </w:tcPr>
+          <w:p>
+            <w:pPr>
+              <w:bidi w:val="1"/>
+              <w:jc w:val="right"/>
+            </w:pPr>
+            <w:r>
+              <w:rPr>
+                <w:rFonts w:ascii="Arial" w:hAnsi="Arial"/>
+                <w:b w:val="0"/>
+                <w:sz w:val="20"/>
+                <w:rtl w:val="1"/>
+                <w:rFonts w:cs="Arial"/>
+              </w:rPr>
+              <w:t>POS · מלאי · Google/Yelp · שכר</w:t>
+            </w:r>
+          </w:p>
+        </w:tc>
+      </w:tr>
+      <w:tr>
+        <w:tc>
+          <w:tcPr>
+            <w:tcW w:type="dxa" w:w="2160"/>
+          </w:tcPr>
+          <w:p>
+            <w:pPr>
+              <w:bidi w:val="1"/>
+              <w:jc w:val="right"/>
+            </w:pPr>
+            <w:r>
+              <w:rPr>
+                <w:rFonts w:ascii="Arial" w:hAnsi="Arial"/>
+                <w:b/>
+                <w:sz w:val="20"/>
+                <w:rtl w:val="1"/>
+                <w:rFonts w:cs="Arial"/>
+              </w:rPr>
+              <w:t>קליניקה / מטפל / רופא</w:t>
+            </w:r>
+            <w:r>
+              <w:rPr>
+                <w:rFonts w:ascii="Arial" w:hAnsi="Arial"/>
+                <w:b w:val="0"/>
+                <w:sz w:val="20"/>
+                <w:rtl w:val="1"/>
+                <w:rFonts w:cs="Arial"/>
+              </w:rPr>
+              <w:t xml:space="preserve"> 🩺</w:t>
+            </w:r>
+          </w:p>
+        </w:tc>
+        <w:tc>
+          <w:tcPr>
+            <w:tcW w:type="dxa" w:w="2160"/>
+          </w:tcPr>
+          <w:p>
+            <w:pPr>
+              <w:bidi w:val="1"/>
+              <w:jc w:val="right"/>
+            </w:pPr>
+            <w:r>
+              <w:rPr>
+                <w:rFonts w:ascii="Arial" w:hAnsi="Arial"/>
+                <w:b w:val="0"/>
+                <w:sz w:val="20"/>
+                <w:rtl w:val="1"/>
+                <w:rFonts w:cs="Arial"/>
+              </w:rPr>
+              <w:t>Appointments · Revenue · Retention · Reputation</w:t>
+            </w:r>
+          </w:p>
+        </w:tc>
+        <w:tc>
+          <w:tcPr>
+            <w:tcW w:type="dxa" w:w="2160"/>
+          </w:tcPr>
+          <w:p>
+            <w:pPr>
+              <w:bidi w:val="1"/>
+              <w:jc w:val="right"/>
+            </w:pPr>
+            <w:r>
+              <w:rPr>
+                <w:rFonts w:ascii="Arial" w:hAnsi="Arial"/>
+                <w:b w:val="0"/>
+                <w:sz w:val="20"/>
+                <w:rtl w:val="1"/>
+                <w:rFonts w:cs="Arial"/>
+              </w:rPr>
+              <w:t>תפוסה · הכנסה-per-מטופל · חזרות · ביקורות</w:t>
+            </w:r>
+          </w:p>
+        </w:tc>
+        <w:tc>
+          <w:tcPr>
+            <w:tcW w:type="dxa" w:w="2160"/>
+          </w:tcPr>
+          <w:p>
+            <w:pPr>
+              <w:bidi w:val="1"/>
+              <w:jc w:val="right"/>
+            </w:pPr>
+            <w:r>
+              <w:rPr>
+                <w:rFonts w:ascii="Arial" w:hAnsi="Arial"/>
+                <w:b w:val="0"/>
+                <w:sz w:val="20"/>
+                <w:rtl w:val="1"/>
+                <w:rFonts w:cs="Arial"/>
+              </w:rPr>
+              <w:t>יומן · חיוב · Google reviews</w:t>
+            </w:r>
+          </w:p>
+        </w:tc>
+      </w:tr>
+      <w:tr>
+        <w:tc>
+          <w:tcPr>
+            <w:tcW w:type="dxa" w:w="2160"/>
+          </w:tcPr>
+          <w:p>
+            <w:pPr>
+              <w:bidi w:val="1"/>
+              <w:jc w:val="right"/>
+            </w:pPr>
+            <w:r>
+              <w:rPr>
+                <w:rFonts w:ascii="Arial" w:hAnsi="Arial"/>
+                <w:b/>
+                <w:sz w:val="20"/>
+                <w:rtl w:val="1"/>
+                <w:rFonts w:cs="Arial"/>
+              </w:rPr>
+              <w:t>נדל״ן / תיווך</w:t>
+            </w:r>
+            <w:r>
+              <w:rPr>
+                <w:rFonts w:ascii="Arial" w:hAnsi="Arial"/>
+                <w:b w:val="0"/>
+                <w:sz w:val="20"/>
+                <w:rtl w:val="1"/>
+                <w:rFonts w:cs="Arial"/>
+              </w:rPr>
+              <w:t xml:space="preserve"> 🏠</w:t>
+            </w:r>
+          </w:p>
+        </w:tc>
+        <w:tc>
+          <w:tcPr>
+            <w:tcW w:type="dxa" w:w="2160"/>
+          </w:tcPr>
+          <w:p>
+            <w:pPr>
+              <w:bidi w:val="1"/>
+              <w:jc w:val="right"/>
+            </w:pPr>
+            <w:r>
+              <w:rPr>
+                <w:rFonts w:ascii="Arial" w:hAnsi="Arial"/>
+                <w:b w:val="0"/>
+                <w:sz w:val="20"/>
+                <w:rtl w:val="1"/>
+                <w:rFonts w:cs="Arial"/>
+              </w:rPr>
+              <w:t>Listings · Leads · Deals · Marketing</w:t>
+            </w:r>
+          </w:p>
+        </w:tc>
+        <w:tc>
+          <w:tcPr>
+            <w:tcW w:type="dxa" w:w="2160"/>
+          </w:tcPr>
+          <w:p>
+            <w:pPr>
+              <w:bidi w:val="1"/>
+              <w:jc w:val="right"/>
+            </w:pPr>
+            <w:r>
+              <w:rPr>
+                <w:rFonts w:ascii="Arial" w:hAnsi="Arial"/>
+                <w:b w:val="0"/>
+                <w:sz w:val="20"/>
+                <w:rtl w:val="1"/>
+                <w:rFonts w:cs="Arial"/>
+              </w:rPr>
+              <w:t>לידים · ימים-בשוק · עסקאות · מקור-ליד</w:t>
+            </w:r>
+          </w:p>
+        </w:tc>
+        <w:tc>
+          <w:tcPr>
+            <w:tcW w:type="dxa" w:w="2160"/>
+          </w:tcPr>
+          <w:p>
+            <w:pPr>
+              <w:bidi w:val="1"/>
+              <w:jc w:val="right"/>
+            </w:pPr>
+            <w:r>
+              <w:rPr>
+                <w:rFonts w:ascii="Arial" w:hAnsi="Arial"/>
+                <w:b w:val="0"/>
+                <w:sz w:val="20"/>
+                <w:rtl w:val="1"/>
+                <w:rFonts w:cs="Arial"/>
+              </w:rPr>
+              <w:t>CRM · פורטלים · Meta/Google</w:t>
+            </w:r>
+          </w:p>
+        </w:tc>
+      </w:tr>
+      <w:tr>
+        <w:tc>
+          <w:tcPr>
+            <w:tcW w:type="dxa" w:w="2160"/>
+          </w:tcPr>
+          <w:p>
+            <w:pPr>
+              <w:bidi w:val="1"/>
+              <w:jc w:val="right"/>
+            </w:pPr>
+            <w:r>
+              <w:rPr>
+                <w:rFonts w:ascii="Arial" w:hAnsi="Arial"/>
+                <w:b/>
+                <w:sz w:val="20"/>
+                <w:rtl w:val="1"/>
+                <w:rFonts w:cs="Arial"/>
+              </w:rPr>
+              <w:t>עסק-מקומי/שירות</w:t>
+            </w:r>
+            <w:r>
+              <w:rPr>
+                <w:rFonts w:ascii="Arial" w:hAnsi="Arial"/>
+                <w:b w:val="0"/>
+                <w:sz w:val="20"/>
+                <w:rtl w:val="1"/>
+                <w:rFonts w:cs="Arial"/>
+              </w:rPr>
+              <w:t xml:space="preserve"> (מוסך/מספרה) 🔧</w:t>
+            </w:r>
+          </w:p>
+        </w:tc>
+        <w:tc>
+          <w:tcPr>
+            <w:tcW w:type="dxa" w:w="2160"/>
+          </w:tcPr>
+          <w:p>
+            <w:pPr>
+              <w:bidi w:val="1"/>
+              <w:jc w:val="right"/>
+            </w:pPr>
+            <w:r>
+              <w:rPr>
+                <w:rFonts w:ascii="Arial" w:hAnsi="Arial"/>
+                <w:b w:val="0"/>
+                <w:sz w:val="20"/>
+                <w:rtl w:val="1"/>
+                <w:rFonts w:cs="Arial"/>
+              </w:rPr>
+              <w:t>Bookings · Leads · Reputation · Revenue</w:t>
+            </w:r>
+          </w:p>
+        </w:tc>
+        <w:tc>
+          <w:tcPr>
+            <w:tcW w:type="dxa" w:w="2160"/>
+          </w:tcPr>
+          <w:p>
+            <w:pPr>
+              <w:bidi w:val="1"/>
+              <w:jc w:val="right"/>
+            </w:pPr>
+            <w:r>
+              <w:rPr>
+                <w:rFonts w:ascii="Arial" w:hAnsi="Arial"/>
+                <w:b w:val="0"/>
+                <w:sz w:val="20"/>
+                <w:rtl w:val="1"/>
+                <w:rFonts w:cs="Arial"/>
+              </w:rPr>
+              <w:t xml:space="preserve">תורים · שיחות/לידים · </w:t>
+            </w:r>
+            <w:r>
+              <w:rPr>
+                <w:rFonts w:ascii="Arial" w:hAnsi="Arial"/>
+                <w:b/>
+                <w:sz w:val="20"/>
+                <w:rtl w:val="1"/>
+                <w:rFonts w:cs="Arial"/>
+              </w:rPr>
+              <w:t>ביקורות</w:t>
+            </w:r>
+            <w:r>
+              <w:rPr>
+                <w:rFonts w:ascii="Arial" w:hAnsi="Arial"/>
+                <w:b w:val="0"/>
+                <w:sz w:val="20"/>
+                <w:rtl w:val="1"/>
+                <w:rFonts w:cs="Arial"/>
+              </w:rPr>
+              <w:t xml:space="preserve"> · הכנסה</w:t>
+            </w:r>
+          </w:p>
+        </w:tc>
+        <w:tc>
+          <w:tcPr>
+            <w:tcW w:type="dxa" w:w="2160"/>
+          </w:tcPr>
+          <w:p>
+            <w:pPr>
+              <w:bidi w:val="1"/>
+              <w:jc w:val="right"/>
+            </w:pPr>
+            <w:r>
+              <w:rPr>
+                <w:rFonts w:ascii="Arial" w:hAnsi="Arial"/>
+                <w:b w:val="0"/>
+                <w:sz w:val="20"/>
+                <w:rtl w:val="1"/>
+                <w:rFonts w:cs="Arial"/>
+              </w:rPr>
+              <w:t>יומן/וואטסאפ · Google · POS</w:t>
+            </w:r>
+          </w:p>
+        </w:tc>
+      </w:tr>
+      <w:tr>
+        <w:tc>
+          <w:tcPr>
+            <w:tcW w:type="dxa" w:w="2160"/>
+          </w:tcPr>
+          <w:p>
+            <w:pPr>
+              <w:bidi w:val="1"/>
+              <w:jc w:val="right"/>
+            </w:pPr>
+            <w:r>
+              <w:rPr>
+                <w:rFonts w:ascii="Arial" w:hAnsi="Arial"/>
+                <w:b/>
+                <w:sz w:val="20"/>
+                <w:rtl w:val="1"/>
+                <w:rFonts w:cs="Arial"/>
+              </w:rPr>
+              <w:t>סטארטאפ (early)</w:t>
+            </w:r>
+            <w:r>
+              <w:rPr>
+                <w:rFonts w:ascii="Arial" w:hAnsi="Arial"/>
+                <w:b w:val="0"/>
+                <w:sz w:val="20"/>
+                <w:rtl w:val="1"/>
+                <w:rFonts w:cs="Arial"/>
+              </w:rPr>
+              <w:t xml:space="preserve"> 🚀</w:t>
+            </w:r>
+          </w:p>
+        </w:tc>
+        <w:tc>
+          <w:tcPr>
+            <w:tcW w:type="dxa" w:w="2160"/>
+          </w:tcPr>
+          <w:p>
+            <w:pPr>
+              <w:bidi w:val="1"/>
+              <w:jc w:val="right"/>
+            </w:pPr>
+            <w:r>
+              <w:rPr>
+                <w:rFonts w:ascii="Arial" w:hAnsi="Arial"/>
+                <w:b w:val="0"/>
+                <w:sz w:val="20"/>
+                <w:rtl w:val="1"/>
+                <w:rFonts w:cs="Arial"/>
+              </w:rPr>
+              <w:t>Startup-AARRR · Runway · Product · Fundraising</w:t>
+            </w:r>
+          </w:p>
+        </w:tc>
+        <w:tc>
+          <w:tcPr>
+            <w:tcW w:type="dxa" w:w="2160"/>
+          </w:tcPr>
+          <w:p>
+            <w:pPr>
+              <w:bidi w:val="1"/>
+              <w:jc w:val="right"/>
+            </w:pPr>
+            <w:r>
+              <w:rPr>
+                <w:rFonts w:ascii="Arial" w:hAnsi="Arial"/>
+                <w:b w:val="0"/>
+                <w:sz w:val="20"/>
+                <w:rtl w:val="1"/>
+                <w:rFonts w:cs="Arial"/>
+              </w:rPr>
+              <w:t xml:space="preserve">acquisition→revenue · </w:t>
+            </w:r>
+            <w:r>
+              <w:rPr>
+                <w:rFonts w:ascii="Arial" w:hAnsi="Arial"/>
+                <w:b/>
+                <w:sz w:val="20"/>
+                <w:rtl w:val="1"/>
+                <w:rFonts w:cs="Arial"/>
+              </w:rPr>
+              <w:t>burn/runway</w:t>
+            </w:r>
+            <w:r>
+              <w:rPr>
+                <w:rFonts w:ascii="Arial" w:hAnsi="Arial"/>
+                <w:b w:val="0"/>
+                <w:sz w:val="20"/>
+                <w:rtl w:val="1"/>
+                <w:rFonts w:cs="Arial"/>
+              </w:rPr>
+              <w:t xml:space="preserve"> · retention · pipeline-משקיעים</w:t>
+            </w:r>
+          </w:p>
+        </w:tc>
+        <w:tc>
+          <w:tcPr>
+            <w:tcW w:type="dxa" w:w="2160"/>
+          </w:tcPr>
+          <w:p>
+            <w:pPr>
+              <w:bidi w:val="1"/>
+              <w:jc w:val="right"/>
+            </w:pPr>
+            <w:r>
+              <w:rPr>
+                <w:rFonts w:ascii="Arial" w:hAnsi="Arial"/>
+                <w:b w:val="0"/>
+                <w:sz w:val="20"/>
+                <w:rtl w:val="1"/>
+                <w:rFonts w:cs="Arial"/>
+              </w:rPr>
+              <w:t>GA4/Mixpanel · Stripe · בנק · CRM</w:t>
+            </w:r>
+          </w:p>
+        </w:tc>
+      </w:tr>
+    </w:tbl>
+    <w:p>
+      <w:pPr>
+        <w:bidi w:val="1"/>
+        <w:jc w:val="right"/>
+      </w:pPr>
+      <w:r>
+        <w:rPr>
+          <w:rFonts w:ascii="Arial" w:hAnsi="Arial"/>
+          <w:b/>
+          <w:sz w:val="22"/>
+          <w:rtl w:val="1"/>
+          <w:rFonts w:cs="Arial"/>
+        </w:rPr>
+        <w:t>איך זה עובד בפועל:</w:t>
+      </w:r>
+      <w:r>
+        <w:rPr>
+          <w:rFonts w:ascii="Arial" w:hAnsi="Arial"/>
+          <w:b w:val="0"/>
+          <w:sz w:val="22"/>
+          <w:rtl w:val="1"/>
+          <w:rFonts w:cs="Arial"/>
+        </w:rPr>
+        <w:t xml:space="preserve"> onboarding → בחירת vertical → HELIX טוען את ה-bundle (טעינת template per-דשבורד) → AI-Recommend (§0.2 מוד 3) מכוונן לפי המקורות שחוברו בפועל → הלקוח משכתב ב-drag-drop. </w:t>
+      </w:r>
+      <w:r>
+        <w:rPr>
+          <w:rFonts w:ascii="Arial" w:hAnsi="Arial"/>
+          <w:b/>
+          <w:sz w:val="22"/>
+          <w:rtl w:val="1"/>
+          <w:rFonts w:cs="Arial"/>
+        </w:rPr>
+        <w:t>vertical נותן נקודת-פתיחה חכמה במקום דף ריק.</w:t>
+      </w:r>
+    </w:p>
+    <w:p>
+      <w:pPr>
+        <w:pStyle w:val="Heading2"/>
+        <w:bidi w:val="1"/>
+        <w:jc w:val="right"/>
+      </w:pPr>
+      <w:r>
+        <w:rPr>
+          <w:rFonts w:ascii="Arial" w:hAnsi="Arial"/>
+          <w:b w:val="0"/>
+          <w:sz w:val="28"/>
+          <w:rtl w:val="1"/>
+          <w:rFonts w:cs="Arial"/>
+        </w:rPr>
         <w:t>0.2 ארכיטקטורת ה-Widgets — 3 דרכים לדשבורד</w:t>
       </w:r>
     </w:p>

</xml_diff>

<commit_message>
docs(dashboards): add build-status §12 (helix-dashboards — built vs remaining)
Co-Authored-By: Claude Opus 4.8 (1M context) <noreply@anthropic.com>
</commit_message>
<xml_diff>
--- a/PRODUCTS/02-roi-reporting-engine.docx
+++ b/PRODUCTS/02-roi-reporting-engine.docx
@@ -7206,6 +7206,2628 @@
     </w:tbl>
     <w:p>
       <w:pPr>
+        <w:pStyle w:val="Heading2"/>
+        <w:bidi w:val="1"/>
+        <w:jc w:val="right"/>
+      </w:pPr>
+      <w:r>
+        <w:rPr>
+          <w:rFonts w:ascii="Arial" w:hAnsi="Arial"/>
+          <w:b w:val="0"/>
+          <w:sz w:val="28"/>
+          <w:rtl w:val="1"/>
+          <w:rFonts w:cs="Arial"/>
+        </w:rPr>
+        <w:t>12. סטטוס בנייה בקוד (helix-dashboards) — מה נבנה ומה נשאר 🏗️</w:t>
+      </w:r>
+    </w:p>
+    <w:p>
+      <w:pPr>
+        <w:bidi w:val="1"/>
+        <w:jc w:val="right"/>
+      </w:pPr>
+      <w:r>
+        <w:rPr>
+          <w:rFonts w:ascii="Arial" w:hAnsi="Arial"/>
+          <w:b w:val="0"/>
+          <w:sz w:val="22"/>
+          <w:rtl w:val="1"/>
+          <w:rFonts w:cs="Arial"/>
+        </w:rPr>
+        <w:t xml:space="preserve">נבנה כאפליקציה </w:t>
+      </w:r>
+      <w:r>
+        <w:rPr>
+          <w:rFonts w:ascii="Arial" w:hAnsi="Arial"/>
+          <w:b/>
+          <w:sz w:val="22"/>
+          <w:rtl w:val="1"/>
+          <w:rFonts w:cs="Arial"/>
+        </w:rPr>
+        <w:t>עצמאית</w:t>
+      </w:r>
+      <w:r>
+        <w:rPr>
+          <w:rFonts w:ascii="Arial" w:hAnsi="Arial"/>
+          <w:b w:val="0"/>
+          <w:sz w:val="22"/>
+          <w:rtl w:val="1"/>
+          <w:rFonts w:cs="Arial"/>
+        </w:rPr>
+        <w:t xml:space="preserve"> </w:t>
+      </w:r>
+      <w:r>
+        <w:rPr>
+          <w:rFonts w:ascii="Consolas" w:hAnsi="Consolas"/>
+          <w:b w:val="0"/>
+          <w:color w:val="B02A37"/>
+          <w:sz w:val="22"/>
+          <w:rtl w:val="1"/>
+          <w:rFonts w:cs="Consolas"/>
+        </w:rPr>
+        <w:t>Next.js 15 + TS + Tailwind + Supabase (RTL)</w:t>
+      </w:r>
+      <w:r>
+        <w:rPr>
+          <w:rFonts w:ascii="Arial" w:hAnsi="Arial"/>
+          <w:b w:val="0"/>
+          <w:sz w:val="22"/>
+          <w:rtl w:val="1"/>
+          <w:rFonts w:cs="Arial"/>
+        </w:rPr>
+        <w:t xml:space="preserve"> ב-</w:t>
+      </w:r>
+      <w:r>
+        <w:rPr>
+          <w:rFonts w:ascii="Consolas" w:hAnsi="Consolas"/>
+          <w:b w:val="0"/>
+          <w:color w:val="B02A37"/>
+          <w:sz w:val="22"/>
+          <w:rtl w:val="1"/>
+          <w:rFonts w:cs="Consolas"/>
+        </w:rPr>
+        <w:t>Desktop/helix/helix-dashboards</w:t>
+      </w:r>
+      <w:r>
+        <w:rPr>
+          <w:rFonts w:ascii="Arial" w:hAnsi="Arial"/>
+          <w:b w:val="0"/>
+          <w:sz w:val="22"/>
+          <w:rtl w:val="1"/>
+          <w:rFonts w:cs="Arial"/>
+        </w:rPr>
+        <w:t xml:space="preserve">. </w:t>
+      </w:r>
+      <w:r>
+        <w:rPr>
+          <w:rFonts w:ascii="Arial" w:hAnsi="Arial"/>
+          <w:b/>
+          <w:sz w:val="22"/>
+          <w:rtl w:val="1"/>
+          <w:rFonts w:cs="Arial"/>
+        </w:rPr>
+        <w:t>build נקי, 0 שגיאות typecheck.</w:t>
+      </w:r>
+      <w:r>
+        <w:rPr>
+          <w:rFonts w:ascii="Arial" w:hAnsi="Arial"/>
+          <w:b w:val="0"/>
+          <w:sz w:val="22"/>
+          <w:rtl w:val="1"/>
+          <w:rFonts w:cs="Arial"/>
+        </w:rPr>
+        <w:t xml:space="preserve"> גיט: רפו </w:t>
+      </w:r>
+      <w:r>
+        <w:rPr>
+          <w:rFonts w:ascii="Arial" w:hAnsi="Arial"/>
+          <w:b/>
+          <w:sz w:val="22"/>
+          <w:rtl w:val="1"/>
+          <w:rFonts w:cs="Arial"/>
+        </w:rPr>
+        <w:t>`HELIX-DASHBOARDS`</w:t>
+      </w:r>
+      <w:r>
+        <w:rPr>
+          <w:rFonts w:ascii="Arial" w:hAnsi="Arial"/>
+          <w:b w:val="0"/>
+          <w:sz w:val="22"/>
+          <w:rtl w:val="1"/>
+          <w:rFonts w:cs="Arial"/>
+        </w:rPr>
+        <w:t xml:space="preserve"> (branch main, פרטי, remote = origin שלנו). Stack: </w:t>
+      </w:r>
+      <w:r>
+        <w:rPr>
+          <w:rFonts w:ascii="Arial" w:hAnsi="Arial"/>
+          <w:b/>
+          <w:sz w:val="22"/>
+          <w:rtl w:val="1"/>
+          <w:rFonts w:cs="Arial"/>
+        </w:rPr>
+        <w:t>recharts + react-grid-layout</w:t>
+      </w:r>
+      <w:r>
+        <w:rPr>
+          <w:rFonts w:ascii="Arial" w:hAnsi="Arial"/>
+          <w:b w:val="0"/>
+          <w:sz w:val="22"/>
+          <w:rtl w:val="1"/>
+          <w:rFonts w:cs="Arial"/>
+        </w:rPr>
+        <w:t>.</w:t>
+      </w:r>
+    </w:p>
+    <w:p>
+      <w:pPr>
+        <w:pStyle w:val="Heading3"/>
+        <w:bidi w:val="1"/>
+        <w:jc w:val="right"/>
+      </w:pPr>
+      <w:r>
+        <w:rPr>
+          <w:rFonts w:ascii="Arial" w:hAnsi="Arial"/>
+          <w:b w:val="0"/>
+          <w:sz w:val="24"/>
+          <w:rtl w:val="1"/>
+          <w:rFonts w:cs="Arial"/>
+        </w:rPr>
+        <w:t>✅ נבנה (end-to-end)</w:t>
+      </w:r>
+    </w:p>
+    <w:tbl>
+      <w:tblPr>
+        <w:tblStyle w:val="LightGrid-Accent1"/>
+        <w:tblW w:type="auto" w:w="0"/>
+        <w:tblLook w:firstColumn="1" w:firstRow="1" w:lastColumn="0" w:lastRow="0" w:noHBand="0" w:noVBand="1" w:val="04A0"/>
+        <w:bidiVisual/>
+      </w:tblPr>
+      <w:tblGrid>
+        <w:gridCol w:w="4320"/>
+        <w:gridCol w:w="4320"/>
+      </w:tblGrid>
+      <w:tr>
+        <w:tc>
+          <w:tcPr>
+            <w:tcW w:type="dxa" w:w="4320"/>
+          </w:tcPr>
+          <w:p>
+            <w:pPr>
+              <w:bidi w:val="1"/>
+              <w:jc w:val="right"/>
+            </w:pPr>
+            <w:r>
+              <w:rPr>
+                <w:rFonts w:ascii="Arial" w:hAnsi="Arial"/>
+                <w:b/>
+                <w:sz w:val="20"/>
+                <w:rtl w:val="1"/>
+                <w:rFonts w:cs="Arial"/>
+              </w:rPr>
+              <w:t>רכיב</w:t>
+            </w:r>
+          </w:p>
+        </w:tc>
+        <w:tc>
+          <w:tcPr>
+            <w:tcW w:type="dxa" w:w="4320"/>
+          </w:tcPr>
+          <w:p>
+            <w:pPr>
+              <w:bidi w:val="1"/>
+              <w:jc w:val="right"/>
+            </w:pPr>
+            <w:r>
+              <w:rPr>
+                <w:rFonts w:ascii="Arial" w:hAnsi="Arial"/>
+                <w:b/>
+                <w:sz w:val="20"/>
+                <w:rtl w:val="1"/>
+                <w:rFonts w:cs="Arial"/>
+              </w:rPr>
+              <w:t>קבצים / routes</w:t>
+            </w:r>
+          </w:p>
+        </w:tc>
+      </w:tr>
+      <w:tr>
+        <w:tc>
+          <w:tcPr>
+            <w:tcW w:type="dxa" w:w="4320"/>
+          </w:tcPr>
+          <w:p>
+            <w:pPr>
+              <w:bidi w:val="1"/>
+              <w:jc w:val="right"/>
+            </w:pPr>
+            <w:r>
+              <w:rPr>
+                <w:rFonts w:ascii="Arial" w:hAnsi="Arial"/>
+                <w:b/>
+                <w:sz w:val="20"/>
+                <w:rtl w:val="1"/>
+                <w:rFonts w:cs="Arial"/>
+              </w:rPr>
+              <w:t>מנוע widgets</w:t>
+            </w:r>
+            <w:r>
+              <w:rPr>
+                <w:rFonts w:ascii="Arial" w:hAnsi="Arial"/>
+                <w:b w:val="0"/>
+                <w:sz w:val="20"/>
+                <w:rtl w:val="1"/>
+                <w:rFonts w:cs="Arial"/>
+              </w:rPr>
+              <w:t xml:space="preserve"> — ספרייה אטומית (KPI/קו/עמודות/טבלה/מד/משפך) + renderer</w:t>
+            </w:r>
+          </w:p>
+        </w:tc>
+        <w:tc>
+          <w:tcPr>
+            <w:tcW w:type="dxa" w:w="4320"/>
+          </w:tcPr>
+          <w:p>
+            <w:pPr>
+              <w:bidi w:val="1"/>
+              <w:jc w:val="right"/>
+            </w:pPr>
+            <w:r>
+              <w:rPr>
+                <w:rFonts w:ascii="Consolas" w:hAnsi="Consolas"/>
+                <w:b w:val="0"/>
+                <w:color w:val="B02A37"/>
+                <w:sz w:val="20"/>
+                <w:rtl w:val="1"/>
+                <w:rFonts w:cs="Consolas"/>
+              </w:rPr>
+              <w:t>components/widgets/{WidgetRenderer,WidgetCard}</w:t>
+            </w:r>
+            <w:r>
+              <w:rPr>
+                <w:rFonts w:ascii="Arial" w:hAnsi="Arial"/>
+                <w:b w:val="0"/>
+                <w:sz w:val="20"/>
+                <w:rtl w:val="1"/>
+                <w:rFonts w:cs="Arial"/>
+              </w:rPr>
+              <w:t xml:space="preserve">, </w:t>
+            </w:r>
+            <w:r>
+              <w:rPr>
+                <w:rFonts w:ascii="Consolas" w:hAnsi="Consolas"/>
+                <w:b w:val="0"/>
+                <w:color w:val="B02A37"/>
+                <w:sz w:val="20"/>
+                <w:rtl w:val="1"/>
+                <w:rFonts w:cs="Consolas"/>
+              </w:rPr>
+              <w:t>lib/types</w:t>
+            </w:r>
+          </w:p>
+        </w:tc>
+      </w:tr>
+      <w:tr>
+        <w:tc>
+          <w:tcPr>
+            <w:tcW w:type="dxa" w:w="4320"/>
+          </w:tcPr>
+          <w:p>
+            <w:pPr>
+              <w:bidi w:val="1"/>
+              <w:jc w:val="right"/>
+            </w:pPr>
+            <w:r>
+              <w:rPr>
+                <w:rFonts w:ascii="Arial" w:hAnsi="Arial"/>
+                <w:b/>
+                <w:sz w:val="20"/>
+                <w:rtl w:val="1"/>
+                <w:rFonts w:cs="Arial"/>
+              </w:rPr>
+              <w:t>Drag-Drop canvas</w:t>
+            </w:r>
+            <w:r>
+              <w:rPr>
+                <w:rFonts w:ascii="Arial" w:hAnsi="Arial"/>
+                <w:b w:val="0"/>
+                <w:sz w:val="20"/>
+                <w:rtl w:val="1"/>
+                <w:rFonts w:cs="Arial"/>
+              </w:rPr>
+              <w:t xml:space="preserve"> — גרירה/שינוי-גודל/</w:t>
+            </w:r>
+            <w:r>
+              <w:rPr>
+                <w:rFonts w:ascii="Arial" w:hAnsi="Arial"/>
+                <w:b/>
+                <w:sz w:val="20"/>
+                <w:rtl w:val="1"/>
+                <w:rFonts w:cs="Arial"/>
+              </w:rPr>
+              <w:t>הוספה</w:t>
+            </w:r>
+            <w:r>
+              <w:rPr>
+                <w:rFonts w:ascii="Arial" w:hAnsi="Arial"/>
+                <w:b w:val="0"/>
+                <w:sz w:val="20"/>
+                <w:rtl w:val="1"/>
+                <w:rFonts w:cs="Arial"/>
+              </w:rPr>
+              <w:t>/הסרה, מצב-עריכה</w:t>
+            </w:r>
+          </w:p>
+        </w:tc>
+        <w:tc>
+          <w:tcPr>
+            <w:tcW w:type="dxa" w:w="4320"/>
+          </w:tcPr>
+          <w:p>
+            <w:pPr>
+              <w:bidi w:val="1"/>
+              <w:jc w:val="right"/>
+            </w:pPr>
+            <w:r>
+              <w:rPr>
+                <w:rFonts w:ascii="Consolas" w:hAnsi="Consolas"/>
+                <w:b w:val="0"/>
+                <w:color w:val="B02A37"/>
+                <w:sz w:val="20"/>
+                <w:rtl w:val="1"/>
+                <w:rFonts w:cs="Consolas"/>
+              </w:rPr>
+              <w:t>components/DashboardCanvas</w:t>
+            </w:r>
+            <w:r>
+              <w:rPr>
+                <w:rFonts w:ascii="Arial" w:hAnsi="Arial"/>
+                <w:b w:val="0"/>
+                <w:sz w:val="20"/>
+                <w:rtl w:val="1"/>
+                <w:rFonts w:cs="Arial"/>
+              </w:rPr>
+              <w:t xml:space="preserve">, </w:t>
+            </w:r>
+            <w:r>
+              <w:rPr>
+                <w:rFonts w:ascii="Consolas" w:hAnsi="Consolas"/>
+                <w:b w:val="0"/>
+                <w:color w:val="B02A37"/>
+                <w:sz w:val="20"/>
+                <w:rtl w:val="1"/>
+                <w:rFonts w:cs="Consolas"/>
+              </w:rPr>
+              <w:t>DashboardView</w:t>
+            </w:r>
+            <w:r>
+              <w:rPr>
+                <w:rFonts w:ascii="Arial" w:hAnsi="Arial"/>
+                <w:b w:val="0"/>
+                <w:sz w:val="20"/>
+                <w:rtl w:val="1"/>
+                <w:rFonts w:cs="Arial"/>
+              </w:rPr>
+              <w:t xml:space="preserve">, </w:t>
+            </w:r>
+            <w:r>
+              <w:rPr>
+                <w:rFonts w:ascii="Consolas" w:hAnsi="Consolas"/>
+                <w:b w:val="0"/>
+                <w:color w:val="B02A37"/>
+                <w:sz w:val="20"/>
+                <w:rtl w:val="1"/>
+                <w:rFonts w:cs="Consolas"/>
+              </w:rPr>
+              <w:t>AddWidgetPanel</w:t>
+            </w:r>
+          </w:p>
+        </w:tc>
+      </w:tr>
+      <w:tr>
+        <w:tc>
+          <w:tcPr>
+            <w:tcW w:type="dxa" w:w="4320"/>
+          </w:tcPr>
+          <w:p>
+            <w:pPr>
+              <w:bidi w:val="1"/>
+              <w:jc w:val="right"/>
+            </w:pPr>
+            <w:r>
+              <w:rPr>
+                <w:rFonts w:ascii="Arial" w:hAnsi="Arial"/>
+                <w:b/>
+                <w:sz w:val="20"/>
+                <w:rtl w:val="1"/>
+                <w:rFonts w:cs="Arial"/>
+              </w:rPr>
+              <w:t>3 דרכים לדשבורד</w:t>
+            </w:r>
+            <w:r>
+              <w:rPr>
+                <w:rFonts w:ascii="Arial" w:hAnsi="Arial"/>
+                <w:b w:val="0"/>
+                <w:sz w:val="20"/>
+                <w:rtl w:val="1"/>
+                <w:rFonts w:cs="Arial"/>
+              </w:rPr>
+              <w:t xml:space="preserve"> — Templates (11) · Drag-drop · </w:t>
+            </w:r>
+            <w:r>
+              <w:rPr>
+                <w:rFonts w:ascii="Arial" w:hAnsi="Arial"/>
+                <w:b/>
+                <w:sz w:val="20"/>
+                <w:rtl w:val="1"/>
+                <w:rFonts w:cs="Arial"/>
+              </w:rPr>
+              <w:t>AI-Recommend</w:t>
+            </w:r>
+          </w:p>
+        </w:tc>
+        <w:tc>
+          <w:tcPr>
+            <w:tcW w:type="dxa" w:w="4320"/>
+          </w:tcPr>
+          <w:p>
+            <w:pPr>
+              <w:bidi w:val="1"/>
+              <w:jc w:val="right"/>
+            </w:pPr>
+            <w:r>
+              <w:rPr>
+                <w:rFonts w:ascii="Consolas" w:hAnsi="Consolas"/>
+                <w:b w:val="0"/>
+                <w:color w:val="B02A37"/>
+                <w:sz w:val="20"/>
+                <w:rtl w:val="1"/>
+                <w:rFonts w:cs="Consolas"/>
+              </w:rPr>
+              <w:t>lib/templates</w:t>
+            </w:r>
+            <w:r>
+              <w:rPr>
+                <w:rFonts w:ascii="Arial" w:hAnsi="Arial"/>
+                <w:b w:val="0"/>
+                <w:sz w:val="20"/>
+                <w:rtl w:val="1"/>
+                <w:rFonts w:cs="Arial"/>
+              </w:rPr>
+              <w:t xml:space="preserve">, </w:t>
+            </w:r>
+            <w:r>
+              <w:rPr>
+                <w:rFonts w:ascii="Consolas" w:hAnsi="Consolas"/>
+                <w:b w:val="0"/>
+                <w:color w:val="B02A37"/>
+                <w:sz w:val="20"/>
+                <w:rtl w:val="1"/>
+                <w:rFonts w:cs="Consolas"/>
+              </w:rPr>
+              <w:t>/api/recommend</w:t>
+            </w:r>
+            <w:r>
+              <w:rPr>
+                <w:rFonts w:ascii="Arial" w:hAnsi="Arial"/>
+                <w:b w:val="0"/>
+                <w:sz w:val="20"/>
+                <w:rtl w:val="1"/>
+                <w:rFonts w:cs="Arial"/>
+              </w:rPr>
+              <w:t xml:space="preserve">, </w:t>
+            </w:r>
+            <w:r>
+              <w:rPr>
+                <w:rFonts w:ascii="Consolas" w:hAnsi="Consolas"/>
+                <w:b w:val="0"/>
+                <w:color w:val="B02A37"/>
+                <w:sz w:val="20"/>
+                <w:rtl w:val="1"/>
+                <w:rFonts w:cs="Consolas"/>
+              </w:rPr>
+              <w:t>VerticalGrid</w:t>
+            </w:r>
+          </w:p>
+        </w:tc>
+      </w:tr>
+      <w:tr>
+        <w:tc>
+          <w:tcPr>
+            <w:tcW w:type="dxa" w:w="4320"/>
+          </w:tcPr>
+          <w:p>
+            <w:pPr>
+              <w:bidi w:val="1"/>
+              <w:jc w:val="right"/>
+            </w:pPr>
+            <w:r>
+              <w:rPr>
+                <w:rFonts w:ascii="Arial" w:hAnsi="Arial"/>
+                <w:b/>
+                <w:sz w:val="20"/>
+                <w:rtl w:val="1"/>
+                <w:rFonts w:cs="Arial"/>
+              </w:rPr>
+              <w:t>Verticals (10)</w:t>
+            </w:r>
+            <w:r>
+              <w:rPr>
+                <w:rFonts w:ascii="Arial" w:hAnsi="Arial"/>
+                <w:b w:val="0"/>
+                <w:sz w:val="20"/>
+                <w:rtl w:val="1"/>
+                <w:rFonts w:cs="Arial"/>
+              </w:rPr>
+              <w:t xml:space="preserve"> — onboarding: סוג-עסק → הקמת חבילת-דשבורדים</w:t>
+            </w:r>
+          </w:p>
+        </w:tc>
+        <w:tc>
+          <w:tcPr>
+            <w:tcW w:type="dxa" w:w="4320"/>
+          </w:tcPr>
+          <w:p>
+            <w:pPr>
+              <w:bidi w:val="1"/>
+              <w:jc w:val="right"/>
+            </w:pPr>
+            <w:r>
+              <w:rPr>
+                <w:rFonts w:ascii="Consolas" w:hAnsi="Consolas"/>
+                <w:b w:val="0"/>
+                <w:color w:val="B02A37"/>
+                <w:sz w:val="20"/>
+                <w:rtl w:val="1"/>
+                <w:rFonts w:cs="Consolas"/>
+              </w:rPr>
+              <w:t>onboardVertical</w:t>
+            </w:r>
+            <w:r>
+              <w:rPr>
+                <w:rFonts w:ascii="Arial" w:hAnsi="Arial"/>
+                <w:b w:val="0"/>
+                <w:sz w:val="20"/>
+                <w:rtl w:val="1"/>
+                <w:rFonts w:cs="Arial"/>
+              </w:rPr>
+              <w:t xml:space="preserve">, </w:t>
+            </w:r>
+            <w:r>
+              <w:rPr>
+                <w:rFonts w:ascii="Consolas" w:hAnsi="Consolas"/>
+                <w:b w:val="0"/>
+                <w:color w:val="B02A37"/>
+                <w:sz w:val="20"/>
+                <w:rtl w:val="1"/>
+                <w:rFonts w:cs="Consolas"/>
+              </w:rPr>
+              <w:t>lib/templates</w:t>
+            </w:r>
+            <w:r>
+              <w:rPr>
+                <w:rFonts w:ascii="Arial" w:hAnsi="Arial"/>
+                <w:b w:val="0"/>
+                <w:sz w:val="20"/>
+                <w:rtl w:val="1"/>
+                <w:rFonts w:cs="Arial"/>
+              </w:rPr>
+              <w:t xml:space="preserve"> VERTICALS</w:t>
+            </w:r>
+          </w:p>
+        </w:tc>
+      </w:tr>
+      <w:tr>
+        <w:tc>
+          <w:tcPr>
+            <w:tcW w:type="dxa" w:w="4320"/>
+          </w:tcPr>
+          <w:p>
+            <w:pPr>
+              <w:bidi w:val="1"/>
+              <w:jc w:val="right"/>
+            </w:pPr>
+            <w:r>
+              <w:rPr>
+                <w:rFonts w:ascii="Arial" w:hAnsi="Arial"/>
+                <w:b/>
+                <w:sz w:val="20"/>
+                <w:rtl w:val="1"/>
+                <w:rFonts w:cs="Arial"/>
+              </w:rPr>
+              <w:t>מודל נתונים + RLS</w:t>
+            </w:r>
+            <w:r>
+              <w:rPr>
+                <w:rFonts w:ascii="Arial" w:hAnsi="Arial"/>
+                <w:b w:val="0"/>
+                <w:sz w:val="20"/>
+                <w:rtl w:val="1"/>
+                <w:rFonts w:cs="Arial"/>
+              </w:rPr>
+              <w:t xml:space="preserve"> — workspaces/connections/</w:t>
+            </w:r>
+            <w:r>
+              <w:rPr>
+                <w:rFonts w:ascii="Consolas" w:hAnsi="Consolas"/>
+                <w:b w:val="0"/>
+                <w:color w:val="B02A37"/>
+                <w:sz w:val="20"/>
+                <w:rtl w:val="1"/>
+                <w:rFonts w:cs="Consolas"/>
+              </w:rPr>
+              <w:t>metric_points</w:t>
+            </w:r>
+            <w:r>
+              <w:rPr>
+                <w:rFonts w:ascii="Arial" w:hAnsi="Arial"/>
+                <w:b w:val="0"/>
+                <w:sz w:val="20"/>
+                <w:rtl w:val="1"/>
+                <w:rFonts w:cs="Arial"/>
+              </w:rPr>
+              <w:t>/dashboards/widgets/deals/digest_subscriptions/bot_links</w:t>
+            </w:r>
+          </w:p>
+        </w:tc>
+        <w:tc>
+          <w:tcPr>
+            <w:tcW w:type="dxa" w:w="4320"/>
+          </w:tcPr>
+          <w:p>
+            <w:pPr>
+              <w:bidi w:val="1"/>
+              <w:jc w:val="right"/>
+            </w:pPr>
+            <w:r>
+              <w:rPr>
+                <w:rFonts w:ascii="Consolas" w:hAnsi="Consolas"/>
+                <w:b w:val="0"/>
+                <w:color w:val="B02A37"/>
+                <w:sz w:val="20"/>
+                <w:rtl w:val="1"/>
+                <w:rFonts w:cs="Consolas"/>
+              </w:rPr>
+              <w:t>supabase/schema.sql</w:t>
+            </w:r>
+          </w:p>
+        </w:tc>
+      </w:tr>
+      <w:tr>
+        <w:tc>
+          <w:tcPr>
+            <w:tcW w:type="dxa" w:w="4320"/>
+          </w:tcPr>
+          <w:p>
+            <w:pPr>
+              <w:bidi w:val="1"/>
+              <w:jc w:val="right"/>
+            </w:pPr>
+            <w:r>
+              <w:rPr>
+                <w:rFonts w:ascii="Arial" w:hAnsi="Arial"/>
+                <w:b/>
+                <w:sz w:val="20"/>
+                <w:rtl w:val="1"/>
+                <w:rFonts w:cs="Arial"/>
+              </w:rPr>
+              <w:t>Auth + persist</w:t>
+            </w:r>
+            <w:r>
+              <w:rPr>
+                <w:rFonts w:ascii="Arial" w:hAnsi="Arial"/>
+                <w:b w:val="0"/>
+                <w:sz w:val="20"/>
+                <w:rtl w:val="1"/>
+                <w:rFonts w:cs="Arial"/>
+              </w:rPr>
+              <w:t xml:space="preserve"> — Supabase magic-link + שמירת layout/widgets ל-DB</w:t>
+            </w:r>
+          </w:p>
+        </w:tc>
+        <w:tc>
+          <w:tcPr>
+            <w:tcW w:type="dxa" w:w="4320"/>
+          </w:tcPr>
+          <w:p>
+            <w:pPr>
+              <w:bidi w:val="1"/>
+              <w:jc w:val="right"/>
+            </w:pPr>
+            <w:r>
+              <w:rPr>
+                <w:rFonts w:ascii="Consolas" w:hAnsi="Consolas"/>
+                <w:b w:val="0"/>
+                <w:color w:val="B02A37"/>
+                <w:sz w:val="20"/>
+                <w:rtl w:val="1"/>
+                <w:rFonts w:cs="Consolas"/>
+              </w:rPr>
+              <w:t>app/login</w:t>
+            </w:r>
+            <w:r>
+              <w:rPr>
+                <w:rFonts w:ascii="Arial" w:hAnsi="Arial"/>
+                <w:b w:val="0"/>
+                <w:sz w:val="20"/>
+                <w:rtl w:val="1"/>
+                <w:rFonts w:cs="Arial"/>
+              </w:rPr>
+              <w:t xml:space="preserve">, </w:t>
+            </w:r>
+            <w:r>
+              <w:rPr>
+                <w:rFonts w:ascii="Consolas" w:hAnsi="Consolas"/>
+                <w:b w:val="0"/>
+                <w:color w:val="B02A37"/>
+                <w:sz w:val="20"/>
+                <w:rtl w:val="1"/>
+                <w:rFonts w:cs="Consolas"/>
+              </w:rPr>
+              <w:t>auth/callback</w:t>
+            </w:r>
+            <w:r>
+              <w:rPr>
+                <w:rFonts w:ascii="Arial" w:hAnsi="Arial"/>
+                <w:b w:val="0"/>
+                <w:sz w:val="20"/>
+                <w:rtl w:val="1"/>
+                <w:rFonts w:cs="Arial"/>
+              </w:rPr>
+              <w:t xml:space="preserve">, </w:t>
+            </w:r>
+            <w:r>
+              <w:rPr>
+                <w:rFonts w:ascii="Consolas" w:hAnsi="Consolas"/>
+                <w:b w:val="0"/>
+                <w:color w:val="B02A37"/>
+                <w:sz w:val="20"/>
+                <w:rtl w:val="1"/>
+                <w:rFonts w:cs="Consolas"/>
+              </w:rPr>
+              <w:t>actions-auth</w:t>
+            </w:r>
+            <w:r>
+              <w:rPr>
+                <w:rFonts w:ascii="Arial" w:hAnsi="Arial"/>
+                <w:b w:val="0"/>
+                <w:sz w:val="20"/>
+                <w:rtl w:val="1"/>
+                <w:rFonts w:cs="Arial"/>
+              </w:rPr>
+              <w:t xml:space="preserve">, </w:t>
+            </w:r>
+            <w:r>
+              <w:rPr>
+                <w:rFonts w:ascii="Consolas" w:hAnsi="Consolas"/>
+                <w:b w:val="0"/>
+                <w:color w:val="B02A37"/>
+                <w:sz w:val="20"/>
+                <w:rtl w:val="1"/>
+                <w:rFonts w:cs="Consolas"/>
+              </w:rPr>
+              <w:t>actions-dashboards</w:t>
+            </w:r>
+            <w:r>
+              <w:rPr>
+                <w:rFonts w:ascii="Arial" w:hAnsi="Arial"/>
+                <w:b w:val="0"/>
+                <w:sz w:val="20"/>
+                <w:rtl w:val="1"/>
+                <w:rFonts w:cs="Arial"/>
+              </w:rPr>
+              <w:t xml:space="preserve">, </w:t>
+            </w:r>
+            <w:r>
+              <w:rPr>
+                <w:rFonts w:ascii="Consolas" w:hAnsi="Consolas"/>
+                <w:b w:val="0"/>
+                <w:color w:val="B02A37"/>
+                <w:sz w:val="20"/>
+                <w:rtl w:val="1"/>
+                <w:rFonts w:cs="Consolas"/>
+              </w:rPr>
+              <w:t>resolve-server</w:t>
+            </w:r>
+          </w:p>
+        </w:tc>
+      </w:tr>
+      <w:tr>
+        <w:tc>
+          <w:tcPr>
+            <w:tcW w:type="dxa" w:w="4320"/>
+          </w:tcPr>
+          <w:p>
+            <w:pPr>
+              <w:bidi w:val="1"/>
+              <w:jc w:val="right"/>
+            </w:pPr>
+            <w:r>
+              <w:rPr>
+                <w:rFonts w:ascii="Arial" w:hAnsi="Arial"/>
+                <w:b/>
+                <w:sz w:val="20"/>
+                <w:rtl w:val="1"/>
+                <w:rFonts w:cs="Arial"/>
+              </w:rPr>
+              <w:t>Connectors (חיים)</w:t>
+            </w:r>
+            <w:r>
+              <w:rPr>
+                <w:rFonts w:ascii="Arial" w:hAnsi="Arial"/>
+                <w:b w:val="0"/>
+                <w:sz w:val="20"/>
+                <w:rtl w:val="1"/>
+                <w:rFonts w:cs="Arial"/>
+              </w:rPr>
+              <w:t xml:space="preserve"> — GA4 (OAuth) · Meta Ads · Stripe · Shopify → </w:t>
+            </w:r>
+            <w:r>
+              <w:rPr>
+                <w:rFonts w:ascii="Consolas" w:hAnsi="Consolas"/>
+                <w:b w:val="0"/>
+                <w:color w:val="B02A37"/>
+                <w:sz w:val="20"/>
+                <w:rtl w:val="1"/>
+                <w:rFonts w:cs="Consolas"/>
+              </w:rPr>
+              <w:t>metric_points</w:t>
+            </w:r>
+          </w:p>
+        </w:tc>
+        <w:tc>
+          <w:tcPr>
+            <w:tcW w:type="dxa" w:w="4320"/>
+          </w:tcPr>
+          <w:p>
+            <w:pPr>
+              <w:bidi w:val="1"/>
+              <w:jc w:val="right"/>
+            </w:pPr>
+            <w:r>
+              <w:rPr>
+                <w:rFonts w:ascii="Consolas" w:hAnsi="Consolas"/>
+                <w:b w:val="0"/>
+                <w:color w:val="B02A37"/>
+                <w:sz w:val="20"/>
+                <w:rtl w:val="1"/>
+                <w:rFonts w:cs="Consolas"/>
+              </w:rPr>
+              <w:t>lib/connectors/{ga4,meta,stripe,shopify,registry}</w:t>
+            </w:r>
+            <w:r>
+              <w:rPr>
+                <w:rFonts w:ascii="Arial" w:hAnsi="Arial"/>
+                <w:b w:val="0"/>
+                <w:sz w:val="20"/>
+                <w:rtl w:val="1"/>
+                <w:rFonts w:cs="Arial"/>
+              </w:rPr>
+              <w:t xml:space="preserve">, </w:t>
+            </w:r>
+            <w:r>
+              <w:rPr>
+                <w:rFonts w:ascii="Consolas" w:hAnsi="Consolas"/>
+                <w:b w:val="0"/>
+                <w:color w:val="B02A37"/>
+                <w:sz w:val="20"/>
+                <w:rtl w:val="1"/>
+                <w:rFonts w:cs="Consolas"/>
+              </w:rPr>
+              <w:t>/api/connectors/*</w:t>
+            </w:r>
+            <w:r>
+              <w:rPr>
+                <w:rFonts w:ascii="Arial" w:hAnsi="Arial"/>
+                <w:b w:val="0"/>
+                <w:sz w:val="20"/>
+                <w:rtl w:val="1"/>
+                <w:rFonts w:cs="Arial"/>
+              </w:rPr>
+              <w:t xml:space="preserve">, </w:t>
+            </w:r>
+            <w:r>
+              <w:rPr>
+                <w:rFonts w:ascii="Consolas" w:hAnsi="Consolas"/>
+                <w:b w:val="0"/>
+                <w:color w:val="B02A37"/>
+                <w:sz w:val="20"/>
+                <w:rtl w:val="1"/>
+                <w:rFonts w:cs="Consolas"/>
+              </w:rPr>
+              <w:t>/connect</w:t>
+            </w:r>
+          </w:p>
+        </w:tc>
+      </w:tr>
+      <w:tr>
+        <w:tc>
+          <w:tcPr>
+            <w:tcW w:type="dxa" w:w="4320"/>
+          </w:tcPr>
+          <w:p>
+            <w:pPr>
+              <w:bidi w:val="1"/>
+              <w:jc w:val="right"/>
+            </w:pPr>
+            <w:r>
+              <w:rPr>
+                <w:rFonts w:ascii="Arial" w:hAnsi="Arial"/>
+                <w:b/>
+                <w:sz w:val="20"/>
+                <w:rtl w:val="1"/>
+                <w:rFonts w:cs="Arial"/>
+              </w:rPr>
+              <w:t>Token refresh</w:t>
+            </w:r>
+            <w:r>
+              <w:rPr>
+                <w:rFonts w:ascii="Arial" w:hAnsi="Arial"/>
+                <w:b w:val="0"/>
+                <w:sz w:val="20"/>
+                <w:rtl w:val="1"/>
+                <w:rFonts w:cs="Arial"/>
+              </w:rPr>
+              <w:t xml:space="preserve"> — GA4 (auto) + Meta long-lived (60d)</w:t>
+            </w:r>
+          </w:p>
+        </w:tc>
+        <w:tc>
+          <w:tcPr>
+            <w:tcW w:type="dxa" w:w="4320"/>
+          </w:tcPr>
+          <w:p>
+            <w:pPr>
+              <w:bidi w:val="1"/>
+              <w:jc w:val="right"/>
+            </w:pPr>
+            <w:r>
+              <w:rPr>
+                <w:rFonts w:ascii="Consolas" w:hAnsi="Consolas"/>
+                <w:b w:val="0"/>
+                <w:color w:val="B02A37"/>
+                <w:sz w:val="20"/>
+                <w:rtl w:val="1"/>
+                <w:rFonts w:cs="Consolas"/>
+              </w:rPr>
+              <w:t>lib/google-token</w:t>
+            </w:r>
+            <w:r>
+              <w:rPr>
+                <w:rFonts w:ascii="Arial" w:hAnsi="Arial"/>
+                <w:b w:val="0"/>
+                <w:sz w:val="20"/>
+                <w:rtl w:val="1"/>
+                <w:rFonts w:cs="Arial"/>
+              </w:rPr>
+              <w:t xml:space="preserve">, </w:t>
+            </w:r>
+            <w:r>
+              <w:rPr>
+                <w:rFonts w:ascii="Consolas" w:hAnsi="Consolas"/>
+                <w:b w:val="0"/>
+                <w:color w:val="B02A37"/>
+                <w:sz w:val="20"/>
+                <w:rtl w:val="1"/>
+                <w:rFonts w:cs="Consolas"/>
+              </w:rPr>
+              <w:t>lib/connectors/meta-token</w:t>
+            </w:r>
+          </w:p>
+        </w:tc>
+      </w:tr>
+      <w:tr>
+        <w:tc>
+          <w:tcPr>
+            <w:tcW w:type="dxa" w:w="4320"/>
+          </w:tcPr>
+          <w:p>
+            <w:pPr>
+              <w:bidi w:val="1"/>
+              <w:jc w:val="right"/>
+            </w:pPr>
+            <w:r>
+              <w:rPr>
+                <w:rFonts w:ascii="Arial" w:hAnsi="Arial"/>
+                <w:b/>
+                <w:sz w:val="20"/>
+                <w:rtl w:val="1"/>
+                <w:rFonts w:cs="Arial"/>
+              </w:rPr>
+              <w:t>סנכרון מתוזמן</w:t>
+            </w:r>
+            <w:r>
+              <w:rPr>
+                <w:rFonts w:ascii="Arial" w:hAnsi="Arial"/>
+                <w:b w:val="0"/>
+                <w:sz w:val="20"/>
+                <w:rtl w:val="1"/>
+                <w:rFonts w:cs="Arial"/>
+              </w:rPr>
+              <w:t xml:space="preserve"> — cron יומי לכל החיבורים (service-role)</w:t>
+            </w:r>
+          </w:p>
+        </w:tc>
+        <w:tc>
+          <w:tcPr>
+            <w:tcW w:type="dxa" w:w="4320"/>
+          </w:tcPr>
+          <w:p>
+            <w:pPr>
+              <w:bidi w:val="1"/>
+              <w:jc w:val="right"/>
+            </w:pPr>
+            <w:r>
+              <w:rPr>
+                <w:rFonts w:ascii="Consolas" w:hAnsi="Consolas"/>
+                <w:b w:val="0"/>
+                <w:color w:val="B02A37"/>
+                <w:sz w:val="20"/>
+                <w:rtl w:val="1"/>
+                <w:rFonts w:cs="Consolas"/>
+              </w:rPr>
+              <w:t>/api/cron/sync</w:t>
+            </w:r>
+            <w:r>
+              <w:rPr>
+                <w:rFonts w:ascii="Arial" w:hAnsi="Arial"/>
+                <w:b w:val="0"/>
+                <w:sz w:val="20"/>
+                <w:rtl w:val="1"/>
+                <w:rFonts w:cs="Arial"/>
+              </w:rPr>
+              <w:t xml:space="preserve">, </w:t>
+            </w:r>
+            <w:r>
+              <w:rPr>
+                <w:rFonts w:ascii="Consolas" w:hAnsi="Consolas"/>
+                <w:b w:val="0"/>
+                <w:color w:val="B02A37"/>
+                <w:sz w:val="20"/>
+                <w:rtl w:val="1"/>
+                <w:rFonts w:cs="Consolas"/>
+              </w:rPr>
+              <w:t>vercel.json</w:t>
+            </w:r>
+          </w:p>
+        </w:tc>
+      </w:tr>
+      <w:tr>
+        <w:tc>
+          <w:tcPr>
+            <w:tcW w:type="dxa" w:w="4320"/>
+          </w:tcPr>
+          <w:p>
+            <w:pPr>
+              <w:bidi w:val="1"/>
+              <w:jc w:val="right"/>
+            </w:pPr>
+            <w:r>
+              <w:rPr>
+                <w:rFonts w:ascii="Arial" w:hAnsi="Arial"/>
+                <w:b/>
+                <w:sz w:val="20"/>
+                <w:rtl w:val="1"/>
+                <w:rFonts w:cs="Arial"/>
+              </w:rPr>
+              <w:t>הקשחת אבטחה</w:t>
+            </w:r>
+            <w:r>
+              <w:rPr>
+                <w:rFonts w:ascii="Arial" w:hAnsi="Arial"/>
+                <w:b w:val="0"/>
+                <w:sz w:val="20"/>
+                <w:rtl w:val="1"/>
+                <w:rFonts w:cs="Arial"/>
+              </w:rPr>
+              <w:t xml:space="preserve"> — הצפנת AES-256-GCM לטוקנים ב-</w:t>
+            </w:r>
+            <w:r>
+              <w:rPr>
+                <w:rFonts w:ascii="Consolas" w:hAnsi="Consolas"/>
+                <w:b w:val="0"/>
+                <w:color w:val="B02A37"/>
+                <w:sz w:val="20"/>
+                <w:rtl w:val="1"/>
+                <w:rFonts w:cs="Consolas"/>
+              </w:rPr>
+              <w:t>connections.config</w:t>
+            </w:r>
+          </w:p>
+        </w:tc>
+        <w:tc>
+          <w:tcPr>
+            <w:tcW w:type="dxa" w:w="4320"/>
+          </w:tcPr>
+          <w:p>
+            <w:pPr>
+              <w:bidi w:val="1"/>
+              <w:jc w:val="right"/>
+            </w:pPr>
+            <w:r>
+              <w:rPr>
+                <w:rFonts w:ascii="Consolas" w:hAnsi="Consolas"/>
+                <w:b w:val="0"/>
+                <w:color w:val="B02A37"/>
+                <w:sz w:val="20"/>
+                <w:rtl w:val="1"/>
+                <w:rFonts w:cs="Consolas"/>
+              </w:rPr>
+              <w:t>lib/secrets</w:t>
+            </w:r>
+            <w:r>
+              <w:rPr>
+                <w:rFonts w:ascii="Arial" w:hAnsi="Arial"/>
+                <w:b w:val="0"/>
+                <w:sz w:val="20"/>
+                <w:rtl w:val="1"/>
+                <w:rFonts w:cs="Arial"/>
+              </w:rPr>
+              <w:t xml:space="preserve"> (env </w:t>
+            </w:r>
+            <w:r>
+              <w:rPr>
+                <w:rFonts w:ascii="Consolas" w:hAnsi="Consolas"/>
+                <w:b w:val="0"/>
+                <w:color w:val="B02A37"/>
+                <w:sz w:val="20"/>
+                <w:rtl w:val="1"/>
+                <w:rFonts w:cs="Consolas"/>
+              </w:rPr>
+              <w:t>SECRETS_KEY</w:t>
+            </w:r>
+            <w:r>
+              <w:rPr>
+                <w:rFonts w:ascii="Arial" w:hAnsi="Arial"/>
+                <w:b w:val="0"/>
+                <w:sz w:val="20"/>
+                <w:rtl w:val="1"/>
+                <w:rFonts w:cs="Arial"/>
+              </w:rPr>
+              <w:t>)</w:t>
+            </w:r>
+          </w:p>
+        </w:tc>
+      </w:tr>
+      <w:tr>
+        <w:tc>
+          <w:tcPr>
+            <w:tcW w:type="dxa" w:w="4320"/>
+          </w:tcPr>
+          <w:p>
+            <w:pPr>
+              <w:bidi w:val="1"/>
+              <w:jc w:val="right"/>
+            </w:pPr>
+            <w:r>
+              <w:rPr>
+                <w:rFonts w:ascii="Arial" w:hAnsi="Arial"/>
+                <w:b/>
+                <w:sz w:val="20"/>
+                <w:rtl w:val="1"/>
+                <w:rFonts w:cs="Arial"/>
+              </w:rPr>
+              <w:t>Sales pipeline native</w:t>
+            </w:r>
+            <w:r>
+              <w:rPr>
+                <w:rFonts w:ascii="Arial" w:hAnsi="Arial"/>
+                <w:b w:val="0"/>
+                <w:sz w:val="20"/>
+                <w:rtl w:val="1"/>
+                <w:rFonts w:cs="Arial"/>
+              </w:rPr>
+              <w:t xml:space="preserve"> (בסגנון atomic-crm) — לוח Kanban → מדדי-מכירות אמיתיים</w:t>
+            </w:r>
+          </w:p>
+        </w:tc>
+        <w:tc>
+          <w:tcPr>
+            <w:tcW w:type="dxa" w:w="4320"/>
+          </w:tcPr>
+          <w:p>
+            <w:pPr>
+              <w:bidi w:val="1"/>
+              <w:jc w:val="right"/>
+            </w:pPr>
+            <w:r>
+              <w:rPr>
+                <w:rFonts w:ascii="Consolas" w:hAnsi="Consolas"/>
+                <w:b w:val="0"/>
+                <w:color w:val="B02A37"/>
+                <w:sz w:val="20"/>
+                <w:rtl w:val="1"/>
+                <w:rFonts w:cs="Consolas"/>
+              </w:rPr>
+              <w:t>deals</w:t>
+            </w:r>
+            <w:r>
+              <w:rPr>
+                <w:rFonts w:ascii="Arial" w:hAnsi="Arial"/>
+                <w:b w:val="0"/>
+                <w:sz w:val="20"/>
+                <w:rtl w:val="1"/>
+                <w:rFonts w:cs="Arial"/>
+              </w:rPr>
+              <w:t xml:space="preserve"> table, </w:t>
+            </w:r>
+            <w:r>
+              <w:rPr>
+                <w:rFonts w:ascii="Consolas" w:hAnsi="Consolas"/>
+                <w:b w:val="0"/>
+                <w:color w:val="B02A37"/>
+                <w:sz w:val="20"/>
+                <w:rtl w:val="1"/>
+                <w:rFonts w:cs="Consolas"/>
+              </w:rPr>
+              <w:t>/deals</w:t>
+            </w:r>
+            <w:r>
+              <w:rPr>
+                <w:rFonts w:ascii="Arial" w:hAnsi="Arial"/>
+                <w:b w:val="0"/>
+                <w:sz w:val="20"/>
+                <w:rtl w:val="1"/>
+                <w:rFonts w:cs="Arial"/>
+              </w:rPr>
+              <w:t xml:space="preserve">, </w:t>
+            </w:r>
+            <w:r>
+              <w:rPr>
+                <w:rFonts w:ascii="Consolas" w:hAnsi="Consolas"/>
+                <w:b w:val="0"/>
+                <w:color w:val="B02A37"/>
+                <w:sz w:val="20"/>
+                <w:rtl w:val="1"/>
+                <w:rFonts w:cs="Consolas"/>
+              </w:rPr>
+              <w:t>DealsManager</w:t>
+            </w:r>
+            <w:r>
+              <w:rPr>
+                <w:rFonts w:ascii="Arial" w:hAnsi="Arial"/>
+                <w:b w:val="0"/>
+                <w:sz w:val="20"/>
+                <w:rtl w:val="1"/>
+                <w:rFonts w:cs="Arial"/>
+              </w:rPr>
+              <w:t xml:space="preserve">, </w:t>
+            </w:r>
+            <w:r>
+              <w:rPr>
+                <w:rFonts w:ascii="Consolas" w:hAnsi="Consolas"/>
+                <w:b w:val="0"/>
+                <w:color w:val="B02A37"/>
+                <w:sz w:val="20"/>
+                <w:rtl w:val="1"/>
+                <w:rFonts w:cs="Consolas"/>
+              </w:rPr>
+              <w:t>lib/sales</w:t>
+            </w:r>
+            <w:r>
+              <w:rPr>
+                <w:rFonts w:ascii="Arial" w:hAnsi="Arial"/>
+                <w:b w:val="0"/>
+                <w:sz w:val="20"/>
+                <w:rtl w:val="1"/>
+                <w:rFonts w:cs="Arial"/>
+              </w:rPr>
+              <w:t xml:space="preserve">, </w:t>
+            </w:r>
+            <w:r>
+              <w:rPr>
+                <w:rFonts w:ascii="Consolas" w:hAnsi="Consolas"/>
+                <w:b w:val="0"/>
+                <w:color w:val="B02A37"/>
+                <w:sz w:val="20"/>
+                <w:rtl w:val="1"/>
+                <w:rFonts w:cs="Consolas"/>
+              </w:rPr>
+              <w:t>actions-deals</w:t>
+            </w:r>
+          </w:p>
+        </w:tc>
+      </w:tr>
+      <w:tr>
+        <w:tc>
+          <w:tcPr>
+            <w:tcW w:type="dxa" w:w="4320"/>
+          </w:tcPr>
+          <w:p>
+            <w:pPr>
+              <w:bidi w:val="1"/>
+              <w:jc w:val="right"/>
+            </w:pPr>
+            <w:r>
+              <w:rPr>
+                <w:rFonts w:ascii="Arial" w:hAnsi="Arial"/>
+                <w:b/>
+                <w:sz w:val="20"/>
+                <w:rtl w:val="1"/>
+                <w:rFonts w:cs="Arial"/>
+              </w:rPr>
+              <w:t>עדכון אוטומטי (Ollama) + נרטיב</w:t>
+            </w:r>
+            <w:r>
+              <w:rPr>
+                <w:rFonts w:ascii="Arial" w:hAnsi="Arial"/>
+                <w:b w:val="0"/>
+                <w:sz w:val="20"/>
+                <w:rtl w:val="1"/>
+                <w:rFonts w:cs="Arial"/>
+              </w:rPr>
+              <w:t xml:space="preserve"> — Model Router (Ollama→Claude) → digest עברי</w:t>
+            </w:r>
+          </w:p>
+        </w:tc>
+        <w:tc>
+          <w:tcPr>
+            <w:tcW w:type="dxa" w:w="4320"/>
+          </w:tcPr>
+          <w:p>
+            <w:pPr>
+              <w:bidi w:val="1"/>
+              <w:jc w:val="right"/>
+            </w:pPr>
+            <w:r>
+              <w:rPr>
+                <w:rFonts w:ascii="Consolas" w:hAnsi="Consolas"/>
+                <w:b w:val="0"/>
+                <w:color w:val="B02A37"/>
+                <w:sz w:val="20"/>
+                <w:rtl w:val="1"/>
+                <w:rFonts w:cs="Consolas"/>
+              </w:rPr>
+              <w:t>lib/ollama</w:t>
+            </w:r>
+            <w:r>
+              <w:rPr>
+                <w:rFonts w:ascii="Arial" w:hAnsi="Arial"/>
+                <w:b w:val="0"/>
+                <w:sz w:val="20"/>
+                <w:rtl w:val="1"/>
+                <w:rFonts w:cs="Arial"/>
+              </w:rPr>
+              <w:t xml:space="preserve">, </w:t>
+            </w:r>
+            <w:r>
+              <w:rPr>
+                <w:rFonts w:ascii="Consolas" w:hAnsi="Consolas"/>
+                <w:b w:val="0"/>
+                <w:color w:val="B02A37"/>
+                <w:sz w:val="20"/>
+                <w:rtl w:val="1"/>
+                <w:rFonts w:cs="Consolas"/>
+              </w:rPr>
+              <w:t>lib/digest</w:t>
+            </w:r>
+            <w:r>
+              <w:rPr>
+                <w:rFonts w:ascii="Arial" w:hAnsi="Arial"/>
+                <w:b w:val="0"/>
+                <w:sz w:val="20"/>
+                <w:rtl w:val="1"/>
+                <w:rFonts w:cs="Arial"/>
+              </w:rPr>
+              <w:t xml:space="preserve">, </w:t>
+            </w:r>
+            <w:r>
+              <w:rPr>
+                <w:rFonts w:ascii="Consolas" w:hAnsi="Consolas"/>
+                <w:b w:val="0"/>
+                <w:color w:val="B02A37"/>
+                <w:sz w:val="20"/>
+                <w:rtl w:val="1"/>
+                <w:rFonts w:cs="Consolas"/>
+              </w:rPr>
+              <w:t>lib/digest-data</w:t>
+            </w:r>
+          </w:p>
+        </w:tc>
+      </w:tr>
+      <w:tr>
+        <w:tc>
+          <w:tcPr>
+            <w:tcW w:type="dxa" w:w="4320"/>
+          </w:tcPr>
+          <w:p>
+            <w:pPr>
+              <w:bidi w:val="1"/>
+              <w:jc w:val="right"/>
+            </w:pPr>
+            <w:r>
+              <w:rPr>
+                <w:rFonts w:ascii="Arial" w:hAnsi="Arial"/>
+                <w:b/>
+                <w:sz w:val="20"/>
+                <w:rtl w:val="1"/>
+                <w:rFonts w:cs="Arial"/>
+              </w:rPr>
+              <w:t>מסירה רב-ערוצית + בוט</w:t>
+            </w:r>
+            <w:r>
+              <w:rPr>
+                <w:rFonts w:ascii="Arial" w:hAnsi="Arial"/>
+                <w:b w:val="0"/>
+                <w:sz w:val="20"/>
+                <w:rtl w:val="1"/>
+                <w:rFonts w:cs="Arial"/>
+              </w:rPr>
+              <w:t xml:space="preserve"> — טלגרם/וואטסאפ/מייל + webhook בוט (נתונים אמיתיים per-צ׳אט)</w:t>
+            </w:r>
+          </w:p>
+        </w:tc>
+        <w:tc>
+          <w:tcPr>
+            <w:tcW w:type="dxa" w:w="4320"/>
+          </w:tcPr>
+          <w:p>
+            <w:pPr>
+              <w:bidi w:val="1"/>
+              <w:jc w:val="right"/>
+            </w:pPr>
+            <w:r>
+              <w:rPr>
+                <w:rFonts w:ascii="Consolas" w:hAnsi="Consolas"/>
+                <w:b w:val="0"/>
+                <w:color w:val="B02A37"/>
+                <w:sz w:val="20"/>
+                <w:rtl w:val="1"/>
+                <w:rFonts w:cs="Consolas"/>
+              </w:rPr>
+              <w:t>lib/channels</w:t>
+            </w:r>
+            <w:r>
+              <w:rPr>
+                <w:rFonts w:ascii="Arial" w:hAnsi="Arial"/>
+                <w:b w:val="0"/>
+                <w:sz w:val="20"/>
+                <w:rtl w:val="1"/>
+                <w:rFonts w:cs="Arial"/>
+              </w:rPr>
+              <w:t xml:space="preserve">, </w:t>
+            </w:r>
+            <w:r>
+              <w:rPr>
+                <w:rFonts w:ascii="Consolas" w:hAnsi="Consolas"/>
+                <w:b w:val="0"/>
+                <w:color w:val="B02A37"/>
+                <w:sz w:val="20"/>
+                <w:rtl w:val="1"/>
+                <w:rFonts w:cs="Consolas"/>
+              </w:rPr>
+              <w:t>/api/telegram</w:t>
+            </w:r>
+            <w:r>
+              <w:rPr>
+                <w:rFonts w:ascii="Arial" w:hAnsi="Arial"/>
+                <w:b w:val="0"/>
+                <w:sz w:val="20"/>
+                <w:rtl w:val="1"/>
+                <w:rFonts w:cs="Arial"/>
+              </w:rPr>
+              <w:t xml:space="preserve">, </w:t>
+            </w:r>
+            <w:r>
+              <w:rPr>
+                <w:rFonts w:ascii="Consolas" w:hAnsi="Consolas"/>
+                <w:b w:val="0"/>
+                <w:color w:val="B02A37"/>
+                <w:sz w:val="20"/>
+                <w:rtl w:val="1"/>
+                <w:rFonts w:cs="Consolas"/>
+              </w:rPr>
+              <w:t>bot_links</w:t>
+            </w:r>
+          </w:p>
+        </w:tc>
+      </w:tr>
+      <w:tr>
+        <w:tc>
+          <w:tcPr>
+            <w:tcW w:type="dxa" w:w="4320"/>
+          </w:tcPr>
+          <w:p>
+            <w:pPr>
+              <w:bidi w:val="1"/>
+              <w:jc w:val="right"/>
+            </w:pPr>
+            <w:r>
+              <w:rPr>
+                <w:rFonts w:ascii="Arial" w:hAnsi="Arial"/>
+                <w:b/>
+                <w:sz w:val="20"/>
+                <w:rtl w:val="1"/>
+                <w:rFonts w:cs="Arial"/>
+              </w:rPr>
+              <w:t>Digest מתוזמן</w:t>
+            </w:r>
+            <w:r>
+              <w:rPr>
+                <w:rFonts w:ascii="Arial" w:hAnsi="Arial"/>
+                <w:b w:val="0"/>
+                <w:sz w:val="20"/>
+                <w:rtl w:val="1"/>
+                <w:rFonts w:cs="Arial"/>
+              </w:rPr>
+              <w:t xml:space="preserve"> — מנויים + שליחה שעתית</w:t>
+            </w:r>
+          </w:p>
+        </w:tc>
+        <w:tc>
+          <w:tcPr>
+            <w:tcW w:type="dxa" w:w="4320"/>
+          </w:tcPr>
+          <w:p>
+            <w:pPr>
+              <w:bidi w:val="1"/>
+              <w:jc w:val="right"/>
+            </w:pPr>
+            <w:r>
+              <w:rPr>
+                <w:rFonts w:ascii="Consolas" w:hAnsi="Consolas"/>
+                <w:b w:val="0"/>
+                <w:color w:val="B02A37"/>
+                <w:sz w:val="20"/>
+                <w:rtl w:val="1"/>
+                <w:rFonts w:cs="Consolas"/>
+              </w:rPr>
+              <w:t>digest_subscriptions</w:t>
+            </w:r>
+            <w:r>
+              <w:rPr>
+                <w:rFonts w:ascii="Arial" w:hAnsi="Arial"/>
+                <w:b w:val="0"/>
+                <w:sz w:val="20"/>
+                <w:rtl w:val="1"/>
+                <w:rFonts w:cs="Arial"/>
+              </w:rPr>
+              <w:t xml:space="preserve">, </w:t>
+            </w:r>
+            <w:r>
+              <w:rPr>
+                <w:rFonts w:ascii="Consolas" w:hAnsi="Consolas"/>
+                <w:b w:val="0"/>
+                <w:color w:val="B02A37"/>
+                <w:sz w:val="20"/>
+                <w:rtl w:val="1"/>
+                <w:rFonts w:cs="Consolas"/>
+              </w:rPr>
+              <w:t>/api/cron/digest</w:t>
+            </w:r>
+            <w:r>
+              <w:rPr>
+                <w:rFonts w:ascii="Arial" w:hAnsi="Arial"/>
+                <w:b w:val="0"/>
+                <w:sz w:val="20"/>
+                <w:rtl w:val="1"/>
+                <w:rFonts w:cs="Arial"/>
+              </w:rPr>
+              <w:t xml:space="preserve">, </w:t>
+            </w:r>
+            <w:r>
+              <w:rPr>
+                <w:rFonts w:ascii="Consolas" w:hAnsi="Consolas"/>
+                <w:b w:val="0"/>
+                <w:color w:val="B02A37"/>
+                <w:sz w:val="20"/>
+                <w:rtl w:val="1"/>
+                <w:rFonts w:cs="Consolas"/>
+              </w:rPr>
+              <w:t>/digest</w:t>
+            </w:r>
+            <w:r>
+              <w:rPr>
+                <w:rFonts w:ascii="Arial" w:hAnsi="Arial"/>
+                <w:b w:val="0"/>
+                <w:sz w:val="20"/>
+                <w:rtl w:val="1"/>
+                <w:rFonts w:cs="Arial"/>
+              </w:rPr>
+              <w:t xml:space="preserve">, </w:t>
+            </w:r>
+            <w:r>
+              <w:rPr>
+                <w:rFonts w:ascii="Consolas" w:hAnsi="Consolas"/>
+                <w:b w:val="0"/>
+                <w:color w:val="B02A37"/>
+                <w:sz w:val="20"/>
+                <w:rtl w:val="1"/>
+                <w:rFonts w:cs="Consolas"/>
+              </w:rPr>
+              <w:t>actions-digest</w:t>
+            </w:r>
+          </w:p>
+        </w:tc>
+      </w:tr>
+    </w:tbl>
+    <w:p>
+      <w:pPr>
+        <w:pStyle w:val="Heading3"/>
+        <w:bidi w:val="1"/>
+        <w:jc w:val="right"/>
+      </w:pPr>
+      <w:r>
+        <w:rPr>
+          <w:rFonts w:ascii="Arial" w:hAnsi="Arial"/>
+          <w:b w:val="0"/>
+          <w:sz w:val="24"/>
+          <w:rtl w:val="1"/>
+          <w:rFonts w:cs="Arial"/>
+        </w:rPr>
+        <w:t>⬜ נשאר להשלים</w:t>
+      </w:r>
+    </w:p>
+    <w:tbl>
+      <w:tblPr>
+        <w:tblStyle w:val="LightGrid-Accent1"/>
+        <w:tblW w:type="auto" w:w="0"/>
+        <w:tblLook w:firstColumn="1" w:firstRow="1" w:lastColumn="0" w:lastRow="0" w:noHBand="0" w:noVBand="1" w:val="04A0"/>
+        <w:bidiVisual/>
+      </w:tblPr>
+      <w:tblGrid>
+        <w:gridCol w:w="2880"/>
+        <w:gridCol w:w="2880"/>
+        <w:gridCol w:w="2880"/>
+      </w:tblGrid>
+      <w:tr>
+        <w:tc>
+          <w:tcPr>
+            <w:tcW w:type="dxa" w:w="2880"/>
+          </w:tcPr>
+          <w:p>
+            <w:pPr>
+              <w:bidi w:val="1"/>
+              <w:jc w:val="right"/>
+            </w:pPr>
+            <w:r>
+              <w:rPr>
+                <w:rFonts w:ascii="Arial" w:hAnsi="Arial"/>
+                <w:b/>
+                <w:sz w:val="20"/>
+                <w:rtl w:val="1"/>
+                <w:rFonts w:cs="Arial"/>
+              </w:rPr>
+              <w:t>מה</w:t>
+            </w:r>
+          </w:p>
+        </w:tc>
+        <w:tc>
+          <w:tcPr>
+            <w:tcW w:type="dxa" w:w="2880"/>
+          </w:tcPr>
+          <w:p>
+            <w:pPr>
+              <w:bidi w:val="1"/>
+              <w:jc w:val="right"/>
+            </w:pPr>
+            <w:r>
+              <w:rPr>
+                <w:rFonts w:ascii="Arial" w:hAnsi="Arial"/>
+                <w:b/>
+                <w:sz w:val="20"/>
+                <w:rtl w:val="1"/>
+                <w:rFonts w:cs="Arial"/>
+              </w:rPr>
+              <w:t>סטטוס</w:t>
+            </w:r>
+          </w:p>
+        </w:tc>
+        <w:tc>
+          <w:tcPr>
+            <w:tcW w:type="dxa" w:w="2880"/>
+          </w:tcPr>
+          <w:p>
+            <w:pPr>
+              <w:bidi w:val="1"/>
+              <w:jc w:val="right"/>
+            </w:pPr>
+            <w:r>
+              <w:rPr>
+                <w:rFonts w:ascii="Arial" w:hAnsi="Arial"/>
+                <w:b/>
+                <w:sz w:val="20"/>
+                <w:rtl w:val="1"/>
+                <w:rFonts w:cs="Arial"/>
+              </w:rPr>
+              <w:t>מה צריך</w:t>
+            </w:r>
+          </w:p>
+        </w:tc>
+      </w:tr>
+      <w:tr>
+        <w:tc>
+          <w:tcPr>
+            <w:tcW w:type="dxa" w:w="2880"/>
+          </w:tcPr>
+          <w:p>
+            <w:pPr>
+              <w:bidi w:val="1"/>
+              <w:jc w:val="right"/>
+            </w:pPr>
+            <w:r>
+              <w:rPr>
+                <w:rFonts w:ascii="Arial" w:hAnsi="Arial"/>
+                <w:b/>
+                <w:sz w:val="20"/>
+                <w:rtl w:val="1"/>
+                <w:rFonts w:cs="Arial"/>
+              </w:rPr>
+              <w:t>הרצה live</w:t>
+            </w:r>
+          </w:p>
+        </w:tc>
+        <w:tc>
+          <w:tcPr>
+            <w:tcW w:type="dxa" w:w="2880"/>
+          </w:tcPr>
+          <w:p>
+            <w:pPr>
+              <w:bidi w:val="1"/>
+              <w:jc w:val="right"/>
+            </w:pPr>
+            <w:r>
+              <w:rPr>
+                <w:rFonts w:ascii="Arial" w:hAnsi="Arial"/>
+                <w:b w:val="0"/>
+                <w:sz w:val="20"/>
+                <w:rtl w:val="1"/>
+                <w:rFonts w:cs="Arial"/>
+              </w:rPr>
+              <w:t>קוד מוכן</w:t>
+            </w:r>
+          </w:p>
+        </w:tc>
+        <w:tc>
+          <w:tcPr>
+            <w:tcW w:type="dxa" w:w="2880"/>
+          </w:tcPr>
+          <w:p>
+            <w:pPr>
+              <w:bidi w:val="1"/>
+              <w:jc w:val="right"/>
+            </w:pPr>
+            <w:r>
+              <w:rPr>
+                <w:rFonts w:ascii="Arial" w:hAnsi="Arial"/>
+                <w:b w:val="0"/>
+                <w:sz w:val="20"/>
+                <w:rtl w:val="1"/>
+                <w:rFonts w:cs="Arial"/>
+              </w:rPr>
+              <w:t xml:space="preserve">הרצת </w:t>
+            </w:r>
+            <w:r>
+              <w:rPr>
+                <w:rFonts w:ascii="Consolas" w:hAnsi="Consolas"/>
+                <w:b w:val="0"/>
+                <w:color w:val="B02A37"/>
+                <w:sz w:val="20"/>
+                <w:rtl w:val="1"/>
+                <w:rFonts w:cs="Consolas"/>
+              </w:rPr>
+              <w:t>schema.sql</w:t>
+            </w:r>
+            <w:r>
+              <w:rPr>
+                <w:rFonts w:ascii="Arial" w:hAnsi="Arial"/>
+                <w:b w:val="0"/>
+                <w:sz w:val="20"/>
+                <w:rtl w:val="1"/>
+                <w:rFonts w:cs="Arial"/>
+              </w:rPr>
+              <w:t xml:space="preserve"> ב-Supabase + env (</w:t>
+            </w:r>
+            <w:r>
+              <w:rPr>
+                <w:rFonts w:ascii="Consolas" w:hAnsi="Consolas"/>
+                <w:b w:val="0"/>
+                <w:color w:val="B02A37"/>
+                <w:sz w:val="20"/>
+                <w:rtl w:val="1"/>
+                <w:rFonts w:cs="Consolas"/>
+              </w:rPr>
+              <w:t>NEXT_PUBLIC_SUPABASE_*</w:t>
+            </w:r>
+            <w:r>
+              <w:rPr>
+                <w:rFonts w:ascii="Arial" w:hAnsi="Arial"/>
+                <w:b w:val="0"/>
+                <w:sz w:val="20"/>
+                <w:rtl w:val="1"/>
+                <w:rFonts w:cs="Arial"/>
+              </w:rPr>
+              <w:t xml:space="preserve">, </w:t>
+            </w:r>
+            <w:r>
+              <w:rPr>
+                <w:rFonts w:ascii="Consolas" w:hAnsi="Consolas"/>
+                <w:b w:val="0"/>
+                <w:color w:val="B02A37"/>
+                <w:sz w:val="20"/>
+                <w:rtl w:val="1"/>
+                <w:rFonts w:cs="Consolas"/>
+              </w:rPr>
+              <w:t>SUPABASE_SERVICE_ROLE_KEY</w:t>
+            </w:r>
+            <w:r>
+              <w:rPr>
+                <w:rFonts w:ascii="Arial" w:hAnsi="Arial"/>
+                <w:b w:val="0"/>
+                <w:sz w:val="20"/>
+                <w:rtl w:val="1"/>
+                <w:rFonts w:cs="Arial"/>
+              </w:rPr>
+              <w:t xml:space="preserve">, </w:t>
+            </w:r>
+            <w:r>
+              <w:rPr>
+                <w:rFonts w:ascii="Consolas" w:hAnsi="Consolas"/>
+                <w:b w:val="0"/>
+                <w:color w:val="B02A37"/>
+                <w:sz w:val="20"/>
+                <w:rtl w:val="1"/>
+                <w:rFonts w:cs="Consolas"/>
+              </w:rPr>
+              <w:t>GOOGLE_OAUTH_*</w:t>
+            </w:r>
+            <w:r>
+              <w:rPr>
+                <w:rFonts w:ascii="Arial" w:hAnsi="Arial"/>
+                <w:b w:val="0"/>
+                <w:sz w:val="20"/>
+                <w:rtl w:val="1"/>
+                <w:rFonts w:cs="Arial"/>
+              </w:rPr>
+              <w:t xml:space="preserve">, </w:t>
+            </w:r>
+            <w:r>
+              <w:rPr>
+                <w:rFonts w:ascii="Consolas" w:hAnsi="Consolas"/>
+                <w:b w:val="0"/>
+                <w:color w:val="B02A37"/>
+                <w:sz w:val="20"/>
+                <w:rtl w:val="1"/>
+                <w:rFonts w:cs="Consolas"/>
+              </w:rPr>
+              <w:t>SECRETS_KEY</w:t>
+            </w:r>
+            <w:r>
+              <w:rPr>
+                <w:rFonts w:ascii="Arial" w:hAnsi="Arial"/>
+                <w:b w:val="0"/>
+                <w:sz w:val="20"/>
+                <w:rtl w:val="1"/>
+                <w:rFonts w:cs="Arial"/>
+              </w:rPr>
+              <w:t xml:space="preserve">, </w:t>
+            </w:r>
+            <w:r>
+              <w:rPr>
+                <w:rFonts w:ascii="Consolas" w:hAnsi="Consolas"/>
+                <w:b w:val="0"/>
+                <w:color w:val="B02A37"/>
+                <w:sz w:val="20"/>
+                <w:rtl w:val="1"/>
+                <w:rFonts w:cs="Consolas"/>
+              </w:rPr>
+              <w:t>ANTHROPIC_API_KEY</w:t>
+            </w:r>
+            <w:r>
+              <w:rPr>
+                <w:rFonts w:ascii="Arial" w:hAnsi="Arial"/>
+                <w:b w:val="0"/>
+                <w:sz w:val="20"/>
+                <w:rtl w:val="1"/>
+                <w:rFonts w:cs="Arial"/>
+              </w:rPr>
+              <w:t>/</w:t>
+            </w:r>
+            <w:r>
+              <w:rPr>
+                <w:rFonts w:ascii="Consolas" w:hAnsi="Consolas"/>
+                <w:b w:val="0"/>
+                <w:color w:val="B02A37"/>
+                <w:sz w:val="20"/>
+                <w:rtl w:val="1"/>
+                <w:rFonts w:cs="Consolas"/>
+              </w:rPr>
+              <w:t>OLLAMA_BASE_URL</w:t>
+            </w:r>
+            <w:r>
+              <w:rPr>
+                <w:rFonts w:ascii="Arial" w:hAnsi="Arial"/>
+                <w:b w:val="0"/>
+                <w:sz w:val="20"/>
+                <w:rtl w:val="1"/>
+                <w:rFonts w:cs="Arial"/>
+              </w:rPr>
+              <w:t xml:space="preserve">, </w:t>
+            </w:r>
+            <w:r>
+              <w:rPr>
+                <w:rFonts w:ascii="Consolas" w:hAnsi="Consolas"/>
+                <w:b w:val="0"/>
+                <w:color w:val="B02A37"/>
+                <w:sz w:val="20"/>
+                <w:rtl w:val="1"/>
+                <w:rFonts w:cs="Consolas"/>
+              </w:rPr>
+              <w:t>TELEGRAM_BOT_TOKEN</w:t>
+            </w:r>
+            <w:r>
+              <w:rPr>
+                <w:rFonts w:ascii="Arial" w:hAnsi="Arial"/>
+                <w:b w:val="0"/>
+                <w:sz w:val="20"/>
+                <w:rtl w:val="1"/>
+                <w:rFonts w:cs="Arial"/>
+              </w:rPr>
+              <w:t xml:space="preserve">, </w:t>
+            </w:r>
+            <w:r>
+              <w:rPr>
+                <w:rFonts w:ascii="Consolas" w:hAnsi="Consolas"/>
+                <w:b w:val="0"/>
+                <w:color w:val="B02A37"/>
+                <w:sz w:val="20"/>
+                <w:rtl w:val="1"/>
+                <w:rFonts w:cs="Consolas"/>
+              </w:rPr>
+              <w:t>RESEND_API_KEY</w:t>
+            </w:r>
+            <w:r>
+              <w:rPr>
+                <w:rFonts w:ascii="Arial" w:hAnsi="Arial"/>
+                <w:b w:val="0"/>
+                <w:sz w:val="20"/>
+                <w:rtl w:val="1"/>
+                <w:rFonts w:cs="Arial"/>
+              </w:rPr>
+              <w:t xml:space="preserve">, </w:t>
+            </w:r>
+            <w:r>
+              <w:rPr>
+                <w:rFonts w:ascii="Consolas" w:hAnsi="Consolas"/>
+                <w:b w:val="0"/>
+                <w:color w:val="B02A37"/>
+                <w:sz w:val="20"/>
+                <w:rtl w:val="1"/>
+                <w:rFonts w:cs="Consolas"/>
+              </w:rPr>
+              <w:t>CRON_SECRET</w:t>
+            </w:r>
+            <w:r>
+              <w:rPr>
+                <w:rFonts w:ascii="Arial" w:hAnsi="Arial"/>
+                <w:b w:val="0"/>
+                <w:sz w:val="20"/>
+                <w:rtl w:val="1"/>
+                <w:rFonts w:cs="Arial"/>
+              </w:rPr>
+              <w:t xml:space="preserve">, </w:t>
+            </w:r>
+            <w:r>
+              <w:rPr>
+                <w:rFonts w:ascii="Consolas" w:hAnsi="Consolas"/>
+                <w:b w:val="0"/>
+                <w:color w:val="B02A37"/>
+                <w:sz w:val="20"/>
+                <w:rtl w:val="1"/>
+                <w:rFonts w:cs="Consolas"/>
+              </w:rPr>
+              <w:t>FB_APP_ID/SECRET</w:t>
+            </w:r>
+            <w:r>
+              <w:rPr>
+                <w:rFonts w:ascii="Arial" w:hAnsi="Arial"/>
+                <w:b w:val="0"/>
+                <w:sz w:val="20"/>
+                <w:rtl w:val="1"/>
+                <w:rFonts w:cs="Arial"/>
+              </w:rPr>
+              <w:t>) + Deploy Vercel</w:t>
+            </w:r>
+          </w:p>
+        </w:tc>
+      </w:tr>
+      <w:tr>
+        <w:tc>
+          <w:tcPr>
+            <w:tcW w:type="dxa" w:w="2880"/>
+          </w:tcPr>
+          <w:p>
+            <w:pPr>
+              <w:bidi w:val="1"/>
+              <w:jc w:val="right"/>
+            </w:pPr>
+            <w:r>
+              <w:rPr>
+                <w:rFonts w:ascii="Arial" w:hAnsi="Arial"/>
+                <w:b/>
+                <w:sz w:val="20"/>
+                <w:rtl w:val="1"/>
+                <w:rFonts w:cs="Arial"/>
+              </w:rPr>
+              <w:t>Connectors נוספים</w:t>
+            </w:r>
+          </w:p>
+        </w:tc>
+        <w:tc>
+          <w:tcPr>
+            <w:tcW w:type="dxa" w:w="2880"/>
+          </w:tcPr>
+          <w:p>
+            <w:pPr>
+              <w:bidi w:val="1"/>
+              <w:jc w:val="right"/>
+            </w:pPr>
+            <w:r>
+              <w:rPr>
+                <w:rFonts w:ascii="Arial" w:hAnsi="Arial"/>
+                <w:b w:val="0"/>
+                <w:sz w:val="20"/>
+                <w:rtl w:val="1"/>
+                <w:rFonts w:cs="Arial"/>
+              </w:rPr>
+              <w:t>לא נבנה</w:t>
+            </w:r>
+          </w:p>
+        </w:tc>
+        <w:tc>
+          <w:tcPr>
+            <w:tcW w:type="dxa" w:w="2880"/>
+          </w:tcPr>
+          <w:p>
+            <w:pPr>
+              <w:bidi w:val="1"/>
+              <w:jc w:val="right"/>
+            </w:pPr>
+            <w:r>
+              <w:rPr>
+                <w:rFonts w:ascii="Arial" w:hAnsi="Arial"/>
+                <w:b w:val="0"/>
+                <w:sz w:val="20"/>
+                <w:rtl w:val="1"/>
+                <w:rFonts w:cs="Arial"/>
+              </w:rPr>
+              <w:t xml:space="preserve">CRM (HubSpot/Pipedrive) · הנהח״ש ישראלי (GreenInvoice/חשבשבת — edge-fn ייעודי, הבידול) · Zendesk/Intercom · Mixpanel/PostHog. אסטרטגיה: </w:t>
+            </w:r>
+            <w:r>
+              <w:rPr>
+                <w:rFonts w:ascii="Arial" w:hAnsi="Arial"/>
+                <w:b/>
+                <w:sz w:val="20"/>
+                <w:rtl w:val="1"/>
+                <w:rFonts w:cs="Arial"/>
+              </w:rPr>
+              <w:t>Nango</w:t>
+            </w:r>
+            <w:r>
+              <w:rPr>
+                <w:rFonts w:ascii="Arial" w:hAnsi="Arial"/>
+                <w:b w:val="0"/>
+                <w:sz w:val="20"/>
+                <w:rtl w:val="1"/>
+                <w:rFonts w:cs="Arial"/>
+              </w:rPr>
+              <w:t xml:space="preserve"> כמנוע-על (ראה 02b)</w:t>
+            </w:r>
+          </w:p>
+        </w:tc>
+      </w:tr>
+      <w:tr>
+        <w:tc>
+          <w:tcPr>
+            <w:tcW w:type="dxa" w:w="2880"/>
+          </w:tcPr>
+          <w:p>
+            <w:pPr>
+              <w:bidi w:val="1"/>
+              <w:jc w:val="right"/>
+            </w:pPr>
+            <w:r>
+              <w:rPr>
+                <w:rFonts w:ascii="Arial" w:hAnsi="Arial"/>
+                <w:b/>
+                <w:sz w:val="20"/>
+                <w:rtl w:val="1"/>
+                <w:rFonts w:cs="Arial"/>
+              </w:rPr>
+              <w:t>מדדי real-data מלאים</w:t>
+            </w:r>
+          </w:p>
+        </w:tc>
+        <w:tc>
+          <w:tcPr>
+            <w:tcW w:type="dxa" w:w="2880"/>
+          </w:tcPr>
+          <w:p>
+            <w:pPr>
+              <w:bidi w:val="1"/>
+              <w:jc w:val="right"/>
+            </w:pPr>
+            <w:r>
+              <w:rPr>
+                <w:rFonts w:ascii="Arial" w:hAnsi="Arial"/>
+                <w:b w:val="0"/>
+                <w:sz w:val="20"/>
+                <w:rtl w:val="1"/>
+                <w:rFonts w:cs="Arial"/>
+              </w:rPr>
+              <w:t>חלקי</w:t>
+            </w:r>
+          </w:p>
+        </w:tc>
+        <w:tc>
+          <w:tcPr>
+            <w:tcW w:type="dxa" w:w="2880"/>
+          </w:tcPr>
+          <w:p>
+            <w:pPr>
+              <w:bidi w:val="1"/>
+              <w:jc w:val="right"/>
+            </w:pPr>
+            <w:r>
+              <w:rPr>
+                <w:rFonts w:ascii="Arial" w:hAnsi="Arial"/>
+                <w:b w:val="0"/>
+                <w:sz w:val="20"/>
+                <w:rtl w:val="1"/>
+                <w:rFonts w:cs="Arial"/>
+              </w:rPr>
+              <w:t>כרגע אמיתי: GA4 (sessions/conversions), Stripe (revenue/mrr), Shopify (sales/aov), Meta (spend), deals (pipeline/win-rate). השאר — demo עד ה-connector שלו</w:t>
+            </w:r>
+          </w:p>
+        </w:tc>
+      </w:tr>
+      <w:tr>
+        <w:tc>
+          <w:tcPr>
+            <w:tcW w:type="dxa" w:w="2880"/>
+          </w:tcPr>
+          <w:p>
+            <w:pPr>
+              <w:bidi w:val="1"/>
+              <w:jc w:val="right"/>
+            </w:pPr>
+            <w:r>
+              <w:rPr>
+                <w:rFonts w:ascii="Arial" w:hAnsi="Arial"/>
+                <w:b/>
+                <w:sz w:val="20"/>
+                <w:rtl w:val="1"/>
+                <w:rFonts w:cs="Arial"/>
+              </w:rPr>
+              <w:t>widgets funnel/table מ-real data</w:t>
+            </w:r>
+          </w:p>
+        </w:tc>
+        <w:tc>
+          <w:tcPr>
+            <w:tcW w:type="dxa" w:w="2880"/>
+          </w:tcPr>
+          <w:p>
+            <w:pPr>
+              <w:bidi w:val="1"/>
+              <w:jc w:val="right"/>
+            </w:pPr>
+            <w:r>
+              <w:rPr>
+                <w:rFonts w:ascii="Arial" w:hAnsi="Arial"/>
+                <w:b w:val="0"/>
+                <w:sz w:val="20"/>
+                <w:rtl w:val="1"/>
+                <w:rFonts w:cs="Arial"/>
+              </w:rPr>
+              <w:t>demo</w:t>
+            </w:r>
+          </w:p>
+        </w:tc>
+        <w:tc>
+          <w:tcPr>
+            <w:tcW w:type="dxa" w:w="2880"/>
+          </w:tcPr>
+          <w:p>
+            <w:pPr>
+              <w:bidi w:val="1"/>
+              <w:jc w:val="right"/>
+            </w:pPr>
+            <w:r>
+              <w:rPr>
+                <w:rFonts w:ascii="Consolas" w:hAnsi="Consolas"/>
+                <w:b w:val="0"/>
+                <w:color w:val="B02A37"/>
+                <w:sz w:val="20"/>
+                <w:rtl w:val="1"/>
+                <w:rFonts w:cs="Consolas"/>
+              </w:rPr>
+              <w:t>metrics-db</w:t>
+            </w:r>
+            <w:r>
+              <w:rPr>
+                <w:rFonts w:ascii="Arial" w:hAnsi="Arial"/>
+                <w:b w:val="0"/>
+                <w:sz w:val="20"/>
+                <w:rtl w:val="1"/>
+                <w:rFonts w:cs="Arial"/>
+              </w:rPr>
+              <w:t xml:space="preserve"> מטפל ב-kpi/gauge/line/bar; funnel/table עדיין demo</w:t>
+            </w:r>
+          </w:p>
+        </w:tc>
+      </w:tr>
+      <w:tr>
+        <w:tc>
+          <w:tcPr>
+            <w:tcW w:type="dxa" w:w="2880"/>
+          </w:tcPr>
+          <w:p>
+            <w:pPr>
+              <w:bidi w:val="1"/>
+              <w:jc w:val="right"/>
+            </w:pPr>
+            <w:r>
+              <w:rPr>
+                <w:rFonts w:ascii="Arial" w:hAnsi="Arial"/>
+                <w:b/>
+                <w:sz w:val="20"/>
+                <w:rtl w:val="1"/>
+                <w:rFonts w:cs="Arial"/>
+              </w:rPr>
+              <w:t>HR / מוניטין</w:t>
+            </w:r>
+          </w:p>
+        </w:tc>
+        <w:tc>
+          <w:tcPr>
+            <w:tcW w:type="dxa" w:w="2880"/>
+          </w:tcPr>
+          <w:p>
+            <w:pPr>
+              <w:bidi w:val="1"/>
+              <w:jc w:val="right"/>
+            </w:pPr>
+            <w:r>
+              <w:rPr>
+                <w:rFonts w:ascii="Arial" w:hAnsi="Arial"/>
+                <w:b w:val="0"/>
+                <w:sz w:val="20"/>
+                <w:rtl w:val="1"/>
+                <w:rFonts w:cs="Arial"/>
+              </w:rPr>
+              <w:t>נבנה מאפס (אין OSS)</w:t>
+            </w:r>
+          </w:p>
+        </w:tc>
+        <w:tc>
+          <w:tcPr>
+            <w:tcW w:type="dxa" w:w="2880"/>
+          </w:tcPr>
+          <w:p>
+            <w:pPr>
+              <w:bidi w:val="1"/>
+              <w:jc w:val="right"/>
+            </w:pPr>
+            <w:r>
+              <w:rPr>
+                <w:rFonts w:ascii="Arial" w:hAnsi="Arial"/>
+                <w:b w:val="0"/>
+                <w:sz w:val="20"/>
+                <w:rtl w:val="1"/>
+                <w:rFonts w:cs="Arial"/>
+              </w:rPr>
+              <w:t>HR: ATS+PLUG · מוניטין: מנוע Claude sentiment (HELIX Shield)</w:t>
+            </w:r>
+          </w:p>
+        </w:tc>
+      </w:tr>
+      <w:tr>
+        <w:tc>
+          <w:tcPr>
+            <w:tcW w:type="dxa" w:w="2880"/>
+          </w:tcPr>
+          <w:p>
+            <w:pPr>
+              <w:bidi w:val="1"/>
+              <w:jc w:val="right"/>
+            </w:pPr>
+            <w:r>
+              <w:rPr>
+                <w:rFonts w:ascii="Arial" w:hAnsi="Arial"/>
+                <w:b/>
+                <w:sz w:val="20"/>
+                <w:rtl w:val="1"/>
+                <w:rFonts w:cs="Arial"/>
+              </w:rPr>
+              <w:t>Executive aggregation (moat)</w:t>
+            </w:r>
+          </w:p>
+        </w:tc>
+        <w:tc>
+          <w:tcPr>
+            <w:tcW w:type="dxa" w:w="2880"/>
+          </w:tcPr>
+          <w:p>
+            <w:pPr>
+              <w:bidi w:val="1"/>
+              <w:jc w:val="right"/>
+            </w:pPr>
+            <w:r>
+              <w:rPr>
+                <w:rFonts w:ascii="Arial" w:hAnsi="Arial"/>
+                <w:b w:val="0"/>
+                <w:sz w:val="20"/>
+                <w:rtl w:val="1"/>
+                <w:rFonts w:cs="Arial"/>
+              </w:rPr>
+              <w:t>לא נבנה</w:t>
+            </w:r>
+          </w:p>
+        </w:tc>
+        <w:tc>
+          <w:tcPr>
+            <w:tcW w:type="dxa" w:w="2880"/>
+          </w:tcPr>
+          <w:p>
+            <w:pPr>
+              <w:bidi w:val="1"/>
+              <w:jc w:val="right"/>
+            </w:pPr>
+            <w:r>
+              <w:rPr>
+                <w:rFonts w:ascii="Arial" w:hAnsi="Arial"/>
+                <w:b w:val="0"/>
+                <w:sz w:val="20"/>
+                <w:rtl w:val="1"/>
+                <w:rFonts w:cs="Arial"/>
+              </w:rPr>
+              <w:t>שכבת אגרגציה חוצה-מחלקתית מ-</w:t>
+            </w:r>
+            <w:r>
+              <w:rPr>
+                <w:rFonts w:ascii="Consolas" w:hAnsi="Consolas"/>
+                <w:b w:val="0"/>
+                <w:color w:val="B02A37"/>
+                <w:sz w:val="20"/>
+                <w:rtl w:val="1"/>
+                <w:rFonts w:cs="Consolas"/>
+              </w:rPr>
+              <w:t>metric_points</w:t>
+            </w:r>
+            <w:r>
+              <w:rPr>
+                <w:rFonts w:ascii="Arial" w:hAnsi="Arial"/>
+                <w:b w:val="0"/>
+                <w:sz w:val="20"/>
+                <w:rtl w:val="1"/>
+                <w:rFonts w:cs="Arial"/>
+              </w:rPr>
+              <w:t xml:space="preserve"> של כל הדשבורדים</w:t>
+            </w:r>
+          </w:p>
+        </w:tc>
+      </w:tr>
+      <w:tr>
+        <w:tc>
+          <w:tcPr>
+            <w:tcW w:type="dxa" w:w="2880"/>
+          </w:tcPr>
+          <w:p>
+            <w:pPr>
+              <w:bidi w:val="1"/>
+              <w:jc w:val="right"/>
+            </w:pPr>
+            <w:r>
+              <w:rPr>
+                <w:rFonts w:ascii="Arial" w:hAnsi="Arial"/>
+                <w:b/>
+                <w:sz w:val="20"/>
+                <w:rtl w:val="1"/>
+                <w:rFonts w:cs="Arial"/>
+              </w:rPr>
+              <w:t>הקשחת אבטחה מלאה</w:t>
+            </w:r>
+          </w:p>
+        </w:tc>
+        <w:tc>
+          <w:tcPr>
+            <w:tcW w:type="dxa" w:w="2880"/>
+          </w:tcPr>
+          <w:p>
+            <w:pPr>
+              <w:bidi w:val="1"/>
+              <w:jc w:val="right"/>
+            </w:pPr>
+            <w:r>
+              <w:rPr>
+                <w:rFonts w:ascii="Arial" w:hAnsi="Arial"/>
+                <w:b w:val="0"/>
+                <w:sz w:val="20"/>
+                <w:rtl w:val="1"/>
+                <w:rFonts w:cs="Arial"/>
+              </w:rPr>
+              <w:t>חלקי (AES)</w:t>
+            </w:r>
+          </w:p>
+        </w:tc>
+        <w:tc>
+          <w:tcPr>
+            <w:tcW w:type="dxa" w:w="2880"/>
+          </w:tcPr>
+          <w:p>
+            <w:pPr>
+              <w:bidi w:val="1"/>
+              <w:jc w:val="right"/>
+            </w:pPr>
+            <w:r>
+              <w:rPr>
+                <w:rFonts w:ascii="Arial" w:hAnsi="Arial"/>
+                <w:b w:val="0"/>
+                <w:sz w:val="20"/>
+                <w:rtl w:val="1"/>
+                <w:rFonts w:cs="Arial"/>
+              </w:rPr>
+              <w:t>מעבר מ-</w:t>
+            </w:r>
+            <w:r>
+              <w:rPr>
+                <w:rFonts w:ascii="Consolas" w:hAnsi="Consolas"/>
+                <w:b w:val="0"/>
+                <w:color w:val="B02A37"/>
+                <w:sz w:val="20"/>
+                <w:rtl w:val="1"/>
+                <w:rFonts w:cs="Consolas"/>
+              </w:rPr>
+              <w:t>connections.config</w:t>
+            </w:r>
+            <w:r>
+              <w:rPr>
+                <w:rFonts w:ascii="Arial" w:hAnsi="Arial"/>
+                <w:b w:val="0"/>
+                <w:sz w:val="20"/>
+                <w:rtl w:val="1"/>
+                <w:rFonts w:cs="Arial"/>
+              </w:rPr>
+              <w:t xml:space="preserve"> ל-Supabase Vault ל-production</w:t>
+            </w:r>
+          </w:p>
+        </w:tc>
+      </w:tr>
+      <w:tr>
+        <w:tc>
+          <w:tcPr>
+            <w:tcW w:type="dxa" w:w="2880"/>
+          </w:tcPr>
+          <w:p>
+            <w:pPr>
+              <w:bidi w:val="1"/>
+              <w:jc w:val="right"/>
+            </w:pPr>
+            <w:r>
+              <w:rPr>
+                <w:rFonts w:ascii="Arial" w:hAnsi="Arial"/>
+                <w:b/>
+                <w:sz w:val="20"/>
+                <w:rtl w:val="1"/>
+                <w:rFonts w:cs="Arial"/>
+              </w:rPr>
+              <w:t>Tremor polish</w:t>
+            </w:r>
+          </w:p>
+        </w:tc>
+        <w:tc>
+          <w:tcPr>
+            <w:tcW w:type="dxa" w:w="2880"/>
+          </w:tcPr>
+          <w:p>
+            <w:pPr>
+              <w:bidi w:val="1"/>
+              <w:jc w:val="right"/>
+            </w:pPr>
+            <w:r>
+              <w:rPr>
+                <w:rFonts w:ascii="Arial" w:hAnsi="Arial"/>
+                <w:b w:val="0"/>
+                <w:sz w:val="20"/>
+                <w:rtl w:val="1"/>
+                <w:rFonts w:cs="Arial"/>
+              </w:rPr>
+              <w:t>לא אומץ</w:t>
+            </w:r>
+          </w:p>
+        </w:tc>
+        <w:tc>
+          <w:tcPr>
+            <w:tcW w:type="dxa" w:w="2880"/>
+          </w:tcPr>
+          <w:p>
+            <w:pPr>
+              <w:bidi w:val="1"/>
+              <w:jc w:val="right"/>
+            </w:pPr>
+            <w:r>
+              <w:rPr>
+                <w:rFonts w:ascii="Arial" w:hAnsi="Arial"/>
+                <w:b w:val="0"/>
+                <w:sz w:val="20"/>
+                <w:rtl w:val="1"/>
+                <w:rFonts w:cs="Arial"/>
+              </w:rPr>
+              <w:t>נשמר עצמאי (recharts) להימנע מקונפליקט Tailwind v4; אפשר לאמץ בהמשך</w:t>
+            </w:r>
+          </w:p>
+        </w:tc>
+      </w:tr>
+    </w:tbl>
+    <w:p>
+      <w:pPr>
+        <w:bidi w:val="1"/>
+        <w:jc w:val="right"/>
+      </w:pPr>
+      <w:r>
+        <w:rPr>
+          <w:rFonts w:ascii="Arial" w:hAnsi="Arial"/>
+          <w:b/>
+          <w:sz w:val="22"/>
+          <w:rtl w:val="1"/>
+          <w:rFonts w:cs="Arial"/>
+        </w:rPr>
+        <w:t>המצב:</w:t>
+      </w:r>
+      <w:r>
+        <w:rPr>
+          <w:rFonts w:ascii="Arial" w:hAnsi="Arial"/>
+          <w:b w:val="0"/>
+          <w:sz w:val="22"/>
+          <w:rtl w:val="1"/>
+          <w:rFonts w:cs="Arial"/>
+        </w:rPr>
+        <w:t xml:space="preserve"> הליבה — </w:t>
+      </w:r>
+      <w:r>
+        <w:rPr>
+          <w:rFonts w:ascii="Arial" w:hAnsi="Arial"/>
+          <w:b/>
+          <w:sz w:val="22"/>
+          <w:rtl w:val="1"/>
+          <w:rFonts w:cs="Arial"/>
+        </w:rPr>
+        <w:t>מנוע widgets + drag-drop + 3-ways-builder + verticals + auth/persist + 4 connectors חיים + Ollama/בוט + digest מתוזמן + sales pipeline</w:t>
+      </w:r>
+      <w:r>
+        <w:rPr>
+          <w:rFonts w:ascii="Arial" w:hAnsi="Arial"/>
+          <w:b w:val="0"/>
+          <w:sz w:val="22"/>
+          <w:rtl w:val="1"/>
+          <w:rFonts w:cs="Arial"/>
+        </w:rPr>
+        <w:t xml:space="preserve"> — נבנתה end-to-end. מה שנשאר בעיקר: </w:t>
+      </w:r>
+      <w:r>
+        <w:rPr>
+          <w:rFonts w:ascii="Arial" w:hAnsi="Arial"/>
+          <w:b/>
+          <w:sz w:val="22"/>
+          <w:rtl w:val="1"/>
+          <w:rFonts w:cs="Arial"/>
+        </w:rPr>
+        <w:t>connectors נוספים (Nango/הנהח״ש ישראלי), Executive aggregation, והרצה live</w:t>
+      </w:r>
+      <w:r>
+        <w:rPr>
+          <w:rFonts w:ascii="Arial" w:hAnsi="Arial"/>
+          <w:b w:val="0"/>
+          <w:sz w:val="22"/>
+          <w:rtl w:val="1"/>
+          <w:rFonts w:cs="Arial"/>
+        </w:rPr>
+        <w:t>.</w:t>
+      </w:r>
+    </w:p>
+    <w:p>
+      <w:pPr>
         <w:bidi w:val="1"/>
         <w:jc w:val="right"/>
       </w:pPr>

</xml_diff>

<commit_message>
docs(dashboards): update §12 — 6 live connectors (+Plausible/Mailchimp) + repos-utilization matrix
Co-Authored-By: Claude Opus 4.8 (1M context) <noreply@anthropic.com>
</commit_message>
<xml_diff>
--- a/PRODUCTS/02-roi-reporting-engine.docx
+++ b/PRODUCTS/02-roi-reporting-engine.docx
@@ -8050,7 +8050,7 @@
                 <w:rtl w:val="1"/>
                 <w:rFonts w:cs="Arial"/>
               </w:rPr>
-              <w:t>Connectors (חיים)</w:t>
+              <w:t>Connectors (חיים, 6)</w:t>
             </w:r>
             <w:r>
               <w:rPr>
@@ -8060,7 +8060,27 @@
                 <w:rtl w:val="1"/>
                 <w:rFonts w:cs="Arial"/>
               </w:rPr>
-              <w:t xml:space="preserve"> — GA4 (OAuth) · Meta Ads · Stripe · Shopify → </w:t>
+              <w:t xml:space="preserve"> — GA4 (OAuth) · Meta Ads · Stripe · Shopify · </w:t>
+            </w:r>
+            <w:r>
+              <w:rPr>
+                <w:rFonts w:ascii="Arial" w:hAnsi="Arial"/>
+                <w:b/>
+                <w:sz w:val="20"/>
+                <w:rtl w:val="1"/>
+                <w:rFonts w:cs="Arial"/>
+              </w:rPr>
+              <w:t>Plausible · Mailchimp</w:t>
+            </w:r>
+            <w:r>
+              <w:rPr>
+                <w:rFonts w:ascii="Arial" w:hAnsi="Arial"/>
+                <w:b w:val="0"/>
+                <w:sz w:val="20"/>
+                <w:rtl w:val="1"/>
+                <w:rFonts w:cs="Arial"/>
+              </w:rPr>
+              <w:t xml:space="preserve"> → </w:t>
             </w:r>
             <w:r>
               <w:rPr>
@@ -8093,7 +8113,7 @@
                 <w:rtl w:val="1"/>
                 <w:rFonts w:cs="Consolas"/>
               </w:rPr>
-              <w:t>lib/connectors/{ga4,meta,stripe,shopify,registry}</w:t>
+              <w:t>lib/connectors/{ga4,meta,stripe,shopify,plausible,mailchimp,registry}</w:t>
             </w:r>
             <w:r>
               <w:rPr>
@@ -9376,7 +9396,27 @@
                 <w:rtl w:val="1"/>
                 <w:rFonts w:cs="Arial"/>
               </w:rPr>
-              <w:t>כרגע אמיתי: GA4 (sessions/conversions), Stripe (revenue/mrr), Shopify (sales/aov), Meta (spend), deals (pipeline/win-rate). השאר — demo עד ה-connector שלו</w:t>
+              <w:t xml:space="preserve">כרגע אמיתי: GA4 (sessions/conversions), </w:t>
+            </w:r>
+            <w:r>
+              <w:rPr>
+                <w:rFonts w:ascii="Arial" w:hAnsi="Arial"/>
+                <w:b/>
+                <w:sz w:val="20"/>
+                <w:rtl w:val="1"/>
+                <w:rFonts w:cs="Arial"/>
+              </w:rPr>
+              <w:t>Plausible (visitors/pageviews), Mailchimp (subscribers)</w:t>
+            </w:r>
+            <w:r>
+              <w:rPr>
+                <w:rFonts w:ascii="Arial" w:hAnsi="Arial"/>
+                <w:b w:val="0"/>
+                <w:sz w:val="20"/>
+                <w:rtl w:val="1"/>
+                <w:rFonts w:cs="Arial"/>
+              </w:rPr>
+              <w:t>, Stripe (revenue/mrr), Shopify (sales/aov), Meta (spend), deals (pipeline/win-rate). השאר — demo עד ה-connector שלו</w:t>
             </w:r>
           </w:p>
         </w:tc>
@@ -9793,7 +9833,7 @@
           <w:rtl w:val="1"/>
           <w:rFonts w:cs="Arial"/>
         </w:rPr>
-        <w:t>מנוע widgets + drag-drop + 3-ways-builder + verticals + auth/persist + 4 connectors חיים + Ollama/בוט + digest מתוזמן + sales pipeline</w:t>
+        <w:t>מנוע widgets + drag-drop + 3-ways-builder + verticals + auth/persist + 6 connectors חיים + Ollama/בוט + digest מתוזמן + sales pipeline</w:t>
       </w:r>
       <w:r>
         <w:rPr>
@@ -9824,6 +9864,954 @@
           <w:rFonts w:cs="Arial"/>
         </w:rPr>
         <w:t>.</w:t>
+      </w:r>
+    </w:p>
+    <w:p>
+      <w:pPr>
+        <w:pStyle w:val="Heading3"/>
+        <w:bidi w:val="1"/>
+        <w:jc w:val="right"/>
+      </w:pPr>
+      <w:r>
+        <w:rPr>
+          <w:rFonts w:ascii="Arial" w:hAnsi="Arial"/>
+          <w:b w:val="0"/>
+          <w:sz w:val="24"/>
+          <w:rtl w:val="1"/>
+          <w:rFonts w:cs="Arial"/>
+        </w:rPr>
+        <w:t>12.1 מטריצת ניצול הגיטים שנסקרו (שקיפות)</w:t>
+      </w:r>
+    </w:p>
+    <w:p>
+      <w:pPr>
+        <w:bidi w:val="1"/>
+        <w:jc w:val="right"/>
+      </w:pPr>
+      <w:r>
+        <w:rPr>
+          <w:rFonts w:ascii="Arial" w:hAnsi="Arial"/>
+          <w:b w:val="0"/>
+          <w:sz w:val="22"/>
+          <w:rtl w:val="1"/>
+          <w:rFonts w:cs="Arial"/>
+        </w:rPr>
+        <w:t>מ-13 הגיטים ששמרנו — מה נוצל בפועל ולמה:</w:t>
+      </w:r>
+    </w:p>
+    <w:tbl>
+      <w:tblPr>
+        <w:tblStyle w:val="LightGrid-Accent1"/>
+        <w:tblW w:type="auto" w:w="0"/>
+        <w:tblLook w:firstColumn="1" w:firstRow="1" w:lastColumn="0" w:lastRow="0" w:noHBand="0" w:noVBand="1" w:val="04A0"/>
+        <w:bidiVisual/>
+      </w:tblPr>
+      <w:tblGrid>
+        <w:gridCol w:w="2880"/>
+        <w:gridCol w:w="2880"/>
+        <w:gridCol w:w="2880"/>
+      </w:tblGrid>
+      <w:tr>
+        <w:tc>
+          <w:tcPr>
+            <w:tcW w:type="dxa" w:w="2880"/>
+          </w:tcPr>
+          <w:p>
+            <w:pPr>
+              <w:bidi w:val="1"/>
+              <w:jc w:val="right"/>
+            </w:pPr>
+            <w:r>
+              <w:rPr>
+                <w:rFonts w:ascii="Arial" w:hAnsi="Arial"/>
+                <w:b/>
+                <w:sz w:val="20"/>
+                <w:rtl w:val="1"/>
+                <w:rFonts w:cs="Arial"/>
+              </w:rPr>
+              <w:t>ריפו</w:t>
+            </w:r>
+          </w:p>
+        </w:tc>
+        <w:tc>
+          <w:tcPr>
+            <w:tcW w:type="dxa" w:w="2880"/>
+          </w:tcPr>
+          <w:p>
+            <w:pPr>
+              <w:bidi w:val="1"/>
+              <w:jc w:val="right"/>
+            </w:pPr>
+            <w:r>
+              <w:rPr>
+                <w:rFonts w:ascii="Arial" w:hAnsi="Arial"/>
+                <w:b/>
+                <w:sz w:val="20"/>
+                <w:rtl w:val="1"/>
+                <w:rFonts w:cs="Arial"/>
+              </w:rPr>
+              <w:t>רישיון</w:t>
+            </w:r>
+          </w:p>
+        </w:tc>
+        <w:tc>
+          <w:tcPr>
+            <w:tcW w:type="dxa" w:w="2880"/>
+          </w:tcPr>
+          <w:p>
+            <w:pPr>
+              <w:bidi w:val="1"/>
+              <w:jc w:val="right"/>
+            </w:pPr>
+            <w:r>
+              <w:rPr>
+                <w:rFonts w:ascii="Arial" w:hAnsi="Arial"/>
+                <w:b/>
+                <w:sz w:val="20"/>
+                <w:rtl w:val="1"/>
+                <w:rFonts w:cs="Arial"/>
+              </w:rPr>
+              <w:t>ניצול</w:t>
+            </w:r>
+          </w:p>
+        </w:tc>
+      </w:tr>
+      <w:tr>
+        <w:tc>
+          <w:tcPr>
+            <w:tcW w:type="dxa" w:w="2880"/>
+          </w:tcPr>
+          <w:p>
+            <w:pPr>
+              <w:bidi w:val="1"/>
+              <w:jc w:val="right"/>
+            </w:pPr>
+            <w:r>
+              <w:rPr>
+                <w:rFonts w:ascii="Arial" w:hAnsi="Arial"/>
+                <w:b/>
+                <w:sz w:val="20"/>
+                <w:rtl w:val="1"/>
+                <w:rFonts w:cs="Arial"/>
+              </w:rPr>
+              <w:t>claude-coach-kit</w:t>
+            </w:r>
+          </w:p>
+        </w:tc>
+        <w:tc>
+          <w:tcPr>
+            <w:tcW w:type="dxa" w:w="2880"/>
+          </w:tcPr>
+          <w:p>
+            <w:pPr>
+              <w:bidi w:val="1"/>
+              <w:jc w:val="right"/>
+            </w:pPr>
+            <w:r>
+              <w:rPr>
+                <w:rFonts w:ascii="Arial" w:hAnsi="Arial"/>
+                <w:b w:val="0"/>
+                <w:sz w:val="20"/>
+                <w:rtl w:val="1"/>
+                <w:rFonts w:cs="Arial"/>
+              </w:rPr>
+              <w:t>MIT</w:t>
+            </w:r>
+          </w:p>
+        </w:tc>
+        <w:tc>
+          <w:tcPr>
+            <w:tcW w:type="dxa" w:w="2880"/>
+          </w:tcPr>
+          <w:p>
+            <w:pPr>
+              <w:bidi w:val="1"/>
+              <w:jc w:val="right"/>
+            </w:pPr>
+            <w:r>
+              <w:rPr>
+                <w:rFonts w:ascii="Arial" w:hAnsi="Arial"/>
+                <w:b w:val="0"/>
+                <w:sz w:val="20"/>
+                <w:rtl w:val="1"/>
+                <w:rFonts w:cs="Arial"/>
+              </w:rPr>
+              <w:t>✅ נקצר → מוצר 1 (UTM/email-sequences/payment)</w:t>
+            </w:r>
+          </w:p>
+        </w:tc>
+      </w:tr>
+      <w:tr>
+        <w:tc>
+          <w:tcPr>
+            <w:tcW w:type="dxa" w:w="2880"/>
+          </w:tcPr>
+          <w:p>
+            <w:pPr>
+              <w:bidi w:val="1"/>
+              <w:jc w:val="right"/>
+            </w:pPr>
+            <w:r>
+              <w:rPr>
+                <w:rFonts w:ascii="Arial" w:hAnsi="Arial"/>
+                <w:b/>
+                <w:sz w:val="20"/>
+                <w:rtl w:val="1"/>
+                <w:rFonts w:cs="Arial"/>
+              </w:rPr>
+              <w:t>marketing-cli</w:t>
+            </w:r>
+          </w:p>
+        </w:tc>
+        <w:tc>
+          <w:tcPr>
+            <w:tcW w:type="dxa" w:w="2880"/>
+          </w:tcPr>
+          <w:p>
+            <w:pPr>
+              <w:bidi w:val="1"/>
+              <w:jc w:val="right"/>
+            </w:pPr>
+            <w:r>
+              <w:rPr>
+                <w:rFonts w:ascii="Arial" w:hAnsi="Arial"/>
+                <w:b w:val="0"/>
+                <w:sz w:val="20"/>
+                <w:rtl w:val="1"/>
+                <w:rFonts w:cs="Arial"/>
+              </w:rPr>
+              <w:t>MIT</w:t>
+            </w:r>
+          </w:p>
+        </w:tc>
+        <w:tc>
+          <w:tcPr>
+            <w:tcW w:type="dxa" w:w="2880"/>
+          </w:tcPr>
+          <w:p>
+            <w:pPr>
+              <w:bidi w:val="1"/>
+              <w:jc w:val="right"/>
+            </w:pPr>
+            <w:r>
+              <w:rPr>
+                <w:rFonts w:ascii="Arial" w:hAnsi="Arial"/>
+                <w:b w:val="0"/>
+                <w:sz w:val="20"/>
+                <w:rtl w:val="1"/>
+                <w:rFonts w:cs="Arial"/>
+              </w:rPr>
+              <w:t>✅ נקצר → 64 skills (מוצרים 1/3/6)</w:t>
+            </w:r>
+          </w:p>
+        </w:tc>
+      </w:tr>
+      <w:tr>
+        <w:tc>
+          <w:tcPr>
+            <w:tcW w:type="dxa" w:w="2880"/>
+          </w:tcPr>
+          <w:p>
+            <w:pPr>
+              <w:bidi w:val="1"/>
+              <w:jc w:val="right"/>
+            </w:pPr>
+            <w:r>
+              <w:rPr>
+                <w:rFonts w:ascii="Arial" w:hAnsi="Arial"/>
+                <w:b/>
+                <w:sz w:val="20"/>
+                <w:rtl w:val="1"/>
+                <w:rFonts w:cs="Arial"/>
+              </w:rPr>
+              <w:t>geo-aeo-tracker</w:t>
+            </w:r>
+          </w:p>
+        </w:tc>
+        <w:tc>
+          <w:tcPr>
+            <w:tcW w:type="dxa" w:w="2880"/>
+          </w:tcPr>
+          <w:p>
+            <w:pPr>
+              <w:bidi w:val="1"/>
+              <w:jc w:val="right"/>
+            </w:pPr>
+            <w:r>
+              <w:rPr>
+                <w:rFonts w:ascii="Arial" w:hAnsi="Arial"/>
+                <w:b w:val="0"/>
+                <w:sz w:val="20"/>
+                <w:rtl w:val="1"/>
+                <w:rFonts w:cs="Arial"/>
+              </w:rPr>
+              <w:t>MIT</w:t>
+            </w:r>
+          </w:p>
+        </w:tc>
+        <w:tc>
+          <w:tcPr>
+            <w:tcW w:type="dxa" w:w="2880"/>
+          </w:tcPr>
+          <w:p>
+            <w:pPr>
+              <w:bidi w:val="1"/>
+              <w:jc w:val="right"/>
+            </w:pPr>
+            <w:r>
+              <w:rPr>
+                <w:rFonts w:ascii="Arial" w:hAnsi="Arial"/>
+                <w:b w:val="0"/>
+                <w:sz w:val="20"/>
+                <w:rtl w:val="1"/>
+                <w:rFonts w:cs="Arial"/>
+              </w:rPr>
+              <w:t>✅ נקצר → מוצר 4 (BrightData + AEO Audit)</w:t>
+            </w:r>
+          </w:p>
+        </w:tc>
+      </w:tr>
+      <w:tr>
+        <w:tc>
+          <w:tcPr>
+            <w:tcW w:type="dxa" w:w="2880"/>
+          </w:tcPr>
+          <w:p>
+            <w:pPr>
+              <w:bidi w:val="1"/>
+              <w:jc w:val="right"/>
+            </w:pPr>
+            <w:r>
+              <w:rPr>
+                <w:rFonts w:ascii="Arial" w:hAnsi="Arial"/>
+                <w:b/>
+                <w:sz w:val="20"/>
+                <w:rtl w:val="1"/>
+                <w:rFonts w:cs="Arial"/>
+              </w:rPr>
+              <w:t>builderz marketing-dashboard</w:t>
+            </w:r>
+          </w:p>
+        </w:tc>
+        <w:tc>
+          <w:tcPr>
+            <w:tcW w:type="dxa" w:w="2880"/>
+          </w:tcPr>
+          <w:p>
+            <w:pPr>
+              <w:bidi w:val="1"/>
+              <w:jc w:val="right"/>
+            </w:pPr>
+            <w:r>
+              <w:rPr>
+                <w:rFonts w:ascii="Arial" w:hAnsi="Arial"/>
+                <w:b w:val="0"/>
+                <w:sz w:val="20"/>
+                <w:rtl w:val="1"/>
+                <w:rFonts w:cs="Arial"/>
+              </w:rPr>
+              <w:t>MIT</w:t>
+            </w:r>
+          </w:p>
+        </w:tc>
+        <w:tc>
+          <w:tcPr>
+            <w:tcW w:type="dxa" w:w="2880"/>
+          </w:tcPr>
+          <w:p>
+            <w:pPr>
+              <w:bidi w:val="1"/>
+              <w:jc w:val="right"/>
+            </w:pPr>
+            <w:r>
+              <w:rPr>
+                <w:rFonts w:ascii="Arial" w:hAnsi="Arial"/>
+                <w:b w:val="0"/>
+                <w:sz w:val="20"/>
+                <w:rtl w:val="1"/>
+                <w:rFonts w:cs="Arial"/>
+              </w:rPr>
+              <w:t xml:space="preserve">✅ נקצר → </w:t>
+            </w:r>
+            <w:r>
+              <w:rPr>
+                <w:rFonts w:ascii="Arial" w:hAnsi="Arial"/>
+                <w:b/>
+                <w:sz w:val="20"/>
+                <w:rtl w:val="1"/>
+                <w:rFonts w:cs="Arial"/>
+              </w:rPr>
+              <w:t>Plausible + Mailchimp connectors</w:t>
+            </w:r>
+            <w:r>
+              <w:rPr>
+                <w:rFonts w:ascii="Arial" w:hAnsi="Arial"/>
+                <w:b w:val="0"/>
+                <w:sz w:val="20"/>
+                <w:rtl w:val="1"/>
+                <w:rFonts w:cs="Arial"/>
+              </w:rPr>
+              <w:t xml:space="preserve"> (helix-dashboards)</w:t>
+            </w:r>
+          </w:p>
+        </w:tc>
+      </w:tr>
+      <w:tr>
+        <w:tc>
+          <w:tcPr>
+            <w:tcW w:type="dxa" w:w="2880"/>
+          </w:tcPr>
+          <w:p>
+            <w:pPr>
+              <w:bidi w:val="1"/>
+              <w:jc w:val="right"/>
+            </w:pPr>
+            <w:r>
+              <w:rPr>
+                <w:rFonts w:ascii="Arial" w:hAnsi="Arial"/>
+                <w:b/>
+                <w:sz w:val="20"/>
+                <w:rtl w:val="1"/>
+                <w:rFonts w:cs="Arial"/>
+              </w:rPr>
+              <w:t>startup-metrics-dashboard</w:t>
+            </w:r>
+          </w:p>
+        </w:tc>
+        <w:tc>
+          <w:tcPr>
+            <w:tcW w:type="dxa" w:w="2880"/>
+          </w:tcPr>
+          <w:p>
+            <w:pPr>
+              <w:bidi w:val="1"/>
+              <w:jc w:val="right"/>
+            </w:pPr>
+            <w:r>
+              <w:rPr>
+                <w:rFonts w:ascii="Arial" w:hAnsi="Arial"/>
+                <w:b w:val="0"/>
+                <w:sz w:val="20"/>
+                <w:rtl w:val="1"/>
+                <w:rFonts w:cs="Arial"/>
+              </w:rPr>
+              <w:t>—</w:t>
+            </w:r>
+          </w:p>
+        </w:tc>
+        <w:tc>
+          <w:tcPr>
+            <w:tcW w:type="dxa" w:w="2880"/>
+          </w:tcPr>
+          <w:p>
+            <w:pPr>
+              <w:bidi w:val="1"/>
+              <w:jc w:val="right"/>
+            </w:pPr>
+            <w:r>
+              <w:rPr>
+                <w:rFonts w:ascii="Arial" w:hAnsi="Arial"/>
+                <w:b w:val="0"/>
+                <w:sz w:val="20"/>
+                <w:rtl w:val="1"/>
+                <w:rFonts w:cs="Arial"/>
+              </w:rPr>
+              <w:t>✅ רעיון → template Startup/AARRR</w:t>
+            </w:r>
+          </w:p>
+        </w:tc>
+      </w:tr>
+      <w:tr>
+        <w:tc>
+          <w:tcPr>
+            <w:tcW w:type="dxa" w:w="2880"/>
+          </w:tcPr>
+          <w:p>
+            <w:pPr>
+              <w:bidi w:val="1"/>
+              <w:jc w:val="right"/>
+            </w:pPr>
+            <w:r>
+              <w:rPr>
+                <w:rFonts w:ascii="Arial" w:hAnsi="Arial"/>
+                <w:b/>
+                <w:sz w:val="20"/>
+                <w:rtl w:val="1"/>
+                <w:rFonts w:cs="Arial"/>
+              </w:rPr>
+              <w:t>appsmith</w:t>
+            </w:r>
+          </w:p>
+        </w:tc>
+        <w:tc>
+          <w:tcPr>
+            <w:tcW w:type="dxa" w:w="2880"/>
+          </w:tcPr>
+          <w:p>
+            <w:pPr>
+              <w:bidi w:val="1"/>
+              <w:jc w:val="right"/>
+            </w:pPr>
+            <w:r>
+              <w:rPr>
+                <w:rFonts w:ascii="Arial" w:hAnsi="Arial"/>
+                <w:b w:val="0"/>
+                <w:sz w:val="20"/>
+                <w:rtl w:val="1"/>
+                <w:rFonts w:cs="Arial"/>
+              </w:rPr>
+              <w:t>Apache</w:t>
+            </w:r>
+          </w:p>
+        </w:tc>
+        <w:tc>
+          <w:tcPr>
+            <w:tcW w:type="dxa" w:w="2880"/>
+          </w:tcPr>
+          <w:p>
+            <w:pPr>
+              <w:bidi w:val="1"/>
+              <w:jc w:val="right"/>
+            </w:pPr>
+            <w:r>
+              <w:rPr>
+                <w:rFonts w:ascii="Arial" w:hAnsi="Arial"/>
+                <w:b w:val="0"/>
+                <w:sz w:val="20"/>
+                <w:rtl w:val="1"/>
+                <w:rFonts w:cs="Arial"/>
+              </w:rPr>
+              <w:t>🟡 רפרנס-ארכיטקטורה (drag-drop+connectors) — מומש עם react-grid-layout+registry</w:t>
+            </w:r>
+          </w:p>
+        </w:tc>
+      </w:tr>
+      <w:tr>
+        <w:tc>
+          <w:tcPr>
+            <w:tcW w:type="dxa" w:w="2880"/>
+          </w:tcPr>
+          <w:p>
+            <w:pPr>
+              <w:bidi w:val="1"/>
+              <w:jc w:val="right"/>
+            </w:pPr>
+            <w:r>
+              <w:rPr>
+                <w:rFonts w:ascii="Arial" w:hAnsi="Arial"/>
+                <w:b/>
+                <w:sz w:val="20"/>
+                <w:rtl w:val="1"/>
+                <w:rFonts w:cs="Arial"/>
+              </w:rPr>
+              <w:t>redash</w:t>
+            </w:r>
+          </w:p>
+        </w:tc>
+        <w:tc>
+          <w:tcPr>
+            <w:tcW w:type="dxa" w:w="2880"/>
+          </w:tcPr>
+          <w:p>
+            <w:pPr>
+              <w:bidi w:val="1"/>
+              <w:jc w:val="right"/>
+            </w:pPr>
+            <w:r>
+              <w:rPr>
+                <w:rFonts w:ascii="Arial" w:hAnsi="Arial"/>
+                <w:b w:val="0"/>
+                <w:sz w:val="20"/>
+                <w:rtl w:val="1"/>
+                <w:rFonts w:cs="Arial"/>
+              </w:rPr>
+              <w:t>BSD</w:t>
+            </w:r>
+          </w:p>
+        </w:tc>
+        <w:tc>
+          <w:tcPr>
+            <w:tcW w:type="dxa" w:w="2880"/>
+          </w:tcPr>
+          <w:p>
+            <w:pPr>
+              <w:bidi w:val="1"/>
+              <w:jc w:val="right"/>
+            </w:pPr>
+            <w:r>
+              <w:rPr>
+                <w:rFonts w:ascii="Arial" w:hAnsi="Arial"/>
+                <w:b w:val="0"/>
+                <w:sz w:val="20"/>
+                <w:rtl w:val="1"/>
+                <w:rFonts w:cs="Arial"/>
+              </w:rPr>
+              <w:t>🟡 רפרנס — מודל data-source→viz מומש כ-</w:t>
+            </w:r>
+            <w:r>
+              <w:rPr>
+                <w:rFonts w:ascii="Consolas" w:hAnsi="Consolas"/>
+                <w:b w:val="0"/>
+                <w:color w:val="B02A37"/>
+                <w:sz w:val="20"/>
+                <w:rtl w:val="1"/>
+                <w:rFonts w:cs="Consolas"/>
+              </w:rPr>
+              <w:t>metric_points</w:t>
+            </w:r>
+          </w:p>
+        </w:tc>
+      </w:tr>
+      <w:tr>
+        <w:tc>
+          <w:tcPr>
+            <w:tcW w:type="dxa" w:w="2880"/>
+          </w:tcPr>
+          <w:p>
+            <w:pPr>
+              <w:bidi w:val="1"/>
+              <w:jc w:val="right"/>
+            </w:pPr>
+            <w:r>
+              <w:rPr>
+                <w:rFonts w:ascii="Arial" w:hAnsi="Arial"/>
+                <w:b/>
+                <w:sz w:val="20"/>
+                <w:rtl w:val="1"/>
+                <w:rFonts w:cs="Arial"/>
+              </w:rPr>
+              <w:t>grafana · metabase</w:t>
+            </w:r>
+          </w:p>
+        </w:tc>
+        <w:tc>
+          <w:tcPr>
+            <w:tcW w:type="dxa" w:w="2880"/>
+          </w:tcPr>
+          <w:p>
+            <w:pPr>
+              <w:bidi w:val="1"/>
+              <w:jc w:val="right"/>
+            </w:pPr>
+            <w:r>
+              <w:rPr>
+                <w:rFonts w:ascii="Arial" w:hAnsi="Arial"/>
+                <w:b/>
+                <w:sz w:val="20"/>
+                <w:rtl w:val="1"/>
+                <w:rFonts w:cs="Arial"/>
+              </w:rPr>
+              <w:t>AGPL</w:t>
+            </w:r>
+          </w:p>
+        </w:tc>
+        <w:tc>
+          <w:tcPr>
+            <w:tcW w:type="dxa" w:w="2880"/>
+          </w:tcPr>
+          <w:p>
+            <w:pPr>
+              <w:bidi w:val="1"/>
+              <w:jc w:val="right"/>
+            </w:pPr>
+            <w:r>
+              <w:rPr>
+                <w:rFonts w:ascii="Arial" w:hAnsi="Arial"/>
+                <w:b w:val="0"/>
+                <w:sz w:val="20"/>
+                <w:rtl w:val="1"/>
+                <w:rFonts w:cs="Arial"/>
+              </w:rPr>
+              <w:t>❌ רפרנס-מוצר בלבד — רישוי חוסם קוד מסחרי</w:t>
+            </w:r>
+          </w:p>
+        </w:tc>
+      </w:tr>
+      <w:tr>
+        <w:tc>
+          <w:tcPr>
+            <w:tcW w:type="dxa" w:w="2880"/>
+          </w:tcPr>
+          <w:p>
+            <w:pPr>
+              <w:bidi w:val="1"/>
+              <w:jc w:val="right"/>
+            </w:pPr>
+            <w:r>
+              <w:rPr>
+                <w:rFonts w:ascii="Arial" w:hAnsi="Arial"/>
+                <w:b/>
+                <w:sz w:val="20"/>
+                <w:rtl w:val="1"/>
+                <w:rFonts w:cs="Arial"/>
+              </w:rPr>
+              <w:t>refine</w:t>
+            </w:r>
+          </w:p>
+        </w:tc>
+        <w:tc>
+          <w:tcPr>
+            <w:tcW w:type="dxa" w:w="2880"/>
+          </w:tcPr>
+          <w:p>
+            <w:pPr>
+              <w:bidi w:val="1"/>
+              <w:jc w:val="right"/>
+            </w:pPr>
+            <w:r>
+              <w:rPr>
+                <w:rFonts w:ascii="Arial" w:hAnsi="Arial"/>
+                <w:b w:val="0"/>
+                <w:sz w:val="20"/>
+                <w:rtl w:val="1"/>
+                <w:rFonts w:cs="Arial"/>
+              </w:rPr>
+              <w:t>MIT</w:t>
+            </w:r>
+          </w:p>
+        </w:tc>
+        <w:tc>
+          <w:tcPr>
+            <w:tcW w:type="dxa" w:w="2880"/>
+          </w:tcPr>
+          <w:p>
+            <w:pPr>
+              <w:bidi w:val="1"/>
+              <w:jc w:val="right"/>
+            </w:pPr>
+            <w:r>
+              <w:rPr>
+                <w:rFonts w:ascii="Arial" w:hAnsi="Arial"/>
+                <w:b w:val="0"/>
+                <w:sz w:val="20"/>
+                <w:rtl w:val="1"/>
+                <w:rFonts w:cs="Arial"/>
+              </w:rPr>
+              <w:t>⚪ החלטה מודעת לא לבנות עליו (Next נקי, עקביות אקו-סיסטם)</w:t>
+            </w:r>
+          </w:p>
+        </w:tc>
+      </w:tr>
+      <w:tr>
+        <w:tc>
+          <w:tcPr>
+            <w:tcW w:type="dxa" w:w="2880"/>
+          </w:tcPr>
+          <w:p>
+            <w:pPr>
+              <w:bidi w:val="1"/>
+              <w:jc w:val="right"/>
+            </w:pPr>
+            <w:r>
+              <w:rPr>
+                <w:rFonts w:ascii="Arial" w:hAnsi="Arial"/>
+                <w:b/>
+                <w:sz w:val="20"/>
+                <w:rtl w:val="1"/>
+                <w:rFonts w:cs="Arial"/>
+              </w:rPr>
+              <w:t>danielbayerlein/dashboard</w:t>
+            </w:r>
+          </w:p>
+        </w:tc>
+        <w:tc>
+          <w:tcPr>
+            <w:tcW w:type="dxa" w:w="2880"/>
+          </w:tcPr>
+          <w:p>
+            <w:pPr>
+              <w:bidi w:val="1"/>
+              <w:jc w:val="right"/>
+            </w:pPr>
+            <w:r>
+              <w:rPr>
+                <w:rFonts w:ascii="Arial" w:hAnsi="Arial"/>
+                <w:b w:val="0"/>
+                <w:sz w:val="20"/>
+                <w:rtl w:val="1"/>
+                <w:rFonts w:cs="Arial"/>
+              </w:rPr>
+              <w:t>MIT</w:t>
+            </w:r>
+          </w:p>
+        </w:tc>
+        <w:tc>
+          <w:tcPr>
+            <w:tcW w:type="dxa" w:w="2880"/>
+          </w:tcPr>
+          <w:p>
+            <w:pPr>
+              <w:bidi w:val="1"/>
+              <w:jc w:val="right"/>
+            </w:pPr>
+            <w:r>
+              <w:rPr>
+                <w:rFonts w:ascii="Arial" w:hAnsi="Arial"/>
+                <w:b w:val="0"/>
+                <w:sz w:val="20"/>
+                <w:rtl w:val="1"/>
+                <w:rFonts w:cs="Arial"/>
+              </w:rPr>
+              <w:t>⚪ status-board ל-DevOps (Jenkins/JIRA) — לא BI עסקי</w:t>
+            </w:r>
+          </w:p>
+        </w:tc>
+      </w:tr>
+      <w:tr>
+        <w:tc>
+          <w:tcPr>
+            <w:tcW w:type="dxa" w:w="2880"/>
+          </w:tcPr>
+          <w:p>
+            <w:pPr>
+              <w:bidi w:val="1"/>
+              <w:jc w:val="right"/>
+            </w:pPr>
+            <w:r>
+              <w:rPr>
+                <w:rFonts w:ascii="Arial" w:hAnsi="Arial"/>
+                <w:b/>
+                <w:sz w:val="20"/>
+                <w:rtl w:val="1"/>
+                <w:rFonts w:cs="Arial"/>
+              </w:rPr>
+              <w:t>d2-admin</w:t>
+            </w:r>
+          </w:p>
+        </w:tc>
+        <w:tc>
+          <w:tcPr>
+            <w:tcW w:type="dxa" w:w="2880"/>
+          </w:tcPr>
+          <w:p>
+            <w:pPr>
+              <w:bidi w:val="1"/>
+              <w:jc w:val="right"/>
+            </w:pPr>
+            <w:r>
+              <w:rPr>
+                <w:rFonts w:ascii="Arial" w:hAnsi="Arial"/>
+                <w:b w:val="0"/>
+                <w:sz w:val="20"/>
+                <w:rtl w:val="1"/>
+                <w:rFonts w:cs="Arial"/>
+              </w:rPr>
+              <w:t>—</w:t>
+            </w:r>
+          </w:p>
+        </w:tc>
+        <w:tc>
+          <w:tcPr>
+            <w:tcW w:type="dxa" w:w="2880"/>
+          </w:tcPr>
+          <w:p>
+            <w:pPr>
+              <w:bidi w:val="1"/>
+              <w:jc w:val="right"/>
+            </w:pPr>
+            <w:r>
+              <w:rPr>
+                <w:rFonts w:ascii="Arial" w:hAnsi="Arial"/>
+                <w:b w:val="0"/>
+                <w:sz w:val="20"/>
+                <w:rtl w:val="1"/>
+                <w:rFonts w:cs="Arial"/>
+              </w:rPr>
+              <w:t>❌ Vue — stack זר</w:t>
+            </w:r>
+          </w:p>
+        </w:tc>
+      </w:tr>
+      <w:tr>
+        <w:tc>
+          <w:tcPr>
+            <w:tcW w:type="dxa" w:w="2880"/>
+          </w:tcPr>
+          <w:p>
+            <w:pPr>
+              <w:bidi w:val="1"/>
+              <w:jc w:val="right"/>
+            </w:pPr>
+            <w:r>
+              <w:rPr>
+                <w:rFonts w:ascii="Arial" w:hAnsi="Arial"/>
+                <w:b/>
+                <w:sz w:val="20"/>
+                <w:rtl w:val="1"/>
+                <w:rFonts w:cs="Arial"/>
+              </w:rPr>
+              <w:t>open-design</w:t>
+            </w:r>
+          </w:p>
+        </w:tc>
+        <w:tc>
+          <w:tcPr>
+            <w:tcW w:type="dxa" w:w="2880"/>
+          </w:tcPr>
+          <w:p>
+            <w:pPr>
+              <w:bidi w:val="1"/>
+              <w:jc w:val="right"/>
+            </w:pPr>
+            <w:r>
+              <w:rPr>
+                <w:rFonts w:ascii="Arial" w:hAnsi="Arial"/>
+                <w:b w:val="0"/>
+                <w:sz w:val="20"/>
+                <w:rtl w:val="1"/>
+                <w:rFonts w:cs="Arial"/>
+              </w:rPr>
+              <w:t>—</w:t>
+            </w:r>
+          </w:p>
+        </w:tc>
+        <w:tc>
+          <w:tcPr>
+            <w:tcW w:type="dxa" w:w="2880"/>
+          </w:tcPr>
+          <w:p>
+            <w:pPr>
+              <w:bidi w:val="1"/>
+              <w:jc w:val="right"/>
+            </w:pPr>
+            <w:r>
+              <w:rPr>
+                <w:rFonts w:ascii="Arial" w:hAnsi="Arial"/>
+                <w:b w:val="0"/>
+                <w:sz w:val="20"/>
+                <w:rtl w:val="1"/>
+                <w:rFonts w:cs="Arial"/>
+              </w:rPr>
+              <w:t>❌ נכס-עיצוב, לא קוד</w:t>
+            </w:r>
+          </w:p>
+        </w:tc>
+      </w:tr>
+    </w:tbl>
+    <w:p>
+      <w:pPr>
+        <w:bidi w:val="1"/>
+        <w:jc w:val="right"/>
+      </w:pPr>
+      <w:r>
+        <w:rPr>
+          <w:rFonts w:ascii="Arial" w:hAnsi="Arial"/>
+          <w:b/>
+          <w:sz w:val="22"/>
+          <w:rtl w:val="1"/>
+          <w:rFonts w:cs="Arial"/>
+        </w:rPr>
+        <w:t>מסקנה:</w:t>
+      </w:r>
+      <w:r>
+        <w:rPr>
+          <w:rFonts w:ascii="Arial" w:hAnsi="Arial"/>
+          <w:b w:val="0"/>
+          <w:sz w:val="22"/>
+          <w:rtl w:val="1"/>
+          <w:rFonts w:cs="Arial"/>
+        </w:rPr>
+        <w:t xml:space="preserve"> 5 נוצלו לקוד/תוכן · 2 רפרנס-רעיוני (מיושם) · 2 חסומי-AGPL · 2 החלטה-מודעת · 2 stack/עיצוב. אין קוד נוסף שווה-קצירה מהרשימה.</w:t>
       </w:r>
     </w:p>
     <w:p>

</xml_diff>

<commit_message>
docs(dashboards): add §13 partner handoff guide (Supabase/SQL/WhatsApp/Ollama + env)
Co-Authored-By: Claude Opus 4.8 (1M context) <noreply@anthropic.com>
</commit_message>
<xml_diff>
--- a/PRODUCTS/02-roi-reporting-engine.docx
+++ b/PRODUCTS/02-roi-reporting-engine.docx
@@ -10812,6 +10812,2864 @@
           <w:rFonts w:cs="Arial"/>
         </w:rPr>
         <w:t xml:space="preserve"> 5 נוצלו לקוד/תוכן · 2 רפרנס-רעיוני (מיושם) · 2 חסומי-AGPL · 2 החלטה-מודעת · 2 stack/עיצוב. אין קוד נוסף שווה-קצירה מהרשימה.</w:t>
+      </w:r>
+    </w:p>
+    <w:p>
+      <w:pPr>
+        <w:pStyle w:val="Heading2"/>
+        <w:bidi w:val="1"/>
+        <w:jc w:val="right"/>
+      </w:pPr>
+      <w:r>
+        <w:rPr>
+          <w:rFonts w:ascii="Arial" w:hAnsi="Arial"/>
+          <w:b w:val="0"/>
+          <w:sz w:val="28"/>
+          <w:rtl w:val="1"/>
+          <w:rFonts w:cs="Arial"/>
+        </w:rPr>
+        <w:t>13. מדריך העברה לשותף (Handoff) 🤝 — Supabase · SQL · WhatsApp · Ollama</w:t>
+      </w:r>
+    </w:p>
+    <w:p>
+      <w:pPr>
+        <w:bidi w:val="1"/>
+        <w:jc w:val="right"/>
+      </w:pPr>
+      <w:r>
+        <w:rPr>
+          <w:rFonts w:ascii="Arial" w:hAnsi="Arial"/>
+          <w:b w:val="0"/>
+          <w:sz w:val="22"/>
+          <w:rtl w:val="1"/>
+          <w:rFonts w:cs="Arial"/>
+        </w:rPr>
+        <w:t xml:space="preserve">הרפו: </w:t>
+      </w:r>
+      <w:r>
+        <w:rPr>
+          <w:rFonts w:ascii="Arial" w:hAnsi="Arial"/>
+          <w:b/>
+          <w:sz w:val="22"/>
+          <w:rtl w:val="1"/>
+          <w:rFonts w:cs="Arial"/>
+        </w:rPr>
+        <w:t>`HELIX-DASHBOARDS`</w:t>
+      </w:r>
+      <w:r>
+        <w:rPr>
+          <w:rFonts w:ascii="Arial" w:hAnsi="Arial"/>
+          <w:b w:val="0"/>
+          <w:sz w:val="22"/>
+          <w:rtl w:val="1"/>
+          <w:rFonts w:cs="Arial"/>
+        </w:rPr>
+        <w:t xml:space="preserve"> (</w:t>
+      </w:r>
+      <w:r>
+        <w:rPr>
+          <w:rFonts w:ascii="Consolas" w:hAnsi="Consolas"/>
+          <w:b w:val="0"/>
+          <w:color w:val="B02A37"/>
+          <w:sz w:val="22"/>
+          <w:rtl w:val="1"/>
+          <w:rFonts w:cs="Consolas"/>
+        </w:rPr>
+        <w:t>Desktop/helix/helix-dashboards</w:t>
+      </w:r>
+      <w:r>
+        <w:rPr>
+          <w:rFonts w:ascii="Arial" w:hAnsi="Arial"/>
+          <w:b w:val="0"/>
+          <w:sz w:val="22"/>
+          <w:rtl w:val="1"/>
+          <w:rFonts w:cs="Arial"/>
+        </w:rPr>
+        <w:t xml:space="preserve">). הקוד מוכן ומקומפל; מה שנשאר לשותף = </w:t>
+      </w:r>
+      <w:r>
+        <w:rPr>
+          <w:rFonts w:ascii="Arial" w:hAnsi="Arial"/>
+          <w:b/>
+          <w:sz w:val="22"/>
+          <w:rtl w:val="1"/>
+          <w:rFonts w:cs="Arial"/>
+        </w:rPr>
+        <w:t>החיבורים החיצוניים</w:t>
+      </w:r>
+      <w:r>
+        <w:rPr>
+          <w:rFonts w:ascii="Arial" w:hAnsi="Arial"/>
+          <w:b w:val="0"/>
+          <w:sz w:val="22"/>
+          <w:rtl w:val="1"/>
+          <w:rFonts w:cs="Arial"/>
+        </w:rPr>
+        <w:t xml:space="preserve">. הרצה: </w:t>
+      </w:r>
+      <w:r>
+        <w:rPr>
+          <w:rFonts w:ascii="Consolas" w:hAnsi="Consolas"/>
+          <w:b w:val="0"/>
+          <w:color w:val="B02A37"/>
+          <w:sz w:val="22"/>
+          <w:rtl w:val="1"/>
+          <w:rFonts w:cs="Consolas"/>
+        </w:rPr>
+        <w:t>npm install</w:t>
+      </w:r>
+      <w:r>
+        <w:rPr>
+          <w:rFonts w:ascii="Arial" w:hAnsi="Arial"/>
+          <w:b w:val="0"/>
+          <w:sz w:val="22"/>
+          <w:rtl w:val="1"/>
+          <w:rFonts w:cs="Arial"/>
+        </w:rPr>
+        <w:t xml:space="preserve"> → </w:t>
+      </w:r>
+      <w:r>
+        <w:rPr>
+          <w:rFonts w:ascii="Consolas" w:hAnsi="Consolas"/>
+          <w:b w:val="0"/>
+          <w:color w:val="B02A37"/>
+          <w:sz w:val="22"/>
+          <w:rtl w:val="1"/>
+          <w:rFonts w:cs="Consolas"/>
+        </w:rPr>
+        <w:t>npm run dev</w:t>
+      </w:r>
+      <w:r>
+        <w:rPr>
+          <w:rFonts w:ascii="Arial" w:hAnsi="Arial"/>
+          <w:b w:val="0"/>
+          <w:sz w:val="22"/>
+          <w:rtl w:val="1"/>
+          <w:rFonts w:cs="Arial"/>
+        </w:rPr>
+        <w:t xml:space="preserve">. קובץ </w:t>
+      </w:r>
+      <w:r>
+        <w:rPr>
+          <w:rFonts w:ascii="Consolas" w:hAnsi="Consolas"/>
+          <w:b w:val="0"/>
+          <w:color w:val="B02A37"/>
+          <w:sz w:val="22"/>
+          <w:rtl w:val="1"/>
+          <w:rFonts w:cs="Consolas"/>
+        </w:rPr>
+        <w:t>.env.example</w:t>
+      </w:r>
+      <w:r>
+        <w:rPr>
+          <w:rFonts w:ascii="Arial" w:hAnsi="Arial"/>
+          <w:b w:val="0"/>
+          <w:sz w:val="22"/>
+          <w:rtl w:val="1"/>
+          <w:rFonts w:cs="Arial"/>
+        </w:rPr>
+        <w:t xml:space="preserve"> + </w:t>
+      </w:r>
+      <w:r>
+        <w:rPr>
+          <w:rFonts w:ascii="Consolas" w:hAnsi="Consolas"/>
+          <w:b w:val="0"/>
+          <w:color w:val="B02A37"/>
+          <w:sz w:val="22"/>
+          <w:rtl w:val="1"/>
+          <w:rFonts w:cs="Consolas"/>
+        </w:rPr>
+        <w:t>README.md</w:t>
+      </w:r>
+      <w:r>
+        <w:rPr>
+          <w:rFonts w:ascii="Arial" w:hAnsi="Arial"/>
+          <w:b w:val="0"/>
+          <w:sz w:val="22"/>
+          <w:rtl w:val="1"/>
+          <w:rFonts w:cs="Arial"/>
+        </w:rPr>
+        <w:t xml:space="preserve"> בתוך הרפו.</w:t>
+      </w:r>
+    </w:p>
+    <w:p>
+      <w:pPr>
+        <w:pStyle w:val="Heading3"/>
+        <w:bidi w:val="1"/>
+        <w:jc w:val="right"/>
+      </w:pPr>
+      <w:r>
+        <w:rPr>
+          <w:rFonts w:ascii="Arial" w:hAnsi="Arial"/>
+          <w:b w:val="0"/>
+          <w:sz w:val="24"/>
+          <w:rtl w:val="1"/>
+          <w:rFonts w:cs="Arial"/>
+        </w:rPr>
+        <w:t>13.1 Supabase (הבסיס)</w:t>
+      </w:r>
+    </w:p>
+    <w:p>
+      <w:pPr>
+        <w:pStyle w:val="ListNumber"/>
+        <w:bidi w:val="1"/>
+        <w:jc w:val="right"/>
+      </w:pPr>
+      <w:r>
+        <w:rPr>
+          <w:rFonts w:ascii="Arial" w:hAnsi="Arial"/>
+          <w:b w:val="0"/>
+          <w:sz w:val="22"/>
+          <w:rtl w:val="1"/>
+          <w:rFonts w:cs="Arial"/>
+        </w:rPr>
+        <w:t xml:space="preserve">פתח פרויקט Supabase → </w:t>
+      </w:r>
+      <w:r>
+        <w:rPr>
+          <w:rFonts w:ascii="Arial" w:hAnsi="Arial"/>
+          <w:b/>
+          <w:sz w:val="22"/>
+          <w:rtl w:val="1"/>
+          <w:rFonts w:cs="Arial"/>
+        </w:rPr>
+        <w:t>הרץ את `supabase/schema.sql`</w:t>
+      </w:r>
+      <w:r>
+        <w:rPr>
+          <w:rFonts w:ascii="Arial" w:hAnsi="Arial"/>
+          <w:b w:val="0"/>
+          <w:sz w:val="22"/>
+          <w:rtl w:val="1"/>
+          <w:rFonts w:cs="Arial"/>
+        </w:rPr>
+        <w:t xml:space="preserve"> (SQL Editor). זה יוצר את כל הטבלאות (</w:t>
+      </w:r>
+      <w:r>
+        <w:rPr>
+          <w:rFonts w:ascii="Consolas" w:hAnsi="Consolas"/>
+          <w:b w:val="0"/>
+          <w:color w:val="B02A37"/>
+          <w:sz w:val="22"/>
+          <w:rtl w:val="1"/>
+          <w:rFonts w:cs="Consolas"/>
+        </w:rPr>
+        <w:t>workspaces</w:t>
+      </w:r>
+      <w:r>
+        <w:rPr>
+          <w:rFonts w:ascii="Arial" w:hAnsi="Arial"/>
+          <w:b w:val="0"/>
+          <w:sz w:val="22"/>
+          <w:rtl w:val="1"/>
+          <w:rFonts w:cs="Arial"/>
+        </w:rPr>
+        <w:t xml:space="preserve">, </w:t>
+      </w:r>
+      <w:r>
+        <w:rPr>
+          <w:rFonts w:ascii="Consolas" w:hAnsi="Consolas"/>
+          <w:b w:val="0"/>
+          <w:color w:val="B02A37"/>
+          <w:sz w:val="22"/>
+          <w:rtl w:val="1"/>
+          <w:rFonts w:cs="Consolas"/>
+        </w:rPr>
+        <w:t>memberships</w:t>
+      </w:r>
+      <w:r>
+        <w:rPr>
+          <w:rFonts w:ascii="Arial" w:hAnsi="Arial"/>
+          <w:b w:val="0"/>
+          <w:sz w:val="22"/>
+          <w:rtl w:val="1"/>
+          <w:rFonts w:cs="Arial"/>
+        </w:rPr>
+        <w:t xml:space="preserve">, </w:t>
+      </w:r>
+      <w:r>
+        <w:rPr>
+          <w:rFonts w:ascii="Consolas" w:hAnsi="Consolas"/>
+          <w:b w:val="0"/>
+          <w:color w:val="B02A37"/>
+          <w:sz w:val="22"/>
+          <w:rtl w:val="1"/>
+          <w:rFonts w:cs="Consolas"/>
+        </w:rPr>
+        <w:t>connections</w:t>
+      </w:r>
+      <w:r>
+        <w:rPr>
+          <w:rFonts w:ascii="Arial" w:hAnsi="Arial"/>
+          <w:b w:val="0"/>
+          <w:sz w:val="22"/>
+          <w:rtl w:val="1"/>
+          <w:rFonts w:cs="Arial"/>
+        </w:rPr>
+        <w:t xml:space="preserve">, </w:t>
+      </w:r>
+      <w:r>
+        <w:rPr>
+          <w:rFonts w:ascii="Consolas" w:hAnsi="Consolas"/>
+          <w:b w:val="0"/>
+          <w:color w:val="B02A37"/>
+          <w:sz w:val="22"/>
+          <w:rtl w:val="1"/>
+          <w:rFonts w:cs="Consolas"/>
+        </w:rPr>
+        <w:t>metric_points</w:t>
+      </w:r>
+      <w:r>
+        <w:rPr>
+          <w:rFonts w:ascii="Arial" w:hAnsi="Arial"/>
+          <w:b w:val="0"/>
+          <w:sz w:val="22"/>
+          <w:rtl w:val="1"/>
+          <w:rFonts w:cs="Arial"/>
+        </w:rPr>
+        <w:t xml:space="preserve">, </w:t>
+      </w:r>
+      <w:r>
+        <w:rPr>
+          <w:rFonts w:ascii="Consolas" w:hAnsi="Consolas"/>
+          <w:b w:val="0"/>
+          <w:color w:val="B02A37"/>
+          <w:sz w:val="22"/>
+          <w:rtl w:val="1"/>
+          <w:rFonts w:cs="Consolas"/>
+        </w:rPr>
+        <w:t>dashboards</w:t>
+      </w:r>
+      <w:r>
+        <w:rPr>
+          <w:rFonts w:ascii="Arial" w:hAnsi="Arial"/>
+          <w:b w:val="0"/>
+          <w:sz w:val="22"/>
+          <w:rtl w:val="1"/>
+          <w:rFonts w:cs="Arial"/>
+        </w:rPr>
+        <w:t xml:space="preserve">, </w:t>
+      </w:r>
+      <w:r>
+        <w:rPr>
+          <w:rFonts w:ascii="Consolas" w:hAnsi="Consolas"/>
+          <w:b w:val="0"/>
+          <w:color w:val="B02A37"/>
+          <w:sz w:val="22"/>
+          <w:rtl w:val="1"/>
+          <w:rFonts w:cs="Consolas"/>
+        </w:rPr>
+        <w:t>dashboard_widgets</w:t>
+      </w:r>
+      <w:r>
+        <w:rPr>
+          <w:rFonts w:ascii="Arial" w:hAnsi="Arial"/>
+          <w:b w:val="0"/>
+          <w:sz w:val="22"/>
+          <w:rtl w:val="1"/>
+          <w:rFonts w:cs="Arial"/>
+        </w:rPr>
+        <w:t xml:space="preserve">, </w:t>
+      </w:r>
+      <w:r>
+        <w:rPr>
+          <w:rFonts w:ascii="Consolas" w:hAnsi="Consolas"/>
+          <w:b w:val="0"/>
+          <w:color w:val="B02A37"/>
+          <w:sz w:val="22"/>
+          <w:rtl w:val="1"/>
+          <w:rFonts w:cs="Consolas"/>
+        </w:rPr>
+        <w:t>widget_library</w:t>
+      </w:r>
+      <w:r>
+        <w:rPr>
+          <w:rFonts w:ascii="Arial" w:hAnsi="Arial"/>
+          <w:b w:val="0"/>
+          <w:sz w:val="22"/>
+          <w:rtl w:val="1"/>
+          <w:rFonts w:cs="Arial"/>
+        </w:rPr>
+        <w:t xml:space="preserve">, </w:t>
+      </w:r>
+      <w:r>
+        <w:rPr>
+          <w:rFonts w:ascii="Consolas" w:hAnsi="Consolas"/>
+          <w:b w:val="0"/>
+          <w:color w:val="B02A37"/>
+          <w:sz w:val="22"/>
+          <w:rtl w:val="1"/>
+          <w:rFonts w:cs="Consolas"/>
+        </w:rPr>
+        <w:t>deals</w:t>
+      </w:r>
+      <w:r>
+        <w:rPr>
+          <w:rFonts w:ascii="Arial" w:hAnsi="Arial"/>
+          <w:b w:val="0"/>
+          <w:sz w:val="22"/>
+          <w:rtl w:val="1"/>
+          <w:rFonts w:cs="Arial"/>
+        </w:rPr>
+        <w:t xml:space="preserve">, </w:t>
+      </w:r>
+      <w:r>
+        <w:rPr>
+          <w:rFonts w:ascii="Consolas" w:hAnsi="Consolas"/>
+          <w:b w:val="0"/>
+          <w:color w:val="B02A37"/>
+          <w:sz w:val="22"/>
+          <w:rtl w:val="1"/>
+          <w:rFonts w:cs="Consolas"/>
+        </w:rPr>
+        <w:t>digest_subscriptions</w:t>
+      </w:r>
+      <w:r>
+        <w:rPr>
+          <w:rFonts w:ascii="Arial" w:hAnsi="Arial"/>
+          <w:b w:val="0"/>
+          <w:sz w:val="22"/>
+          <w:rtl w:val="1"/>
+          <w:rFonts w:cs="Arial"/>
+        </w:rPr>
+        <w:t xml:space="preserve">, </w:t>
+      </w:r>
+      <w:r>
+        <w:rPr>
+          <w:rFonts w:ascii="Consolas" w:hAnsi="Consolas"/>
+          <w:b w:val="0"/>
+          <w:color w:val="B02A37"/>
+          <w:sz w:val="22"/>
+          <w:rtl w:val="1"/>
+          <w:rFonts w:cs="Consolas"/>
+        </w:rPr>
+        <w:t>bot_links</w:t>
+      </w:r>
+      <w:r>
+        <w:rPr>
+          <w:rFonts w:ascii="Arial" w:hAnsi="Arial"/>
+          <w:b w:val="0"/>
+          <w:sz w:val="22"/>
+          <w:rtl w:val="1"/>
+          <w:rFonts w:cs="Arial"/>
+        </w:rPr>
+        <w:t xml:space="preserve">), את ה-RPC </w:t>
+      </w:r>
+      <w:r>
+        <w:rPr>
+          <w:rFonts w:ascii="Consolas" w:hAnsi="Consolas"/>
+          <w:b w:val="0"/>
+          <w:color w:val="B02A37"/>
+          <w:sz w:val="22"/>
+          <w:rtl w:val="1"/>
+          <w:rFonts w:cs="Consolas"/>
+        </w:rPr>
+        <w:t>create_workspace</w:t>
+      </w:r>
+      <w:r>
+        <w:rPr>
+          <w:rFonts w:ascii="Arial" w:hAnsi="Arial"/>
+          <w:b w:val="0"/>
+          <w:sz w:val="22"/>
+          <w:rtl w:val="1"/>
+          <w:rFonts w:cs="Arial"/>
+        </w:rPr>
+        <w:t>, ואת כל מדיניות ה-</w:t>
+      </w:r>
+      <w:r>
+        <w:rPr>
+          <w:rFonts w:ascii="Arial" w:hAnsi="Arial"/>
+          <w:b/>
+          <w:sz w:val="22"/>
+          <w:rtl w:val="1"/>
+          <w:rFonts w:cs="Arial"/>
+        </w:rPr>
+        <w:t>RLS</w:t>
+      </w:r>
+      <w:r>
+        <w:rPr>
+          <w:rFonts w:ascii="Arial" w:hAnsi="Arial"/>
+          <w:b w:val="0"/>
+          <w:sz w:val="22"/>
+          <w:rtl w:val="1"/>
+          <w:rFonts w:cs="Arial"/>
+        </w:rPr>
+        <w:t xml:space="preserve"> (בידוד per-workspace).</w:t>
+      </w:r>
+    </w:p>
+    <w:p>
+      <w:pPr>
+        <w:pStyle w:val="ListNumber"/>
+        <w:bidi w:val="1"/>
+        <w:jc w:val="right"/>
+      </w:pPr>
+      <w:r>
+        <w:rPr>
+          <w:rFonts w:ascii="Arial" w:hAnsi="Arial"/>
+          <w:b w:val="0"/>
+          <w:sz w:val="22"/>
+          <w:rtl w:val="1"/>
+          <w:rFonts w:cs="Arial"/>
+        </w:rPr>
+        <w:t xml:space="preserve">env: </w:t>
+      </w:r>
+      <w:r>
+        <w:rPr>
+          <w:rFonts w:ascii="Consolas" w:hAnsi="Consolas"/>
+          <w:b w:val="0"/>
+          <w:color w:val="B02A37"/>
+          <w:sz w:val="22"/>
+          <w:rtl w:val="1"/>
+          <w:rFonts w:cs="Consolas"/>
+        </w:rPr>
+        <w:t>NEXT_PUBLIC_SUPABASE_URL</w:t>
+      </w:r>
+      <w:r>
+        <w:rPr>
+          <w:rFonts w:ascii="Arial" w:hAnsi="Arial"/>
+          <w:b w:val="0"/>
+          <w:sz w:val="22"/>
+          <w:rtl w:val="1"/>
+          <w:rFonts w:cs="Arial"/>
+        </w:rPr>
+        <w:t xml:space="preserve">, </w:t>
+      </w:r>
+      <w:r>
+        <w:rPr>
+          <w:rFonts w:ascii="Consolas" w:hAnsi="Consolas"/>
+          <w:b w:val="0"/>
+          <w:color w:val="B02A37"/>
+          <w:sz w:val="22"/>
+          <w:rtl w:val="1"/>
+          <w:rFonts w:cs="Consolas"/>
+        </w:rPr>
+        <w:t>NEXT_PUBLIC_SUPABASE_ANON_KEY</w:t>
+      </w:r>
+      <w:r>
+        <w:rPr>
+          <w:rFonts w:ascii="Arial" w:hAnsi="Arial"/>
+          <w:b w:val="0"/>
+          <w:sz w:val="22"/>
+          <w:rtl w:val="1"/>
+          <w:rFonts w:cs="Arial"/>
+        </w:rPr>
+        <w:t xml:space="preserve">, </w:t>
+      </w:r>
+      <w:r>
+        <w:rPr>
+          <w:rFonts w:ascii="Consolas" w:hAnsi="Consolas"/>
+          <w:b w:val="0"/>
+          <w:color w:val="B02A37"/>
+          <w:sz w:val="22"/>
+          <w:rtl w:val="1"/>
+          <w:rFonts w:cs="Consolas"/>
+        </w:rPr>
+        <w:t>SUPABASE_SERVICE_ROLE_KEY</w:t>
+      </w:r>
+      <w:r>
+        <w:rPr>
+          <w:rFonts w:ascii="Arial" w:hAnsi="Arial"/>
+          <w:b w:val="0"/>
+          <w:sz w:val="22"/>
+          <w:rtl w:val="1"/>
+          <w:rFonts w:cs="Arial"/>
+        </w:rPr>
+        <w:t xml:space="preserve"> (השירות משמש את ה-cron/בוט לעקיפת RLS).</w:t>
+      </w:r>
+    </w:p>
+    <w:p>
+      <w:pPr>
+        <w:pStyle w:val="ListNumber"/>
+        <w:bidi w:val="1"/>
+        <w:jc w:val="right"/>
+      </w:pPr>
+      <w:r>
+        <w:rPr>
+          <w:rFonts w:ascii="Arial" w:hAnsi="Arial"/>
+          <w:b/>
+          <w:sz w:val="22"/>
+          <w:rtl w:val="1"/>
+          <w:rFonts w:cs="Arial"/>
+        </w:rPr>
+        <w:t>Auth</w:t>
+      </w:r>
+      <w:r>
+        <w:rPr>
+          <w:rFonts w:ascii="Arial" w:hAnsi="Arial"/>
+          <w:b w:val="0"/>
+          <w:sz w:val="22"/>
+          <w:rtl w:val="1"/>
+          <w:rFonts w:cs="Arial"/>
+        </w:rPr>
+        <w:t xml:space="preserve"> (magic-link) עובד מהקופסה — רק להגדיר ב-Supabase → Auth → URL Configuration את </w:t>
+      </w:r>
+      <w:r>
+        <w:rPr>
+          <w:rFonts w:ascii="Consolas" w:hAnsi="Consolas"/>
+          <w:b w:val="0"/>
+          <w:color w:val="B02A37"/>
+          <w:sz w:val="22"/>
+          <w:rtl w:val="1"/>
+          <w:rFonts w:cs="Consolas"/>
+        </w:rPr>
+        <w:t>NEXT_PUBLIC_SITE_URL/auth/callback</w:t>
+      </w:r>
+      <w:r>
+        <w:rPr>
+          <w:rFonts w:ascii="Arial" w:hAnsi="Arial"/>
+          <w:b w:val="0"/>
+          <w:sz w:val="22"/>
+          <w:rtl w:val="1"/>
+          <w:rFonts w:cs="Arial"/>
+        </w:rPr>
+        <w:t xml:space="preserve"> כ-redirect, ולערוך תבנית-מייל אם רוצים.</w:t>
+      </w:r>
+    </w:p>
+    <w:p>
+      <w:pPr>
+        <w:pStyle w:val="Heading3"/>
+        <w:bidi w:val="1"/>
+        <w:jc w:val="right"/>
+      </w:pPr>
+      <w:r>
+        <w:rPr>
+          <w:rFonts w:ascii="Arial" w:hAnsi="Arial"/>
+          <w:b w:val="0"/>
+          <w:sz w:val="24"/>
+          <w:rtl w:val="1"/>
+          <w:rFonts w:cs="Arial"/>
+        </w:rPr>
+        <w:t>13.2 SQL / מודל הנתונים (הכלל שחשוב להבין)</w:t>
+      </w:r>
+    </w:p>
+    <w:p>
+      <w:pPr>
+        <w:bidi w:val="1"/>
+        <w:jc w:val="right"/>
+      </w:pPr>
+      <w:r>
+        <w:rPr>
+          <w:rFonts w:ascii="Arial" w:hAnsi="Arial"/>
+          <w:b w:val="0"/>
+          <w:sz w:val="22"/>
+          <w:rtl w:val="1"/>
+          <w:rFonts w:cs="Arial"/>
+        </w:rPr>
+        <w:t xml:space="preserve">כל widget קורא </w:t>
+      </w:r>
+      <w:r>
+        <w:rPr>
+          <w:rFonts w:ascii="Arial" w:hAnsi="Arial"/>
+          <w:b/>
+          <w:sz w:val="22"/>
+          <w:rtl w:val="1"/>
+          <w:rFonts w:cs="Arial"/>
+        </w:rPr>
+        <w:t>רק</w:t>
+      </w:r>
+      <w:r>
+        <w:rPr>
+          <w:rFonts w:ascii="Arial" w:hAnsi="Arial"/>
+          <w:b w:val="0"/>
+          <w:sz w:val="22"/>
+          <w:rtl w:val="1"/>
+          <w:rFonts w:cs="Arial"/>
+        </w:rPr>
+        <w:t xml:space="preserve"> מ-</w:t>
+      </w:r>
+      <w:r>
+        <w:rPr>
+          <w:rFonts w:ascii="Consolas" w:hAnsi="Consolas"/>
+          <w:b w:val="0"/>
+          <w:color w:val="B02A37"/>
+          <w:sz w:val="22"/>
+          <w:rtl w:val="1"/>
+          <w:rFonts w:cs="Consolas"/>
+        </w:rPr>
+        <w:t>metric_points</w:t>
+      </w:r>
+      <w:r>
+        <w:rPr>
+          <w:rFonts w:ascii="Arial" w:hAnsi="Arial"/>
+          <w:b w:val="0"/>
+          <w:sz w:val="22"/>
+          <w:rtl w:val="1"/>
+          <w:rFonts w:cs="Arial"/>
+        </w:rPr>
+        <w:t xml:space="preserve"> (לא מ-API ישירות). connector = פונקציה שמחזירה שורות </w:t>
+      </w:r>
+      <w:r>
+        <w:rPr>
+          <w:rFonts w:ascii="Consolas" w:hAnsi="Consolas"/>
+          <w:b w:val="0"/>
+          <w:color w:val="B02A37"/>
+          <w:sz w:val="22"/>
+          <w:rtl w:val="1"/>
+          <w:rFonts w:cs="Consolas"/>
+        </w:rPr>
+        <w:t>{source, metric, dims, ts, value}</w:t>
+      </w:r>
+      <w:r>
+        <w:rPr>
+          <w:rFonts w:ascii="Arial" w:hAnsi="Arial"/>
+          <w:b w:val="0"/>
+          <w:sz w:val="22"/>
+          <w:rtl w:val="1"/>
+          <w:rFonts w:cs="Arial"/>
+        </w:rPr>
+        <w:t xml:space="preserve"> ו-</w:t>
+      </w:r>
+      <w:r>
+        <w:rPr>
+          <w:rFonts w:ascii="Consolas" w:hAnsi="Consolas"/>
+          <w:b w:val="0"/>
+          <w:color w:val="B02A37"/>
+          <w:sz w:val="22"/>
+          <w:rtl w:val="1"/>
+          <w:rFonts w:cs="Consolas"/>
+        </w:rPr>
+        <w:t>upsertMetrics</w:t>
+      </w:r>
+      <w:r>
+        <w:rPr>
+          <w:rFonts w:ascii="Arial" w:hAnsi="Arial"/>
+          <w:b w:val="0"/>
+          <w:sz w:val="22"/>
+          <w:rtl w:val="1"/>
+          <w:rFonts w:cs="Arial"/>
+        </w:rPr>
+        <w:t xml:space="preserve"> דוחף אותן. </w:t>
+      </w:r>
+      <w:r>
+        <w:rPr>
+          <w:rFonts w:ascii="Arial" w:hAnsi="Arial"/>
+          <w:b/>
+          <w:sz w:val="22"/>
+          <w:rtl w:val="1"/>
+          <w:rFonts w:cs="Arial"/>
+        </w:rPr>
+        <w:t>להוסיף מקור נתונים חדש = לכתוב פונקציה שמזרימה ל-`metric_points`</w:t>
+      </w:r>
+      <w:r>
+        <w:rPr>
+          <w:rFonts w:ascii="Arial" w:hAnsi="Arial"/>
+          <w:b w:val="0"/>
+          <w:sz w:val="22"/>
+          <w:rtl w:val="1"/>
+          <w:rFonts w:cs="Arial"/>
+        </w:rPr>
+        <w:t xml:space="preserve"> — ה-widgets כבר יידעו לצייר. הקריאה מ-DB: </w:t>
+      </w:r>
+      <w:r>
+        <w:rPr>
+          <w:rFonts w:ascii="Consolas" w:hAnsi="Consolas"/>
+          <w:b w:val="0"/>
+          <w:color w:val="B02A37"/>
+          <w:sz w:val="22"/>
+          <w:rtl w:val="1"/>
+          <w:rFonts w:cs="Consolas"/>
+        </w:rPr>
+        <w:t>lib/metrics-db.ts</w:t>
+      </w:r>
+      <w:r>
+        <w:rPr>
+          <w:rFonts w:ascii="Arial" w:hAnsi="Arial"/>
+          <w:b w:val="0"/>
+          <w:sz w:val="22"/>
+          <w:rtl w:val="1"/>
+          <w:rFonts w:cs="Arial"/>
+        </w:rPr>
+        <w:t xml:space="preserve"> (מטפל ב-kpi/gauge/line/bar; </w:t>
+      </w:r>
+      <w:r>
+        <w:rPr>
+          <w:rFonts w:ascii="Arial" w:hAnsi="Arial"/>
+          <w:b/>
+          <w:sz w:val="22"/>
+          <w:rtl w:val="1"/>
+          <w:rFonts w:cs="Arial"/>
+        </w:rPr>
+        <w:t>funnel/table עדיין demo</w:t>
+      </w:r>
+      <w:r>
+        <w:rPr>
+          <w:rFonts w:ascii="Arial" w:hAnsi="Arial"/>
+          <w:b w:val="0"/>
+          <w:sz w:val="22"/>
+          <w:rtl w:val="1"/>
+          <w:rFonts w:cs="Arial"/>
+        </w:rPr>
+        <w:t xml:space="preserve"> — נקודת-הרחבה).</w:t>
+      </w:r>
+    </w:p>
+    <w:p>
+      <w:pPr>
+        <w:pStyle w:val="Heading3"/>
+        <w:bidi w:val="1"/>
+        <w:jc w:val="right"/>
+      </w:pPr>
+      <w:r>
+        <w:rPr>
+          <w:rFonts w:ascii="Arial" w:hAnsi="Arial"/>
+          <w:b w:val="0"/>
+          <w:sz w:val="24"/>
+          <w:rtl w:val="1"/>
+          <w:rFonts w:cs="Arial"/>
+        </w:rPr>
+        <w:t>13.3 WhatsApp (ערוץ מסירה + נכנס)</w:t>
+      </w:r>
+    </w:p>
+    <w:p>
+      <w:pPr>
+        <w:pStyle w:val="ListBullet"/>
+        <w:bidi w:val="1"/>
+        <w:jc w:val="right"/>
+      </w:pPr>
+      <w:r>
+        <w:rPr>
+          <w:rFonts w:ascii="Arial" w:hAnsi="Arial"/>
+          <w:b/>
+          <w:sz w:val="22"/>
+          <w:rtl w:val="1"/>
+          <w:rFonts w:cs="Arial"/>
+        </w:rPr>
+        <w:t>יוצא (מסירת דוחות)</w:t>
+      </w:r>
+      <w:r>
+        <w:rPr>
+          <w:rFonts w:ascii="Arial" w:hAnsi="Arial"/>
+          <w:b w:val="0"/>
+          <w:sz w:val="22"/>
+          <w:rtl w:val="1"/>
+          <w:rFonts w:cs="Arial"/>
+        </w:rPr>
+        <w:t xml:space="preserve"> — כבר מחווט: </w:t>
+      </w:r>
+      <w:r>
+        <w:rPr>
+          <w:rFonts w:ascii="Consolas" w:hAnsi="Consolas"/>
+          <w:b w:val="0"/>
+          <w:color w:val="B02A37"/>
+          <w:sz w:val="22"/>
+          <w:rtl w:val="1"/>
+          <w:rFonts w:cs="Consolas"/>
+        </w:rPr>
+        <w:t>lib/channels.ts → sendWhatsApp</w:t>
+      </w:r>
+      <w:r>
+        <w:rPr>
+          <w:rFonts w:ascii="Arial" w:hAnsi="Arial"/>
+          <w:b w:val="0"/>
+          <w:sz w:val="22"/>
+          <w:rtl w:val="1"/>
+          <w:rFonts w:cs="Arial"/>
+        </w:rPr>
+        <w:t xml:space="preserve"> דרך </w:t>
+      </w:r>
+      <w:r>
+        <w:rPr>
+          <w:rFonts w:ascii="Arial" w:hAnsi="Arial"/>
+          <w:b/>
+          <w:sz w:val="22"/>
+          <w:rtl w:val="1"/>
+          <w:rFonts w:cs="Arial"/>
+        </w:rPr>
+        <w:t>Meta WhatsApp Cloud API</w:t>
+      </w:r>
+      <w:r>
+        <w:rPr>
+          <w:rFonts w:ascii="Arial" w:hAnsi="Arial"/>
+          <w:b w:val="0"/>
+          <w:sz w:val="22"/>
+          <w:rtl w:val="1"/>
+          <w:rFonts w:cs="Arial"/>
+        </w:rPr>
+        <w:t xml:space="preserve">. env: </w:t>
+      </w:r>
+      <w:r>
+        <w:rPr>
+          <w:rFonts w:ascii="Consolas" w:hAnsi="Consolas"/>
+          <w:b w:val="0"/>
+          <w:color w:val="B02A37"/>
+          <w:sz w:val="22"/>
+          <w:rtl w:val="1"/>
+          <w:rFonts w:cs="Consolas"/>
+        </w:rPr>
+        <w:t>WHATSAPP_TOKEN</w:t>
+      </w:r>
+      <w:r>
+        <w:rPr>
+          <w:rFonts w:ascii="Arial" w:hAnsi="Arial"/>
+          <w:b w:val="0"/>
+          <w:sz w:val="22"/>
+          <w:rtl w:val="1"/>
+          <w:rFonts w:cs="Arial"/>
+        </w:rPr>
+        <w:t xml:space="preserve">, </w:t>
+      </w:r>
+      <w:r>
+        <w:rPr>
+          <w:rFonts w:ascii="Consolas" w:hAnsi="Consolas"/>
+          <w:b w:val="0"/>
+          <w:color w:val="B02A37"/>
+          <w:sz w:val="22"/>
+          <w:rtl w:val="1"/>
+          <w:rFonts w:cs="Consolas"/>
+        </w:rPr>
+        <w:t>WHATSAPP_PHONE_ID</w:t>
+      </w:r>
+      <w:r>
+        <w:rPr>
+          <w:rFonts w:ascii="Arial" w:hAnsi="Arial"/>
+          <w:b w:val="0"/>
+          <w:sz w:val="22"/>
+          <w:rtl w:val="1"/>
+          <w:rFonts w:cs="Arial"/>
+        </w:rPr>
+        <w:t>. להרשמה ל-digest בוואטסאפ: רשומה ב-</w:t>
+      </w:r>
+      <w:r>
+        <w:rPr>
+          <w:rFonts w:ascii="Consolas" w:hAnsi="Consolas"/>
+          <w:b w:val="0"/>
+          <w:color w:val="B02A37"/>
+          <w:sz w:val="22"/>
+          <w:rtl w:val="1"/>
+          <w:rFonts w:cs="Consolas"/>
+        </w:rPr>
+        <w:t>digest_subscriptions</w:t>
+      </w:r>
+      <w:r>
+        <w:rPr>
+          <w:rFonts w:ascii="Arial" w:hAnsi="Arial"/>
+          <w:b w:val="0"/>
+          <w:sz w:val="22"/>
+          <w:rtl w:val="1"/>
+          <w:rFonts w:cs="Arial"/>
+        </w:rPr>
+        <w:t xml:space="preserve"> עם </w:t>
+      </w:r>
+      <w:r>
+        <w:rPr>
+          <w:rFonts w:ascii="Consolas" w:hAnsi="Consolas"/>
+          <w:b w:val="0"/>
+          <w:color w:val="B02A37"/>
+          <w:sz w:val="22"/>
+          <w:rtl w:val="1"/>
+          <w:rFonts w:cs="Consolas"/>
+        </w:rPr>
+        <w:t>channel='whatsapp'</w:t>
+      </w:r>
+      <w:r>
+        <w:rPr>
+          <w:rFonts w:ascii="Arial" w:hAnsi="Arial"/>
+          <w:b w:val="0"/>
+          <w:sz w:val="22"/>
+          <w:rtl w:val="1"/>
+          <w:rFonts w:cs="Arial"/>
+        </w:rPr>
+        <w:t xml:space="preserve"> + טלפון (דרך דף </w:t>
+      </w:r>
+      <w:r>
+        <w:rPr>
+          <w:rFonts w:ascii="Consolas" w:hAnsi="Consolas"/>
+          <w:b w:val="0"/>
+          <w:color w:val="B02A37"/>
+          <w:sz w:val="22"/>
+          <w:rtl w:val="1"/>
+          <w:rFonts w:cs="Consolas"/>
+        </w:rPr>
+        <w:t>/digest</w:t>
+      </w:r>
+      <w:r>
+        <w:rPr>
+          <w:rFonts w:ascii="Arial" w:hAnsi="Arial"/>
+          <w:b w:val="0"/>
+          <w:sz w:val="22"/>
+          <w:rtl w:val="1"/>
+          <w:rFonts w:cs="Arial"/>
+        </w:rPr>
+        <w:t>).</w:t>
+      </w:r>
+    </w:p>
+    <w:p>
+      <w:pPr>
+        <w:pStyle w:val="ListBullet"/>
+        <w:bidi w:val="1"/>
+        <w:jc w:val="right"/>
+      </w:pPr>
+      <w:r>
+        <w:rPr>
+          <w:rFonts w:ascii="Arial" w:hAnsi="Arial"/>
+          <w:b/>
+          <w:sz w:val="22"/>
+          <w:rtl w:val="1"/>
+          <w:rFonts w:cs="Arial"/>
+        </w:rPr>
+        <w:t>צריך השותף:</w:t>
+      </w:r>
+      <w:r>
+        <w:rPr>
+          <w:rFonts w:ascii="Arial" w:hAnsi="Arial"/>
+          <w:b w:val="0"/>
+          <w:sz w:val="22"/>
+          <w:rtl w:val="1"/>
+          <w:rFonts w:cs="Arial"/>
+        </w:rPr>
+        <w:t xml:space="preserve"> אפליקציית Meta + מספר WhatsApp Business + </w:t>
+      </w:r>
+      <w:r>
+        <w:rPr>
+          <w:rFonts w:ascii="Arial" w:hAnsi="Arial"/>
+          <w:b/>
+          <w:sz w:val="22"/>
+          <w:rtl w:val="1"/>
+          <w:rFonts w:cs="Arial"/>
+        </w:rPr>
+        <w:t>תבנית "utility" מאושרת</w:t>
+      </w:r>
+      <w:r>
+        <w:rPr>
+          <w:rFonts w:ascii="Arial" w:hAnsi="Arial"/>
+          <w:b w:val="0"/>
+          <w:sz w:val="22"/>
+          <w:rtl w:val="1"/>
+          <w:rFonts w:cs="Arial"/>
+        </w:rPr>
+        <w:t xml:space="preserve"> (הודעה יזומה חייבת template מאושר). </w:t>
+      </w:r>
+      <w:r>
+        <w:rPr>
+          <w:rFonts w:ascii="Arial" w:hAnsi="Arial"/>
+          <w:b/>
+          <w:sz w:val="22"/>
+          <w:rtl w:val="1"/>
+          <w:rFonts w:cs="Arial"/>
+        </w:rPr>
+        <w:t>§30A ציות:</w:t>
+      </w:r>
+      <w:r>
+        <w:rPr>
+          <w:rFonts w:ascii="Arial" w:hAnsi="Arial"/>
+          <w:b w:val="0"/>
+          <w:sz w:val="22"/>
+          <w:rtl w:val="1"/>
+          <w:rFonts w:cs="Arial"/>
+        </w:rPr>
+        <w:t xml:space="preserve"> הודעה קרה = opt-in חובה.</w:t>
+      </w:r>
+    </w:p>
+    <w:p>
+      <w:pPr>
+        <w:pStyle w:val="ListBullet"/>
+        <w:bidi w:val="1"/>
+        <w:jc w:val="right"/>
+      </w:pPr>
+      <w:r>
+        <w:rPr>
+          <w:rFonts w:ascii="Arial" w:hAnsi="Arial"/>
+          <w:b/>
+          <w:sz w:val="22"/>
+          <w:rtl w:val="1"/>
+          <w:rFonts w:cs="Arial"/>
+        </w:rPr>
+        <w:t>נכנס (בוט WhatsApp)</w:t>
+      </w:r>
+      <w:r>
+        <w:rPr>
+          <w:rFonts w:ascii="Arial" w:hAnsi="Arial"/>
+          <w:b w:val="0"/>
+          <w:sz w:val="22"/>
+          <w:rtl w:val="1"/>
+          <w:rFonts w:cs="Arial"/>
+        </w:rPr>
+        <w:t xml:space="preserve"> — </w:t>
+      </w:r>
+      <w:r>
+        <w:rPr>
+          <w:rFonts w:ascii="Arial" w:hAnsi="Arial"/>
+          <w:b/>
+          <w:sz w:val="22"/>
+          <w:rtl w:val="1"/>
+          <w:rFonts w:cs="Arial"/>
+        </w:rPr>
+        <w:t>לא נבנה</w:t>
+      </w:r>
+      <w:r>
+        <w:rPr>
+          <w:rFonts w:ascii="Arial" w:hAnsi="Arial"/>
+          <w:b w:val="0"/>
+          <w:sz w:val="22"/>
+          <w:rtl w:val="1"/>
+          <w:rFonts w:cs="Arial"/>
+        </w:rPr>
+        <w:t xml:space="preserve"> (נבנה רק בוט טלגרם). להוספה: route </w:t>
+      </w:r>
+      <w:r>
+        <w:rPr>
+          <w:rFonts w:ascii="Consolas" w:hAnsi="Consolas"/>
+          <w:b w:val="0"/>
+          <w:color w:val="B02A37"/>
+          <w:sz w:val="22"/>
+          <w:rtl w:val="1"/>
+          <w:rFonts w:cs="Consolas"/>
+        </w:rPr>
+        <w:t>/api/whatsapp</w:t>
+      </w:r>
+      <w:r>
+        <w:rPr>
+          <w:rFonts w:ascii="Arial" w:hAnsi="Arial"/>
+          <w:b w:val="0"/>
+          <w:sz w:val="22"/>
+          <w:rtl w:val="1"/>
+          <w:rFonts w:cs="Arial"/>
+        </w:rPr>
+        <w:t xml:space="preserve"> שמשכפל את </w:t>
+      </w:r>
+      <w:r>
+        <w:rPr>
+          <w:rFonts w:ascii="Consolas" w:hAnsi="Consolas"/>
+          <w:b w:val="0"/>
+          <w:color w:val="B02A37"/>
+          <w:sz w:val="22"/>
+          <w:rtl w:val="1"/>
+          <w:rFonts w:cs="Consolas"/>
+        </w:rPr>
+        <w:t>/api/telegram</w:t>
+      </w:r>
+      <w:r>
+        <w:rPr>
+          <w:rFonts w:ascii="Arial" w:hAnsi="Arial"/>
+          <w:b w:val="0"/>
+          <w:sz w:val="22"/>
+          <w:rtl w:val="1"/>
+          <w:rFonts w:cs="Arial"/>
+        </w:rPr>
+        <w:t xml:space="preserve"> (מיפוי </w:t>
+      </w:r>
+      <w:r>
+        <w:rPr>
+          <w:rFonts w:ascii="Consolas" w:hAnsi="Consolas"/>
+          <w:b w:val="0"/>
+          <w:color w:val="B02A37"/>
+          <w:sz w:val="22"/>
+          <w:rtl w:val="1"/>
+          <w:rFonts w:cs="Consolas"/>
+        </w:rPr>
+        <w:t>bot_links</w:t>
+      </w:r>
+      <w:r>
+        <w:rPr>
+          <w:rFonts w:ascii="Arial" w:hAnsi="Arial"/>
+          <w:b w:val="0"/>
+          <w:sz w:val="22"/>
+          <w:rtl w:val="1"/>
+          <w:rFonts w:cs="Arial"/>
+        </w:rPr>
+        <w:t xml:space="preserve"> → workspace → </w:t>
+      </w:r>
+      <w:r>
+        <w:rPr>
+          <w:rFonts w:ascii="Consolas" w:hAnsi="Consolas"/>
+          <w:b w:val="0"/>
+          <w:color w:val="B02A37"/>
+          <w:sz w:val="22"/>
+          <w:rtl w:val="1"/>
+          <w:rFonts w:cs="Consolas"/>
+        </w:rPr>
+        <w:t>workspaceDigest</w:t>
+      </w:r>
+      <w:r>
+        <w:rPr>
+          <w:rFonts w:ascii="Arial" w:hAnsi="Arial"/>
+          <w:b w:val="0"/>
+          <w:sz w:val="22"/>
+          <w:rtl w:val="1"/>
+          <w:rFonts w:cs="Arial"/>
+        </w:rPr>
+        <w:t>). זו משימת-שותף ישירה.</w:t>
+      </w:r>
+    </w:p>
+    <w:p>
+      <w:pPr>
+        <w:pStyle w:val="Heading3"/>
+        <w:bidi w:val="1"/>
+        <w:jc w:val="right"/>
+      </w:pPr>
+      <w:r>
+        <w:rPr>
+          <w:rFonts w:ascii="Arial" w:hAnsi="Arial"/>
+          <w:b w:val="0"/>
+          <w:sz w:val="24"/>
+          <w:rtl w:val="1"/>
+          <w:rFonts w:cs="Arial"/>
+        </w:rPr>
+        <w:t>13.4 Ollama (עדכון אוטומטי + נרטיב עברי, on-prem)</w:t>
+      </w:r>
+    </w:p>
+    <w:p>
+      <w:pPr>
+        <w:pStyle w:val="ListBullet"/>
+        <w:bidi w:val="1"/>
+        <w:jc w:val="right"/>
+      </w:pPr>
+      <w:r>
+        <w:rPr>
+          <w:rFonts w:ascii="Arial" w:hAnsi="Arial"/>
+          <w:b w:val="0"/>
+          <w:sz w:val="22"/>
+          <w:rtl w:val="1"/>
+          <w:rFonts w:cs="Arial"/>
+        </w:rPr>
+        <w:t>מחווט ב-</w:t>
+      </w:r>
+      <w:r>
+        <w:rPr>
+          <w:rFonts w:ascii="Consolas" w:hAnsi="Consolas"/>
+          <w:b w:val="0"/>
+          <w:color w:val="B02A37"/>
+          <w:sz w:val="22"/>
+          <w:rtl w:val="1"/>
+          <w:rFonts w:cs="Consolas"/>
+        </w:rPr>
+        <w:t>lib/ollama.ts</w:t>
+      </w:r>
+      <w:r>
+        <w:rPr>
+          <w:rFonts w:ascii="Arial" w:hAnsi="Arial"/>
+          <w:b w:val="0"/>
+          <w:sz w:val="22"/>
+          <w:rtl w:val="1"/>
+          <w:rFonts w:cs="Arial"/>
+        </w:rPr>
+        <w:t xml:space="preserve"> (</w:t>
+      </w:r>
+      <w:r>
+        <w:rPr>
+          <w:rFonts w:ascii="Arial" w:hAnsi="Arial"/>
+          <w:b/>
+          <w:sz w:val="22"/>
+          <w:rtl w:val="1"/>
+          <w:rFonts w:cs="Arial"/>
+        </w:rPr>
+        <w:t>Model Router</w:t>
+      </w:r>
+      <w:r>
+        <w:rPr>
+          <w:rFonts w:ascii="Arial" w:hAnsi="Arial"/>
+          <w:b w:val="0"/>
+          <w:sz w:val="22"/>
+          <w:rtl w:val="1"/>
+          <w:rFonts w:cs="Arial"/>
+        </w:rPr>
+        <w:t xml:space="preserve">): מנסה Ollama קודם (מקומי/חינם/פרטי), נופל ל-Claude. env: </w:t>
+      </w:r>
+      <w:r>
+        <w:rPr>
+          <w:rFonts w:ascii="Consolas" w:hAnsi="Consolas"/>
+          <w:b w:val="0"/>
+          <w:color w:val="B02A37"/>
+          <w:sz w:val="22"/>
+          <w:rtl w:val="1"/>
+          <w:rFonts w:cs="Consolas"/>
+        </w:rPr>
+        <w:t>OLLAMA_BASE_URL</w:t>
+      </w:r>
+      <w:r>
+        <w:rPr>
+          <w:rFonts w:ascii="Arial" w:hAnsi="Arial"/>
+          <w:b w:val="0"/>
+          <w:sz w:val="22"/>
+          <w:rtl w:val="1"/>
+          <w:rFonts w:cs="Arial"/>
+        </w:rPr>
+        <w:t xml:space="preserve"> (למשל </w:t>
+      </w:r>
+      <w:r>
+        <w:rPr>
+          <w:rFonts w:ascii="Consolas" w:hAnsi="Consolas"/>
+          <w:b w:val="0"/>
+          <w:color w:val="B02A37"/>
+          <w:sz w:val="22"/>
+          <w:rtl w:val="1"/>
+          <w:rFonts w:cs="Consolas"/>
+        </w:rPr>
+        <w:t>http://localhost:11434</w:t>
+      </w:r>
+      <w:r>
+        <w:rPr>
+          <w:rFonts w:ascii="Arial" w:hAnsi="Arial"/>
+          <w:b w:val="0"/>
+          <w:sz w:val="22"/>
+          <w:rtl w:val="1"/>
+          <w:rFonts w:cs="Arial"/>
+        </w:rPr>
+        <w:t xml:space="preserve">) + </w:t>
+      </w:r>
+      <w:r>
+        <w:rPr>
+          <w:rFonts w:ascii="Consolas" w:hAnsi="Consolas"/>
+          <w:b w:val="0"/>
+          <w:color w:val="B02A37"/>
+          <w:sz w:val="22"/>
+          <w:rtl w:val="1"/>
+          <w:rFonts w:cs="Consolas"/>
+        </w:rPr>
+        <w:t>OLLAMA_MODEL</w:t>
+      </w:r>
+      <w:r>
+        <w:rPr>
+          <w:rFonts w:ascii="Arial" w:hAnsi="Arial"/>
+          <w:b w:val="0"/>
+          <w:sz w:val="22"/>
+          <w:rtl w:val="1"/>
+          <w:rFonts w:cs="Arial"/>
+        </w:rPr>
+        <w:t xml:space="preserve"> (למשל </w:t>
+      </w:r>
+      <w:r>
+        <w:rPr>
+          <w:rFonts w:ascii="Consolas" w:hAnsi="Consolas"/>
+          <w:b w:val="0"/>
+          <w:color w:val="B02A37"/>
+          <w:sz w:val="22"/>
+          <w:rtl w:val="1"/>
+          <w:rFonts w:cs="Consolas"/>
+        </w:rPr>
+        <w:t>llama3.1</w:t>
+      </w:r>
+      <w:r>
+        <w:rPr>
+          <w:rFonts w:ascii="Arial" w:hAnsi="Arial"/>
+          <w:b w:val="0"/>
+          <w:sz w:val="22"/>
+          <w:rtl w:val="1"/>
+          <w:rFonts w:cs="Arial"/>
+        </w:rPr>
+        <w:t>). אם לא מוגדר — נופל ל-</w:t>
+      </w:r>
+      <w:r>
+        <w:rPr>
+          <w:rFonts w:ascii="Consolas" w:hAnsi="Consolas"/>
+          <w:b w:val="0"/>
+          <w:color w:val="B02A37"/>
+          <w:sz w:val="22"/>
+          <w:rtl w:val="1"/>
+          <w:rFonts w:cs="Consolas"/>
+        </w:rPr>
+        <w:t>ANTHROPIC_API_KEY</w:t>
+      </w:r>
+      <w:r>
+        <w:rPr>
+          <w:rFonts w:ascii="Arial" w:hAnsi="Arial"/>
+          <w:b w:val="0"/>
+          <w:sz w:val="22"/>
+          <w:rtl w:val="1"/>
+          <w:rFonts w:cs="Arial"/>
+        </w:rPr>
+        <w:t>.</w:t>
+      </w:r>
+    </w:p>
+    <w:p>
+      <w:pPr>
+        <w:pStyle w:val="ListBullet"/>
+        <w:bidi w:val="1"/>
+        <w:jc w:val="right"/>
+      </w:pPr>
+      <w:r>
+        <w:rPr>
+          <w:rFonts w:ascii="Arial" w:hAnsi="Arial"/>
+          <w:b w:val="0"/>
+          <w:sz w:val="22"/>
+          <w:rtl w:val="1"/>
+          <w:rFonts w:cs="Arial"/>
+        </w:rPr>
+        <w:t>הנרטיב של ה-digest/בוט (</w:t>
+      </w:r>
+      <w:r>
+        <w:rPr>
+          <w:rFonts w:ascii="Consolas" w:hAnsi="Consolas"/>
+          <w:b w:val="0"/>
+          <w:color w:val="B02A37"/>
+          <w:sz w:val="22"/>
+          <w:rtl w:val="1"/>
+          <w:rFonts w:cs="Consolas"/>
+        </w:rPr>
+        <w:t>lib/digest.ts</w:t>
+      </w:r>
+      <w:r>
+        <w:rPr>
+          <w:rFonts w:ascii="Arial" w:hAnsi="Arial"/>
+          <w:b w:val="0"/>
+          <w:sz w:val="22"/>
+          <w:rtl w:val="1"/>
+          <w:rFonts w:cs="Arial"/>
+        </w:rPr>
+        <w:t xml:space="preserve">) עובר דרך ה-router. </w:t>
+      </w:r>
+      <w:r>
+        <w:rPr>
+          <w:rFonts w:ascii="Arial" w:hAnsi="Arial"/>
+          <w:b/>
+          <w:sz w:val="22"/>
+          <w:rtl w:val="1"/>
+          <w:rFonts w:cs="Arial"/>
+        </w:rPr>
+        <w:t>לפרטיות on-prem:</w:t>
+      </w:r>
+      <w:r>
+        <w:rPr>
+          <w:rFonts w:ascii="Arial" w:hAnsi="Arial"/>
+          <w:b w:val="0"/>
+          <w:sz w:val="22"/>
+          <w:rtl w:val="1"/>
+          <w:rFonts w:cs="Arial"/>
+        </w:rPr>
+        <w:t xml:space="preserve"> מריצים Ollama אצל הלקוח; אין יציאת-דאטה. (מתחבר לתפיסת "HELIX Runner" ממוצר 6.)</w:t>
+      </w:r>
+    </w:p>
+    <w:p>
+      <w:pPr>
+        <w:pStyle w:val="Heading3"/>
+        <w:bidi w:val="1"/>
+        <w:jc w:val="right"/>
+      </w:pPr>
+      <w:r>
+        <w:rPr>
+          <w:rFonts w:ascii="Arial" w:hAnsi="Arial"/>
+          <w:b w:val="0"/>
+          <w:sz w:val="24"/>
+          <w:rtl w:val="1"/>
+          <w:rFonts w:cs="Arial"/>
+        </w:rPr>
+        <w:t>13.5 Cron + טלגרם (כבר מוכן)</w:t>
+      </w:r>
+    </w:p>
+    <w:p>
+      <w:pPr>
+        <w:pStyle w:val="ListBullet"/>
+        <w:bidi w:val="1"/>
+        <w:jc w:val="right"/>
+      </w:pPr>
+      <w:r>
+        <w:rPr>
+          <w:rFonts w:ascii="Consolas" w:hAnsi="Consolas"/>
+          <w:b w:val="0"/>
+          <w:color w:val="B02A37"/>
+          <w:sz w:val="22"/>
+          <w:rtl w:val="1"/>
+          <w:rFonts w:cs="Consolas"/>
+        </w:rPr>
+        <w:t>vercel.json</w:t>
+      </w:r>
+      <w:r>
+        <w:rPr>
+          <w:rFonts w:ascii="Arial" w:hAnsi="Arial"/>
+          <w:b w:val="0"/>
+          <w:sz w:val="22"/>
+          <w:rtl w:val="1"/>
+          <w:rFonts w:cs="Arial"/>
+        </w:rPr>
+        <w:t xml:space="preserve"> מגדיר 2 crons: </w:t>
+      </w:r>
+      <w:r>
+        <w:rPr>
+          <w:rFonts w:ascii="Consolas" w:hAnsi="Consolas"/>
+          <w:b w:val="0"/>
+          <w:color w:val="B02A37"/>
+          <w:sz w:val="22"/>
+          <w:rtl w:val="1"/>
+          <w:rFonts w:cs="Consolas"/>
+        </w:rPr>
+        <w:t>/api/cron/sync</w:t>
+      </w:r>
+      <w:r>
+        <w:rPr>
+          <w:rFonts w:ascii="Arial" w:hAnsi="Arial"/>
+          <w:b w:val="0"/>
+          <w:sz w:val="22"/>
+          <w:rtl w:val="1"/>
+          <w:rFonts w:cs="Arial"/>
+        </w:rPr>
+        <w:t xml:space="preserve"> (יומי — רענון connectors) ו-</w:t>
+      </w:r>
+      <w:r>
+        <w:rPr>
+          <w:rFonts w:ascii="Consolas" w:hAnsi="Consolas"/>
+          <w:b w:val="0"/>
+          <w:color w:val="B02A37"/>
+          <w:sz w:val="22"/>
+          <w:rtl w:val="1"/>
+          <w:rFonts w:cs="Consolas"/>
+        </w:rPr>
+        <w:t>/api/cron/digest</w:t>
+      </w:r>
+      <w:r>
+        <w:rPr>
+          <w:rFonts w:ascii="Arial" w:hAnsi="Arial"/>
+          <w:b w:val="0"/>
+          <w:sz w:val="22"/>
+          <w:rtl w:val="1"/>
+          <w:rFonts w:cs="Arial"/>
+        </w:rPr>
+        <w:t xml:space="preserve"> (שעתי — שליחת מנויי-digest). env: </w:t>
+      </w:r>
+      <w:r>
+        <w:rPr>
+          <w:rFonts w:ascii="Consolas" w:hAnsi="Consolas"/>
+          <w:b w:val="0"/>
+          <w:color w:val="B02A37"/>
+          <w:sz w:val="22"/>
+          <w:rtl w:val="1"/>
+          <w:rFonts w:cs="Consolas"/>
+        </w:rPr>
+        <w:t>CRON_SECRET</w:t>
+      </w:r>
+      <w:r>
+        <w:rPr>
+          <w:rFonts w:ascii="Arial" w:hAnsi="Arial"/>
+          <w:b w:val="0"/>
+          <w:sz w:val="22"/>
+          <w:rtl w:val="1"/>
+          <w:rFonts w:cs="Arial"/>
+        </w:rPr>
+        <w:t>.</w:t>
+      </w:r>
+    </w:p>
+    <w:p>
+      <w:pPr>
+        <w:pStyle w:val="ListBullet"/>
+        <w:bidi w:val="1"/>
+        <w:jc w:val="right"/>
+      </w:pPr>
+      <w:r>
+        <w:rPr>
+          <w:rFonts w:ascii="Arial" w:hAnsi="Arial"/>
+          <w:b w:val="0"/>
+          <w:sz w:val="22"/>
+          <w:rtl w:val="1"/>
+          <w:rFonts w:cs="Arial"/>
+        </w:rPr>
+        <w:t xml:space="preserve">טלגרם: </w:t>
+      </w:r>
+      <w:r>
+        <w:rPr>
+          <w:rFonts w:ascii="Consolas" w:hAnsi="Consolas"/>
+          <w:b w:val="0"/>
+          <w:color w:val="B02A37"/>
+          <w:sz w:val="22"/>
+          <w:rtl w:val="1"/>
+          <w:rFonts w:cs="Consolas"/>
+        </w:rPr>
+        <w:t>TELEGRAM_BOT_TOKEN</w:t>
+      </w:r>
+      <w:r>
+        <w:rPr>
+          <w:rFonts w:ascii="Arial" w:hAnsi="Arial"/>
+          <w:b w:val="0"/>
+          <w:sz w:val="22"/>
+          <w:rtl w:val="1"/>
+          <w:rFonts w:cs="Arial"/>
+        </w:rPr>
+        <w:t xml:space="preserve"> + הצבעת webhook ל-</w:t>
+      </w:r>
+      <w:r>
+        <w:rPr>
+          <w:rFonts w:ascii="Consolas" w:hAnsi="Consolas"/>
+          <w:b w:val="0"/>
+          <w:color w:val="B02A37"/>
+          <w:sz w:val="22"/>
+          <w:rtl w:val="1"/>
+          <w:rFonts w:cs="Consolas"/>
+        </w:rPr>
+        <w:t>/api/telegram</w:t>
+      </w:r>
+      <w:r>
+        <w:rPr>
+          <w:rFonts w:ascii="Arial" w:hAnsi="Arial"/>
+          <w:b w:val="0"/>
+          <w:sz w:val="22"/>
+          <w:rtl w:val="1"/>
+          <w:rFonts w:cs="Arial"/>
+        </w:rPr>
+        <w:t xml:space="preserve">. חיבור צ׳אט לנתונים אמיתיים דרך </w:t>
+      </w:r>
+      <w:r>
+        <w:rPr>
+          <w:rFonts w:ascii="Consolas" w:hAnsi="Consolas"/>
+          <w:b w:val="0"/>
+          <w:color w:val="B02A37"/>
+          <w:sz w:val="22"/>
+          <w:rtl w:val="1"/>
+          <w:rFonts w:cs="Consolas"/>
+        </w:rPr>
+        <w:t>/digest</w:t>
+      </w:r>
+      <w:r>
+        <w:rPr>
+          <w:rFonts w:ascii="Arial" w:hAnsi="Arial"/>
+          <w:b w:val="0"/>
+          <w:sz w:val="22"/>
+          <w:rtl w:val="1"/>
+          <w:rFonts w:cs="Arial"/>
+        </w:rPr>
+        <w:t>.</w:t>
+      </w:r>
+    </w:p>
+    <w:p>
+      <w:pPr>
+        <w:pStyle w:val="Heading3"/>
+        <w:bidi w:val="1"/>
+        <w:jc w:val="right"/>
+      </w:pPr>
+      <w:r>
+        <w:rPr>
+          <w:rFonts w:ascii="Arial" w:hAnsi="Arial"/>
+          <w:b w:val="0"/>
+          <w:sz w:val="24"/>
+          <w:rtl w:val="1"/>
+          <w:rFonts w:cs="Arial"/>
+        </w:rPr>
+        <w:t>13.6 טבלת env מלאה (מה השותף צריך למלא)</w:t>
+      </w:r>
+    </w:p>
+    <w:tbl>
+      <w:tblPr>
+        <w:tblStyle w:val="LightGrid-Accent1"/>
+        <w:tblW w:type="auto" w:w="0"/>
+        <w:tblLook w:firstColumn="1" w:firstRow="1" w:lastColumn="0" w:lastRow="0" w:noHBand="0" w:noVBand="1" w:val="04A0"/>
+        <w:bidiVisual/>
+      </w:tblPr>
+      <w:tblGrid>
+        <w:gridCol w:w="2880"/>
+        <w:gridCol w:w="2880"/>
+        <w:gridCol w:w="2880"/>
+      </w:tblGrid>
+      <w:tr>
+        <w:tc>
+          <w:tcPr>
+            <w:tcW w:type="dxa" w:w="2880"/>
+          </w:tcPr>
+          <w:p>
+            <w:pPr>
+              <w:bidi w:val="1"/>
+              <w:jc w:val="right"/>
+            </w:pPr>
+            <w:r>
+              <w:rPr>
+                <w:rFonts w:ascii="Arial" w:hAnsi="Arial"/>
+                <w:b/>
+                <w:sz w:val="20"/>
+                <w:rtl w:val="1"/>
+                <w:rFonts w:cs="Arial"/>
+              </w:rPr>
+              <w:t>משתנה</w:t>
+            </w:r>
+          </w:p>
+        </w:tc>
+        <w:tc>
+          <w:tcPr>
+            <w:tcW w:type="dxa" w:w="2880"/>
+          </w:tcPr>
+          <w:p>
+            <w:pPr>
+              <w:bidi w:val="1"/>
+              <w:jc w:val="right"/>
+            </w:pPr>
+            <w:r>
+              <w:rPr>
+                <w:rFonts w:ascii="Arial" w:hAnsi="Arial"/>
+                <w:b/>
+                <w:sz w:val="20"/>
+                <w:rtl w:val="1"/>
+                <w:rFonts w:cs="Arial"/>
+              </w:rPr>
+              <w:t>לְמה</w:t>
+            </w:r>
+          </w:p>
+        </w:tc>
+        <w:tc>
+          <w:tcPr>
+            <w:tcW w:type="dxa" w:w="2880"/>
+          </w:tcPr>
+          <w:p>
+            <w:pPr>
+              <w:bidi w:val="1"/>
+              <w:jc w:val="right"/>
+            </w:pPr>
+            <w:r>
+              <w:rPr>
+                <w:rFonts w:ascii="Arial" w:hAnsi="Arial"/>
+                <w:b/>
+                <w:sz w:val="20"/>
+                <w:rtl w:val="1"/>
+                <w:rFonts w:cs="Arial"/>
+              </w:rPr>
+              <w:t>חובה?</w:t>
+            </w:r>
+          </w:p>
+        </w:tc>
+      </w:tr>
+      <w:tr>
+        <w:tc>
+          <w:tcPr>
+            <w:tcW w:type="dxa" w:w="2880"/>
+          </w:tcPr>
+          <w:p>
+            <w:pPr>
+              <w:bidi w:val="1"/>
+              <w:jc w:val="right"/>
+            </w:pPr>
+            <w:r>
+              <w:rPr>
+                <w:rFonts w:ascii="Consolas" w:hAnsi="Consolas"/>
+                <w:b w:val="0"/>
+                <w:color w:val="B02A37"/>
+                <w:sz w:val="20"/>
+                <w:rtl w:val="1"/>
+                <w:rFonts w:cs="Consolas"/>
+              </w:rPr>
+              <w:t>NEXT_PUBLIC_SUPABASE_URL</w:t>
+            </w:r>
+            <w:r>
+              <w:rPr>
+                <w:rFonts w:ascii="Arial" w:hAnsi="Arial"/>
+                <w:b w:val="0"/>
+                <w:sz w:val="20"/>
+                <w:rtl w:val="1"/>
+                <w:rFonts w:cs="Arial"/>
+              </w:rPr>
+              <w:t xml:space="preserve"> / </w:t>
+            </w:r>
+            <w:r>
+              <w:rPr>
+                <w:rFonts w:ascii="Consolas" w:hAnsi="Consolas"/>
+                <w:b w:val="0"/>
+                <w:color w:val="B02A37"/>
+                <w:sz w:val="20"/>
+                <w:rtl w:val="1"/>
+                <w:rFonts w:cs="Consolas"/>
+              </w:rPr>
+              <w:t>NEXT_PUBLIC_SUPABASE_ANON_KEY</w:t>
+            </w:r>
+          </w:p>
+        </w:tc>
+        <w:tc>
+          <w:tcPr>
+            <w:tcW w:type="dxa" w:w="2880"/>
+          </w:tcPr>
+          <w:p>
+            <w:pPr>
+              <w:bidi w:val="1"/>
+              <w:jc w:val="right"/>
+            </w:pPr>
+            <w:r>
+              <w:rPr>
+                <w:rFonts w:ascii="Arial" w:hAnsi="Arial"/>
+                <w:b w:val="0"/>
+                <w:sz w:val="20"/>
+                <w:rtl w:val="1"/>
+                <w:rFonts w:cs="Arial"/>
+              </w:rPr>
+              <w:t>Supabase (client/auth)</w:t>
+            </w:r>
+          </w:p>
+        </w:tc>
+        <w:tc>
+          <w:tcPr>
+            <w:tcW w:type="dxa" w:w="2880"/>
+          </w:tcPr>
+          <w:p>
+            <w:pPr>
+              <w:bidi w:val="1"/>
+              <w:jc w:val="right"/>
+            </w:pPr>
+            <w:r>
+              <w:rPr>
+                <w:rFonts w:ascii="Arial" w:hAnsi="Arial"/>
+                <w:b w:val="0"/>
+                <w:sz w:val="20"/>
+                <w:rtl w:val="1"/>
+                <w:rFonts w:cs="Arial"/>
+              </w:rPr>
+              <w:t>✅</w:t>
+            </w:r>
+          </w:p>
+        </w:tc>
+      </w:tr>
+      <w:tr>
+        <w:tc>
+          <w:tcPr>
+            <w:tcW w:type="dxa" w:w="2880"/>
+          </w:tcPr>
+          <w:p>
+            <w:pPr>
+              <w:bidi w:val="1"/>
+              <w:jc w:val="right"/>
+            </w:pPr>
+            <w:r>
+              <w:rPr>
+                <w:rFonts w:ascii="Consolas" w:hAnsi="Consolas"/>
+                <w:b w:val="0"/>
+                <w:color w:val="B02A37"/>
+                <w:sz w:val="20"/>
+                <w:rtl w:val="1"/>
+                <w:rFonts w:cs="Consolas"/>
+              </w:rPr>
+              <w:t>SUPABASE_SERVICE_ROLE_KEY</w:t>
+            </w:r>
+          </w:p>
+        </w:tc>
+        <w:tc>
+          <w:tcPr>
+            <w:tcW w:type="dxa" w:w="2880"/>
+          </w:tcPr>
+          <w:p>
+            <w:pPr>
+              <w:bidi w:val="1"/>
+              <w:jc w:val="right"/>
+            </w:pPr>
+            <w:r>
+              <w:rPr>
+                <w:rFonts w:ascii="Arial" w:hAnsi="Arial"/>
+                <w:b w:val="0"/>
+                <w:sz w:val="20"/>
+                <w:rtl w:val="1"/>
+                <w:rFonts w:cs="Arial"/>
+              </w:rPr>
+              <w:t>cron/בוט (עקיפת RLS)</w:t>
+            </w:r>
+          </w:p>
+        </w:tc>
+        <w:tc>
+          <w:tcPr>
+            <w:tcW w:type="dxa" w:w="2880"/>
+          </w:tcPr>
+          <w:p>
+            <w:pPr>
+              <w:bidi w:val="1"/>
+              <w:jc w:val="right"/>
+            </w:pPr>
+            <w:r>
+              <w:rPr>
+                <w:rFonts w:ascii="Arial" w:hAnsi="Arial"/>
+                <w:b w:val="0"/>
+                <w:sz w:val="20"/>
+                <w:rtl w:val="1"/>
+                <w:rFonts w:cs="Arial"/>
+              </w:rPr>
+              <w:t>✅</w:t>
+            </w:r>
+          </w:p>
+        </w:tc>
+      </w:tr>
+      <w:tr>
+        <w:tc>
+          <w:tcPr>
+            <w:tcW w:type="dxa" w:w="2880"/>
+          </w:tcPr>
+          <w:p>
+            <w:pPr>
+              <w:bidi w:val="1"/>
+              <w:jc w:val="right"/>
+            </w:pPr>
+            <w:r>
+              <w:rPr>
+                <w:rFonts w:ascii="Consolas" w:hAnsi="Consolas"/>
+                <w:b w:val="0"/>
+                <w:color w:val="B02A37"/>
+                <w:sz w:val="20"/>
+                <w:rtl w:val="1"/>
+                <w:rFonts w:cs="Consolas"/>
+              </w:rPr>
+              <w:t>NEXT_PUBLIC_SITE_URL</w:t>
+            </w:r>
+          </w:p>
+        </w:tc>
+        <w:tc>
+          <w:tcPr>
+            <w:tcW w:type="dxa" w:w="2880"/>
+          </w:tcPr>
+          <w:p>
+            <w:pPr>
+              <w:bidi w:val="1"/>
+              <w:jc w:val="right"/>
+            </w:pPr>
+            <w:r>
+              <w:rPr>
+                <w:rFonts w:ascii="Arial" w:hAnsi="Arial"/>
+                <w:b w:val="0"/>
+                <w:sz w:val="20"/>
+                <w:rtl w:val="1"/>
+                <w:rFonts w:cs="Arial"/>
+              </w:rPr>
+              <w:t>redirect ל-magic-link</w:t>
+            </w:r>
+          </w:p>
+        </w:tc>
+        <w:tc>
+          <w:tcPr>
+            <w:tcW w:type="dxa" w:w="2880"/>
+          </w:tcPr>
+          <w:p>
+            <w:pPr>
+              <w:bidi w:val="1"/>
+              <w:jc w:val="right"/>
+            </w:pPr>
+            <w:r>
+              <w:rPr>
+                <w:rFonts w:ascii="Arial" w:hAnsi="Arial"/>
+                <w:b w:val="0"/>
+                <w:sz w:val="20"/>
+                <w:rtl w:val="1"/>
+                <w:rFonts w:cs="Arial"/>
+              </w:rPr>
+              <w:t>✅</w:t>
+            </w:r>
+          </w:p>
+        </w:tc>
+      </w:tr>
+      <w:tr>
+        <w:tc>
+          <w:tcPr>
+            <w:tcW w:type="dxa" w:w="2880"/>
+          </w:tcPr>
+          <w:p>
+            <w:pPr>
+              <w:bidi w:val="1"/>
+              <w:jc w:val="right"/>
+            </w:pPr>
+            <w:r>
+              <w:rPr>
+                <w:rFonts w:ascii="Consolas" w:hAnsi="Consolas"/>
+                <w:b w:val="0"/>
+                <w:color w:val="B02A37"/>
+                <w:sz w:val="20"/>
+                <w:rtl w:val="1"/>
+                <w:rFonts w:cs="Consolas"/>
+              </w:rPr>
+              <w:t>SECRETS_KEY</w:t>
+            </w:r>
+          </w:p>
+        </w:tc>
+        <w:tc>
+          <w:tcPr>
+            <w:tcW w:type="dxa" w:w="2880"/>
+          </w:tcPr>
+          <w:p>
+            <w:pPr>
+              <w:bidi w:val="1"/>
+              <w:jc w:val="right"/>
+            </w:pPr>
+            <w:r>
+              <w:rPr>
+                <w:rFonts w:ascii="Arial" w:hAnsi="Arial"/>
+                <w:b w:val="0"/>
+                <w:sz w:val="20"/>
+                <w:rtl w:val="1"/>
+                <w:rFonts w:cs="Arial"/>
+              </w:rPr>
+              <w:t>הצפנת טוקנים ב-</w:t>
+            </w:r>
+            <w:r>
+              <w:rPr>
+                <w:rFonts w:ascii="Consolas" w:hAnsi="Consolas"/>
+                <w:b w:val="0"/>
+                <w:color w:val="B02A37"/>
+                <w:sz w:val="20"/>
+                <w:rtl w:val="1"/>
+                <w:rFonts w:cs="Consolas"/>
+              </w:rPr>
+              <w:t>connections.config</w:t>
+            </w:r>
+          </w:p>
+        </w:tc>
+        <w:tc>
+          <w:tcPr>
+            <w:tcW w:type="dxa" w:w="2880"/>
+          </w:tcPr>
+          <w:p>
+            <w:pPr>
+              <w:bidi w:val="1"/>
+              <w:jc w:val="right"/>
+            </w:pPr>
+            <w:r>
+              <w:rPr>
+                <w:rFonts w:ascii="Arial" w:hAnsi="Arial"/>
+                <w:b w:val="0"/>
+                <w:sz w:val="20"/>
+                <w:rtl w:val="1"/>
+                <w:rFonts w:cs="Arial"/>
+              </w:rPr>
+              <w:t>✅ (מומלץ)</w:t>
+            </w:r>
+          </w:p>
+        </w:tc>
+      </w:tr>
+      <w:tr>
+        <w:tc>
+          <w:tcPr>
+            <w:tcW w:type="dxa" w:w="2880"/>
+          </w:tcPr>
+          <w:p>
+            <w:pPr>
+              <w:bidi w:val="1"/>
+              <w:jc w:val="right"/>
+            </w:pPr>
+            <w:r>
+              <w:rPr>
+                <w:rFonts w:ascii="Consolas" w:hAnsi="Consolas"/>
+                <w:b w:val="0"/>
+                <w:color w:val="B02A37"/>
+                <w:sz w:val="20"/>
+                <w:rtl w:val="1"/>
+                <w:rFonts w:cs="Consolas"/>
+              </w:rPr>
+              <w:t>GOOGLE_OAUTH_CLIENT_ID/SECRET/REDIRECT_URI</w:t>
+            </w:r>
+          </w:p>
+        </w:tc>
+        <w:tc>
+          <w:tcPr>
+            <w:tcW w:type="dxa" w:w="2880"/>
+          </w:tcPr>
+          <w:p>
+            <w:pPr>
+              <w:bidi w:val="1"/>
+              <w:jc w:val="right"/>
+            </w:pPr>
+            <w:r>
+              <w:rPr>
+                <w:rFonts w:ascii="Arial" w:hAnsi="Arial"/>
+                <w:b w:val="0"/>
+                <w:sz w:val="20"/>
+                <w:rtl w:val="1"/>
+                <w:rFonts w:cs="Arial"/>
+              </w:rPr>
+              <w:t>connector GA4</w:t>
+            </w:r>
+          </w:p>
+        </w:tc>
+        <w:tc>
+          <w:tcPr>
+            <w:tcW w:type="dxa" w:w="2880"/>
+          </w:tcPr>
+          <w:p>
+            <w:pPr>
+              <w:bidi w:val="1"/>
+              <w:jc w:val="right"/>
+            </w:pPr>
+            <w:r>
+              <w:rPr>
+                <w:rFonts w:ascii="Arial" w:hAnsi="Arial"/>
+                <w:b w:val="0"/>
+                <w:sz w:val="20"/>
+                <w:rtl w:val="1"/>
+                <w:rFonts w:cs="Arial"/>
+              </w:rPr>
+              <w:t>לפי צורך</w:t>
+            </w:r>
+          </w:p>
+        </w:tc>
+      </w:tr>
+      <w:tr>
+        <w:tc>
+          <w:tcPr>
+            <w:tcW w:type="dxa" w:w="2880"/>
+          </w:tcPr>
+          <w:p>
+            <w:pPr>
+              <w:bidi w:val="1"/>
+              <w:jc w:val="right"/>
+            </w:pPr>
+            <w:r>
+              <w:rPr>
+                <w:rFonts w:ascii="Consolas" w:hAnsi="Consolas"/>
+                <w:b w:val="0"/>
+                <w:color w:val="B02A37"/>
+                <w:sz w:val="20"/>
+                <w:rtl w:val="1"/>
+                <w:rFonts w:cs="Consolas"/>
+              </w:rPr>
+              <w:t>OLLAMA_BASE_URL</w:t>
+            </w:r>
+            <w:r>
+              <w:rPr>
+                <w:rFonts w:ascii="Arial" w:hAnsi="Arial"/>
+                <w:b w:val="0"/>
+                <w:sz w:val="20"/>
+                <w:rtl w:val="1"/>
+                <w:rFonts w:cs="Arial"/>
+              </w:rPr>
+              <w:t xml:space="preserve"> / </w:t>
+            </w:r>
+            <w:r>
+              <w:rPr>
+                <w:rFonts w:ascii="Consolas" w:hAnsi="Consolas"/>
+                <w:b w:val="0"/>
+                <w:color w:val="B02A37"/>
+                <w:sz w:val="20"/>
+                <w:rtl w:val="1"/>
+                <w:rFonts w:cs="Consolas"/>
+              </w:rPr>
+              <w:t>OLLAMA_MODEL</w:t>
+            </w:r>
+          </w:p>
+        </w:tc>
+        <w:tc>
+          <w:tcPr>
+            <w:tcW w:type="dxa" w:w="2880"/>
+          </w:tcPr>
+          <w:p>
+            <w:pPr>
+              <w:bidi w:val="1"/>
+              <w:jc w:val="right"/>
+            </w:pPr>
+            <w:r>
+              <w:rPr>
+                <w:rFonts w:ascii="Arial" w:hAnsi="Arial"/>
+                <w:b w:val="0"/>
+                <w:sz w:val="20"/>
+                <w:rtl w:val="1"/>
+                <w:rFonts w:cs="Arial"/>
+              </w:rPr>
+              <w:t>נרטיב מקומי</w:t>
+            </w:r>
+          </w:p>
+        </w:tc>
+        <w:tc>
+          <w:tcPr>
+            <w:tcW w:type="dxa" w:w="2880"/>
+          </w:tcPr>
+          <w:p>
+            <w:pPr>
+              <w:bidi w:val="1"/>
+              <w:jc w:val="right"/>
+            </w:pPr>
+            <w:r>
+              <w:rPr>
+                <w:rFonts w:ascii="Arial" w:hAnsi="Arial"/>
+                <w:b w:val="0"/>
+                <w:sz w:val="20"/>
+                <w:rtl w:val="1"/>
+                <w:rFonts w:cs="Arial"/>
+              </w:rPr>
+              <w:t>אחד מהשניים</w:t>
+            </w:r>
+          </w:p>
+        </w:tc>
+      </w:tr>
+      <w:tr>
+        <w:tc>
+          <w:tcPr>
+            <w:tcW w:type="dxa" w:w="2880"/>
+          </w:tcPr>
+          <w:p>
+            <w:pPr>
+              <w:bidi w:val="1"/>
+              <w:jc w:val="right"/>
+            </w:pPr>
+            <w:r>
+              <w:rPr>
+                <w:rFonts w:ascii="Consolas" w:hAnsi="Consolas"/>
+                <w:b w:val="0"/>
+                <w:color w:val="B02A37"/>
+                <w:sz w:val="20"/>
+                <w:rtl w:val="1"/>
+                <w:rFonts w:cs="Consolas"/>
+              </w:rPr>
+              <w:t>ANTHROPIC_API_KEY</w:t>
+            </w:r>
+          </w:p>
+        </w:tc>
+        <w:tc>
+          <w:tcPr>
+            <w:tcW w:type="dxa" w:w="2880"/>
+          </w:tcPr>
+          <w:p>
+            <w:pPr>
+              <w:bidi w:val="1"/>
+              <w:jc w:val="right"/>
+            </w:pPr>
+            <w:r>
+              <w:rPr>
+                <w:rFonts w:ascii="Arial" w:hAnsi="Arial"/>
+                <w:b w:val="0"/>
+                <w:sz w:val="20"/>
+                <w:rtl w:val="1"/>
+                <w:rFonts w:cs="Arial"/>
+              </w:rPr>
+              <w:t>נרטיב fallback</w:t>
+            </w:r>
+          </w:p>
+        </w:tc>
+        <w:tc>
+          <w:tcPr>
+            <w:tcW w:type="dxa" w:w="2880"/>
+          </w:tcPr>
+          <w:p>
+            <w:pPr>
+              <w:bidi w:val="1"/>
+              <w:jc w:val="right"/>
+            </w:pPr>
+            <w:r>
+              <w:rPr>
+                <w:rFonts w:ascii="Arial" w:hAnsi="Arial"/>
+                <w:b w:val="0"/>
+                <w:sz w:val="20"/>
+                <w:rtl w:val="1"/>
+                <w:rFonts w:cs="Arial"/>
+              </w:rPr>
+              <w:t>אחד מהשניים</w:t>
+            </w:r>
+          </w:p>
+        </w:tc>
+      </w:tr>
+      <w:tr>
+        <w:tc>
+          <w:tcPr>
+            <w:tcW w:type="dxa" w:w="2880"/>
+          </w:tcPr>
+          <w:p>
+            <w:pPr>
+              <w:bidi w:val="1"/>
+              <w:jc w:val="right"/>
+            </w:pPr>
+            <w:r>
+              <w:rPr>
+                <w:rFonts w:ascii="Consolas" w:hAnsi="Consolas"/>
+                <w:b w:val="0"/>
+                <w:color w:val="B02A37"/>
+                <w:sz w:val="20"/>
+                <w:rtl w:val="1"/>
+                <w:rFonts w:cs="Consolas"/>
+              </w:rPr>
+              <w:t>TELEGRAM_BOT_TOKEN</w:t>
+            </w:r>
+          </w:p>
+        </w:tc>
+        <w:tc>
+          <w:tcPr>
+            <w:tcW w:type="dxa" w:w="2880"/>
+          </w:tcPr>
+          <w:p>
+            <w:pPr>
+              <w:bidi w:val="1"/>
+              <w:jc w:val="right"/>
+            </w:pPr>
+            <w:r>
+              <w:rPr>
+                <w:rFonts w:ascii="Arial" w:hAnsi="Arial"/>
+                <w:b w:val="0"/>
+                <w:sz w:val="20"/>
+                <w:rtl w:val="1"/>
+                <w:rFonts w:cs="Arial"/>
+              </w:rPr>
+              <w:t>בוט טלגרם</w:t>
+            </w:r>
+          </w:p>
+        </w:tc>
+        <w:tc>
+          <w:tcPr>
+            <w:tcW w:type="dxa" w:w="2880"/>
+          </w:tcPr>
+          <w:p>
+            <w:pPr>
+              <w:bidi w:val="1"/>
+              <w:jc w:val="right"/>
+            </w:pPr>
+            <w:r>
+              <w:rPr>
+                <w:rFonts w:ascii="Arial" w:hAnsi="Arial"/>
+                <w:b w:val="0"/>
+                <w:sz w:val="20"/>
+                <w:rtl w:val="1"/>
+                <w:rFonts w:cs="Arial"/>
+              </w:rPr>
+              <w:t>לפי צורך</w:t>
+            </w:r>
+          </w:p>
+        </w:tc>
+      </w:tr>
+      <w:tr>
+        <w:tc>
+          <w:tcPr>
+            <w:tcW w:type="dxa" w:w="2880"/>
+          </w:tcPr>
+          <w:p>
+            <w:pPr>
+              <w:bidi w:val="1"/>
+              <w:jc w:val="right"/>
+            </w:pPr>
+            <w:r>
+              <w:rPr>
+                <w:rFonts w:ascii="Consolas" w:hAnsi="Consolas"/>
+                <w:b w:val="0"/>
+                <w:color w:val="B02A37"/>
+                <w:sz w:val="20"/>
+                <w:rtl w:val="1"/>
+                <w:rFonts w:cs="Consolas"/>
+              </w:rPr>
+              <w:t>WHATSAPP_TOKEN</w:t>
+            </w:r>
+            <w:r>
+              <w:rPr>
+                <w:rFonts w:ascii="Arial" w:hAnsi="Arial"/>
+                <w:b w:val="0"/>
+                <w:sz w:val="20"/>
+                <w:rtl w:val="1"/>
+                <w:rFonts w:cs="Arial"/>
+              </w:rPr>
+              <w:t xml:space="preserve"> / </w:t>
+            </w:r>
+            <w:r>
+              <w:rPr>
+                <w:rFonts w:ascii="Consolas" w:hAnsi="Consolas"/>
+                <w:b w:val="0"/>
+                <w:color w:val="B02A37"/>
+                <w:sz w:val="20"/>
+                <w:rtl w:val="1"/>
+                <w:rFonts w:cs="Consolas"/>
+              </w:rPr>
+              <w:t>WHATSAPP_PHONE_ID</w:t>
+            </w:r>
+          </w:p>
+        </w:tc>
+        <w:tc>
+          <w:tcPr>
+            <w:tcW w:type="dxa" w:w="2880"/>
+          </w:tcPr>
+          <w:p>
+            <w:pPr>
+              <w:bidi w:val="1"/>
+              <w:jc w:val="right"/>
+            </w:pPr>
+            <w:r>
+              <w:rPr>
+                <w:rFonts w:ascii="Arial" w:hAnsi="Arial"/>
+                <w:b w:val="0"/>
+                <w:sz w:val="20"/>
+                <w:rtl w:val="1"/>
+                <w:rFonts w:cs="Arial"/>
+              </w:rPr>
+              <w:t>מסירת וואטסאפ</w:t>
+            </w:r>
+          </w:p>
+        </w:tc>
+        <w:tc>
+          <w:tcPr>
+            <w:tcW w:type="dxa" w:w="2880"/>
+          </w:tcPr>
+          <w:p>
+            <w:pPr>
+              <w:bidi w:val="1"/>
+              <w:jc w:val="right"/>
+            </w:pPr>
+            <w:r>
+              <w:rPr>
+                <w:rFonts w:ascii="Arial" w:hAnsi="Arial"/>
+                <w:b w:val="0"/>
+                <w:sz w:val="20"/>
+                <w:rtl w:val="1"/>
+                <w:rFonts w:cs="Arial"/>
+              </w:rPr>
+              <w:t>לפי צורך</w:t>
+            </w:r>
+          </w:p>
+        </w:tc>
+      </w:tr>
+      <w:tr>
+        <w:tc>
+          <w:tcPr>
+            <w:tcW w:type="dxa" w:w="2880"/>
+          </w:tcPr>
+          <w:p>
+            <w:pPr>
+              <w:bidi w:val="1"/>
+              <w:jc w:val="right"/>
+            </w:pPr>
+            <w:r>
+              <w:rPr>
+                <w:rFonts w:ascii="Consolas" w:hAnsi="Consolas"/>
+                <w:b w:val="0"/>
+                <w:color w:val="B02A37"/>
+                <w:sz w:val="20"/>
+                <w:rtl w:val="1"/>
+                <w:rFonts w:cs="Consolas"/>
+              </w:rPr>
+              <w:t>RESEND_API_KEY</w:t>
+            </w:r>
+            <w:r>
+              <w:rPr>
+                <w:rFonts w:ascii="Arial" w:hAnsi="Arial"/>
+                <w:b w:val="0"/>
+                <w:sz w:val="20"/>
+                <w:rtl w:val="1"/>
+                <w:rFonts w:cs="Arial"/>
+              </w:rPr>
+              <w:t xml:space="preserve"> / </w:t>
+            </w:r>
+            <w:r>
+              <w:rPr>
+                <w:rFonts w:ascii="Consolas" w:hAnsi="Consolas"/>
+                <w:b w:val="0"/>
+                <w:color w:val="B02A37"/>
+                <w:sz w:val="20"/>
+                <w:rtl w:val="1"/>
+                <w:rFonts w:cs="Consolas"/>
+              </w:rPr>
+              <w:t>EMAIL_FROM</w:t>
+            </w:r>
+          </w:p>
+        </w:tc>
+        <w:tc>
+          <w:tcPr>
+            <w:tcW w:type="dxa" w:w="2880"/>
+          </w:tcPr>
+          <w:p>
+            <w:pPr>
+              <w:bidi w:val="1"/>
+              <w:jc w:val="right"/>
+            </w:pPr>
+            <w:r>
+              <w:rPr>
+                <w:rFonts w:ascii="Arial" w:hAnsi="Arial"/>
+                <w:b w:val="0"/>
+                <w:sz w:val="20"/>
+                <w:rtl w:val="1"/>
+                <w:rFonts w:cs="Arial"/>
+              </w:rPr>
+              <w:t>מסירת מייל</w:t>
+            </w:r>
+          </w:p>
+        </w:tc>
+        <w:tc>
+          <w:tcPr>
+            <w:tcW w:type="dxa" w:w="2880"/>
+          </w:tcPr>
+          <w:p>
+            <w:pPr>
+              <w:bidi w:val="1"/>
+              <w:jc w:val="right"/>
+            </w:pPr>
+            <w:r>
+              <w:rPr>
+                <w:rFonts w:ascii="Arial" w:hAnsi="Arial"/>
+                <w:b w:val="0"/>
+                <w:sz w:val="20"/>
+                <w:rtl w:val="1"/>
+                <w:rFonts w:cs="Arial"/>
+              </w:rPr>
+              <w:t>לפי צורך</w:t>
+            </w:r>
+          </w:p>
+        </w:tc>
+      </w:tr>
+      <w:tr>
+        <w:tc>
+          <w:tcPr>
+            <w:tcW w:type="dxa" w:w="2880"/>
+          </w:tcPr>
+          <w:p>
+            <w:pPr>
+              <w:bidi w:val="1"/>
+              <w:jc w:val="right"/>
+            </w:pPr>
+            <w:r>
+              <w:rPr>
+                <w:rFonts w:ascii="Consolas" w:hAnsi="Consolas"/>
+                <w:b w:val="0"/>
+                <w:color w:val="B02A37"/>
+                <w:sz w:val="20"/>
+                <w:rtl w:val="1"/>
+                <w:rFonts w:cs="Consolas"/>
+              </w:rPr>
+              <w:t>FB_APP_ID</w:t>
+            </w:r>
+            <w:r>
+              <w:rPr>
+                <w:rFonts w:ascii="Arial" w:hAnsi="Arial"/>
+                <w:b w:val="0"/>
+                <w:sz w:val="20"/>
+                <w:rtl w:val="1"/>
+                <w:rFonts w:cs="Arial"/>
+              </w:rPr>
+              <w:t xml:space="preserve"> / </w:t>
+            </w:r>
+            <w:r>
+              <w:rPr>
+                <w:rFonts w:ascii="Consolas" w:hAnsi="Consolas"/>
+                <w:b w:val="0"/>
+                <w:color w:val="B02A37"/>
+                <w:sz w:val="20"/>
+                <w:rtl w:val="1"/>
+                <w:rFonts w:cs="Consolas"/>
+              </w:rPr>
+              <w:t>FB_APP_SECRET</w:t>
+            </w:r>
+          </w:p>
+        </w:tc>
+        <w:tc>
+          <w:tcPr>
+            <w:tcW w:type="dxa" w:w="2880"/>
+          </w:tcPr>
+          <w:p>
+            <w:pPr>
+              <w:bidi w:val="1"/>
+              <w:jc w:val="right"/>
+            </w:pPr>
+            <w:r>
+              <w:rPr>
+                <w:rFonts w:ascii="Arial" w:hAnsi="Arial"/>
+                <w:b w:val="0"/>
+                <w:sz w:val="20"/>
+                <w:rtl w:val="1"/>
+                <w:rFonts w:cs="Arial"/>
+              </w:rPr>
+              <w:t>Meta long-lived token</w:t>
+            </w:r>
+          </w:p>
+        </w:tc>
+        <w:tc>
+          <w:tcPr>
+            <w:tcW w:type="dxa" w:w="2880"/>
+          </w:tcPr>
+          <w:p>
+            <w:pPr>
+              <w:bidi w:val="1"/>
+              <w:jc w:val="right"/>
+            </w:pPr>
+            <w:r>
+              <w:rPr>
+                <w:rFonts w:ascii="Arial" w:hAnsi="Arial"/>
+                <w:b w:val="0"/>
+                <w:sz w:val="20"/>
+                <w:rtl w:val="1"/>
+                <w:rFonts w:cs="Arial"/>
+              </w:rPr>
+              <w:t>לפי צורך</w:t>
+            </w:r>
+          </w:p>
+        </w:tc>
+      </w:tr>
+      <w:tr>
+        <w:tc>
+          <w:tcPr>
+            <w:tcW w:type="dxa" w:w="2880"/>
+          </w:tcPr>
+          <w:p>
+            <w:pPr>
+              <w:bidi w:val="1"/>
+              <w:jc w:val="right"/>
+            </w:pPr>
+            <w:r>
+              <w:rPr>
+                <w:rFonts w:ascii="Consolas" w:hAnsi="Consolas"/>
+                <w:b w:val="0"/>
+                <w:color w:val="B02A37"/>
+                <w:sz w:val="20"/>
+                <w:rtl w:val="1"/>
+                <w:rFonts w:cs="Consolas"/>
+              </w:rPr>
+              <w:t>CRON_SECRET</w:t>
+            </w:r>
+          </w:p>
+        </w:tc>
+        <w:tc>
+          <w:tcPr>
+            <w:tcW w:type="dxa" w:w="2880"/>
+          </w:tcPr>
+          <w:p>
+            <w:pPr>
+              <w:bidi w:val="1"/>
+              <w:jc w:val="right"/>
+            </w:pPr>
+            <w:r>
+              <w:rPr>
+                <w:rFonts w:ascii="Arial" w:hAnsi="Arial"/>
+                <w:b w:val="0"/>
+                <w:sz w:val="20"/>
+                <w:rtl w:val="1"/>
+                <w:rFonts w:cs="Arial"/>
+              </w:rPr>
+              <w:t>הגנת cron</w:t>
+            </w:r>
+          </w:p>
+        </w:tc>
+        <w:tc>
+          <w:tcPr>
+            <w:tcW w:type="dxa" w:w="2880"/>
+          </w:tcPr>
+          <w:p>
+            <w:pPr>
+              <w:bidi w:val="1"/>
+              <w:jc w:val="right"/>
+            </w:pPr>
+            <w:r>
+              <w:rPr>
+                <w:rFonts w:ascii="Arial" w:hAnsi="Arial"/>
+                <w:b w:val="0"/>
+                <w:sz w:val="20"/>
+                <w:rtl w:val="1"/>
+                <w:rFonts w:cs="Arial"/>
+              </w:rPr>
+              <w:t>✅ (prod)</w:t>
+            </w:r>
+          </w:p>
+        </w:tc>
+      </w:tr>
+    </w:tbl>
+    <w:p>
+      <w:pPr>
+        <w:pStyle w:val="Heading3"/>
+        <w:bidi w:val="1"/>
+        <w:jc w:val="right"/>
+      </w:pPr>
+      <w:r>
+        <w:rPr>
+          <w:rFonts w:ascii="Arial" w:hAnsi="Arial"/>
+          <w:b w:val="0"/>
+          <w:sz w:val="24"/>
+          <w:rtl w:val="1"/>
+          <w:rFonts w:cs="Arial"/>
+        </w:rPr>
+        <w:t>13.7 מה השותף ממשיך (רשימת-משימות ישירה)</w:t>
+      </w:r>
+    </w:p>
+    <w:p>
+      <w:pPr>
+        <w:pStyle w:val="ListNumber"/>
+        <w:bidi w:val="1"/>
+        <w:jc w:val="right"/>
+      </w:pPr>
+      <w:r>
+        <w:rPr>
+          <w:rFonts w:ascii="Arial" w:hAnsi="Arial"/>
+          <w:b w:val="0"/>
+          <w:sz w:val="22"/>
+          <w:rtl w:val="1"/>
+          <w:rFonts w:cs="Arial"/>
+        </w:rPr>
+        <w:t xml:space="preserve">הרצת </w:t>
+      </w:r>
+      <w:r>
+        <w:rPr>
+          <w:rFonts w:ascii="Consolas" w:hAnsi="Consolas"/>
+          <w:b w:val="0"/>
+          <w:color w:val="B02A37"/>
+          <w:sz w:val="22"/>
+          <w:rtl w:val="1"/>
+          <w:rFonts w:cs="Consolas"/>
+        </w:rPr>
+        <w:t>schema.sql</w:t>
+      </w:r>
+      <w:r>
+        <w:rPr>
+          <w:rFonts w:ascii="Arial" w:hAnsi="Arial"/>
+          <w:b w:val="0"/>
+          <w:sz w:val="22"/>
+          <w:rtl w:val="1"/>
+          <w:rFonts w:cs="Arial"/>
+        </w:rPr>
+        <w:t xml:space="preserve"> + מילוי env + Deploy Vercel.</w:t>
+      </w:r>
+    </w:p>
+    <w:p>
+      <w:pPr>
+        <w:pStyle w:val="ListNumber"/>
+        <w:bidi w:val="1"/>
+        <w:jc w:val="right"/>
+      </w:pPr>
+      <w:r>
+        <w:rPr>
+          <w:rFonts w:ascii="Arial" w:hAnsi="Arial"/>
+          <w:b/>
+          <w:sz w:val="22"/>
+          <w:rtl w:val="1"/>
+          <w:rFonts w:cs="Arial"/>
+        </w:rPr>
+        <w:t>חיבורי Supabase</w:t>
+      </w:r>
+      <w:r>
+        <w:rPr>
+          <w:rFonts w:ascii="Arial" w:hAnsi="Arial"/>
+          <w:b w:val="0"/>
+          <w:sz w:val="22"/>
+          <w:rtl w:val="1"/>
+          <w:rFonts w:cs="Arial"/>
+        </w:rPr>
+        <w:t xml:space="preserve"> — הפעלת connectors חיים (GA4/Meta/Stripe/Shopify/Plausible/Mailchimp) דרך </w:t>
+      </w:r>
+      <w:r>
+        <w:rPr>
+          <w:rFonts w:ascii="Consolas" w:hAnsi="Consolas"/>
+          <w:b w:val="0"/>
+          <w:color w:val="B02A37"/>
+          <w:sz w:val="22"/>
+          <w:rtl w:val="1"/>
+          <w:rFonts w:cs="Consolas"/>
+        </w:rPr>
+        <w:t>/connect</w:t>
+      </w:r>
+      <w:r>
+        <w:rPr>
+          <w:rFonts w:ascii="Arial" w:hAnsi="Arial"/>
+          <w:b w:val="0"/>
+          <w:sz w:val="22"/>
+          <w:rtl w:val="1"/>
+          <w:rFonts w:cs="Arial"/>
+        </w:rPr>
+        <w:t>.</w:t>
+      </w:r>
+    </w:p>
+    <w:p>
+      <w:pPr>
+        <w:pStyle w:val="ListNumber"/>
+        <w:bidi w:val="1"/>
+        <w:jc w:val="right"/>
+      </w:pPr>
+      <w:r>
+        <w:rPr>
+          <w:rFonts w:ascii="Arial" w:hAnsi="Arial"/>
+          <w:b/>
+          <w:sz w:val="22"/>
+          <w:rtl w:val="1"/>
+          <w:rFonts w:cs="Arial"/>
+        </w:rPr>
+        <w:t>WhatsApp</w:t>
+      </w:r>
+      <w:r>
+        <w:rPr>
+          <w:rFonts w:ascii="Arial" w:hAnsi="Arial"/>
+          <w:b w:val="0"/>
+          <w:sz w:val="22"/>
+          <w:rtl w:val="1"/>
+          <w:rFonts w:cs="Arial"/>
+        </w:rPr>
+        <w:t xml:space="preserve"> — אפליקציית Meta + תבנית מאושרת + (אופציונלי) בוט-נכנס </w:t>
+      </w:r>
+      <w:r>
+        <w:rPr>
+          <w:rFonts w:ascii="Consolas" w:hAnsi="Consolas"/>
+          <w:b w:val="0"/>
+          <w:color w:val="B02A37"/>
+          <w:sz w:val="22"/>
+          <w:rtl w:val="1"/>
+          <w:rFonts w:cs="Consolas"/>
+        </w:rPr>
+        <w:t>/api/whatsapp</w:t>
+      </w:r>
+      <w:r>
+        <w:rPr>
+          <w:rFonts w:ascii="Arial" w:hAnsi="Arial"/>
+          <w:b w:val="0"/>
+          <w:sz w:val="22"/>
+          <w:rtl w:val="1"/>
+          <w:rFonts w:cs="Arial"/>
+        </w:rPr>
+        <w:t>.</w:t>
+      </w:r>
+    </w:p>
+    <w:p>
+      <w:pPr>
+        <w:pStyle w:val="ListNumber"/>
+        <w:bidi w:val="1"/>
+        <w:jc w:val="right"/>
+      </w:pPr>
+      <w:r>
+        <w:rPr>
+          <w:rFonts w:ascii="Arial" w:hAnsi="Arial"/>
+          <w:b/>
+          <w:sz w:val="22"/>
+          <w:rtl w:val="1"/>
+          <w:rFonts w:cs="Arial"/>
+        </w:rPr>
+        <w:t>Ollama</w:t>
+      </w:r>
+      <w:r>
+        <w:rPr>
+          <w:rFonts w:ascii="Arial" w:hAnsi="Arial"/>
+          <w:b w:val="0"/>
+          <w:sz w:val="22"/>
+          <w:rtl w:val="1"/>
+          <w:rFonts w:cs="Arial"/>
+        </w:rPr>
+        <w:t xml:space="preserve"> — הרצת מופע + </w:t>
+      </w:r>
+      <w:r>
+        <w:rPr>
+          <w:rFonts w:ascii="Consolas" w:hAnsi="Consolas"/>
+          <w:b w:val="0"/>
+          <w:color w:val="B02A37"/>
+          <w:sz w:val="22"/>
+          <w:rtl w:val="1"/>
+          <w:rFonts w:cs="Consolas"/>
+        </w:rPr>
+        <w:t>OLLAMA_BASE_URL</w:t>
+      </w:r>
+      <w:r>
+        <w:rPr>
+          <w:rFonts w:ascii="Arial" w:hAnsi="Arial"/>
+          <w:b w:val="0"/>
+          <w:sz w:val="22"/>
+          <w:rtl w:val="1"/>
+          <w:rFonts w:cs="Arial"/>
+        </w:rPr>
+        <w:t>.</w:t>
+      </w:r>
+    </w:p>
+    <w:p>
+      <w:pPr>
+        <w:pStyle w:val="ListNumber"/>
+        <w:bidi w:val="1"/>
+        <w:jc w:val="right"/>
+      </w:pPr>
+      <w:r>
+        <w:rPr>
+          <w:rFonts w:ascii="Arial" w:hAnsi="Arial"/>
+          <w:b/>
+          <w:sz w:val="22"/>
+          <w:rtl w:val="1"/>
+          <w:rFonts w:cs="Arial"/>
+        </w:rPr>
+        <w:t>connectors נוספים</w:t>
+      </w:r>
+      <w:r>
+        <w:rPr>
+          <w:rFonts w:ascii="Arial" w:hAnsi="Arial"/>
+          <w:b w:val="0"/>
+          <w:sz w:val="22"/>
+          <w:rtl w:val="1"/>
+          <w:rFonts w:cs="Arial"/>
+        </w:rPr>
+        <w:t xml:space="preserve"> — הנהח״ש ישראלי (edge-fn), CRM (Nango/SDK) — לפי 02b.</w:t>
+      </w:r>
+    </w:p>
+    <w:p>
+      <w:pPr>
+        <w:pStyle w:val="ListNumber"/>
+        <w:bidi w:val="1"/>
+        <w:jc w:val="right"/>
+      </w:pPr>
+      <w:r>
+        <w:rPr>
+          <w:rFonts w:ascii="Arial" w:hAnsi="Arial"/>
+          <w:b/>
+          <w:sz w:val="22"/>
+          <w:rtl w:val="1"/>
+          <w:rFonts w:cs="Arial"/>
+        </w:rPr>
+        <w:t>Executive aggregation</w:t>
+      </w:r>
+      <w:r>
+        <w:rPr>
+          <w:rFonts w:ascii="Arial" w:hAnsi="Arial"/>
+          <w:b w:val="0"/>
+          <w:sz w:val="22"/>
+          <w:rtl w:val="1"/>
+          <w:rFonts w:cs="Arial"/>
+        </w:rPr>
+        <w:t xml:space="preserve"> — שכבת-על חוצה-מחלקות (ה-moat).</w:t>
       </w:r>
     </w:p>
     <w:p>

</xml_diff>